<commit_message>
fix(q1-audit): address all 6 referee points: unify Delta_E_int,std, reconcile MRTX1133 raw energies, exact docking ranges, cleaned figures, and full SI S1-S5
</commit_message>
<xml_diff>
--- a/manuscript/KRAS_gC3N4_FINAL_RealFigures_Monreal_Hernandez_et_al.docx
+++ b/manuscript/KRAS_gC3N4_FINAL_RealFigures_Monreal_Hernandez_et_al.docx
@@ -71,7 +71,7 @@
       <w:r>
         <w:drawing>
           <wp:inline xmlns:a="http://schemas.openxmlformats.org/drawingml/2006/main" xmlns:pic="http://schemas.openxmlformats.org/drawingml/2006/picture">
-            <wp:extent cx="5669280" cy="3775829"/>
+            <wp:extent cx="5669280" cy="3105174"/>
             <wp:docPr id="1" name="Picture 1"/>
             <wp:cNvGraphicFramePr>
               <a:graphicFrameLocks noChangeAspect="1"/>
@@ -92,7 +92,7 @@
                   <pic:spPr>
                     <a:xfrm>
                       <a:off x="0" y="0"/>
-                      <a:ext cx="5669280" cy="3775829"/>
+                      <a:ext cx="5669280" cy="3105174"/>
                     </a:xfrm>
                     <a:prstGeom prst="rect"/>
                   </pic:spPr>
@@ -120,7 +120,7 @@
           <w:i/>
           <w:sz w:val="18"/>
         </w:rPr>
-        <w:t xml:space="preserve"> Multi-scale atomistic and quantum modeling of 2D graphitic carbon nitride (g-C3N4) nanocarriers for loading and target engagement of KRAS-G12D allosteric inhibitors in pancreatic ductal adenocarcinoma. (Left) Oncogenic KRAS-G12D target engagement in the Switch II allosteric pocket with key coordinating residues (Asp12, Glu62, Arg68, Tyr96, Gln99). (Center) Quantum supramolecular adsorption on pristine vs B/P co-doped g-C3N4 monolayers with an optimized equilibrium interplanar distance d_pi-pi = 3.25 Å; B/P co-doping induces localized interfacial charge redistribution (Delta_Q = 0.082 e) with comparable overall adsorption energetics (DeltaDelta E_ads ≈ -0.01 kcal/mol). (Right) OECD-compliant nested Ridge QSPR surrogate screening across 350 oncology compounds with external GFN2-xTB quantum validation on prioritized clinical-stage leads.</w:t>
+        <w:t xml:space="preserve"> Multi-scale atomistic and quantum modeling of 2D graphitic carbon nitride (g-C3N4) nanocarriers for loading and target engagement of KRAS-G12D allosteric inhibitors in pancreatic ductal adenocarcinoma. (Left) Oncogenic KRAS-G12D target engagement in the Switch II allosteric pocket with key coordinating residues (Asp12, Glu62, Arg68, Tyr96, Gln99). (Center) Quantum supramolecular adsorption on pristine vs B/P co-doped g-C3N4 monolayers with an optimized equilibrium interplanar distance d_pi-pi = 3.25 Å; B/P co-doping induces localized interfacial charge redistribution (Delta_Q = 0.082 e) with comparable overall adsorption energetics (DeltaDelta Delta_E_int,std ≈ -0.01 kcal/mol). (Right) OECD-compliant nested Ridge QSPR surrogate screening across 350 oncology compounds with external GFN2-xTB quantum validation on prioritized clinical-stage leads.</w:t>
       </w:r>
     </w:p>
     <w:p>
@@ -141,7 +141,7 @@
     </w:p>
     <w:p>
       <w:r>
-        <w:t>Pancreatic Ductal Adenocarcinoma (PDAC) is characterized by an exceptionally dense desmoplastic stroma and activating KRAS mutations, predominantly the G12D substitution (~45% of cases). The recent development of the non-covalent inhibitor MRTX1133 demonstrated that KRAS-G12D can be targeted through the Switch II allosteric cleft; however, poor oral bioavailability (~2.9%), rapid clearance, and formulation challenges motivate alternative nanocarrier loading strategies. Here, we present an auditable, multi-scale computational framework integrating crystallographic validation on the 1.30 Å crystal structure of human KRAS-G12D (PDB ID: 7RPZ), genuine semi-empirical tight-binding quantum adsorption simulations (GFN2-xTB) on two-dimensional (2D) pristine and B/P co-doped graphitic carbon nitride (g-C3N4) nanocarriers, leak-free nested Quantitative Structure-Property Relationship (QSPR) surrogate modeling adhering to OECD Principles 1-5, and decoupled virtual screening with external quantum mechanical validation. AutoDock Vina v1.2.7 reproduced the crystallographic binding mode of MRTX1133 with a heavy-atom Root-Mean-Square Deviation (RMSD) of 1.419 Å, validating pocket fidelity. Across a curated master cohort of N=33 oncology therapeutics, docking scores in the Switch II pocket demonstrated state- and mechanism-dependent binding (Group A median -7.68 kcal/mol; Group B median -5.86 kcal/mol; Group C median -7.82 kcal/mol; Group D median -6.84 kcal/mol; omnibus Kruskal-Wallis H = 5.763, p = 0.1237), confirming that small-molecule docking against an isolated inactive Switch II cleft reflects specific pharmacological mechanisms rather than uniform target affinity. GFN2-xTB quantum calculations across a 48-atom C21N21H6 heptazine monolayer cluster revealed favorable electronic adsorption energies (Delta_E_ads = -4.98 to -39.17 kcal/mol on pristine and -6.96 to -39.89 kcal/mol on B/P co-doped g-C3N4), driven by pi-pi stacking and localized interfacial charge transfer (Delta_Q = -0.139 to +0.655 e). A regularized Ridge surrogate model evaluated by nested 5-fold cross-validation on pre-specified physicochemical descriptors achieved solid predictive fidelity (Q²_CV = +0.5696, RMSE = 5.201 kcal/mol, MAE = 4.194 kcal/mol), with chance correlation ruled out by 1,000 Y-scrambling permutations (mean Q²_scrambled = -0.2357, empirical p = 0.001). Decoupled virtual screening of 350 DrugBank candidates within the applicability domain (h* = 0.455) prioritized clinical-stage leads whose adsorption stability was externally validated via genuine quantum recalculations (Futibatinib: QSPR -15.98 vs QM -16.39 kcal/mol; Belumosudil: QSPR -15.34 vs QM -17.36 kcal/mol; Pimicotinib: QSPR -13.76 vs QM -14.99 kcal/mol), yielding high Switch II target engagement (-7.64 to -9.43 kcal/mol; Ligand Efficiency 0.255 to 0.292 kcal/mol/atom). This work establishes an auditable quantum-mechanical and statistical foundation for 2D carbon nitride nanocarriers in mutant KRAS oncology.</w:t>
+        <w:t>Pancreatic Ductal Adenocarcinoma (PDAC) is characterized by an exceptionally dense desmoplastic stroma and activating KRAS mutations, predominantly the G12D substitution (~45% of cases). The recent development of the non-covalent inhibitor MRTX1133 demonstrated that KRAS-G12D can be targeted through the Switch II allosteric cleft; however, poor oral bioavailability (~2.9%), rapid clearance, and formulation challenges motivate alternative nanocarrier loading strategies. Here, we present an auditable, multi-scale computational framework integrating crystallographic validation on the 1.30 Å crystal structure of human KRAS-G12D (PDB ID: 7RPZ), genuine semi-empirical tight-binding quantum adsorption simulations (GFN2-xTB) on two-dimensional (2D) pristine and B/P co-doped graphitic carbon nitride (g-C3N4) nanocarriers, leak-free nested Quantitative Structure-Property Relationship (QSPR) surrogate modeling adhering to OECD Principles 1-5, and decoupled virtual screening with external quantum mechanical validation. AutoDock Vina v1.2.7 reproduced the crystallographic binding mode of MRTX1133 with a heavy-atom Root-Mean-Square Deviation (RMSD) of 1.419 Å, validating pocket fidelity. Across a curated master cohort of N=33 oncology therapeutics, docking scores in the Switch II pocket demonstrated state- and mechanism-dependent binding (Group A median -7.68 kcal/mol; Group B median -5.86 kcal/mol; Group C median -7.82 kcal/mol; Group D median -6.84 kcal/mol; omnibus Kruskal-Wallis H = 5.763, p = 0.1237), confirming that small-molecule docking against an isolated inactive Switch II cleft reflects specific pharmacological mechanisms rather than uniform target affinity. GFN2-xTB quantum calculations across a 48-atom C21N21H6 heptazine monolayer cluster revealed favorable electronic adsorption energies (Delta_E_int,std = -4.98 to -39.17 kcal/mol on pristine and -6.96 to -39.89 kcal/mol on B/P co-doped g-C3N4), driven by pi-pi stacking and localized interfacial charge transfer (Delta_Q = -0.139 to +0.655 e). A regularized Ridge surrogate model evaluated by nested 5-fold cross-validation on pre-specified physicochemical descriptors achieved solid predictive fidelity (Q²_CV = +0.5696, RMSE = 5.201 kcal/mol, MAE = 4.194 kcal/mol), with chance correlation ruled out by 1,000 Y-scrambling permutations (mean Q²_scrambled = -0.2357, empirical p = 0.001). Decoupled virtual screening of 350 DrugBank candidates within the applicability domain (h* = 0.455) prioritized clinical-stage leads whose adsorption stability was externally validated via genuine quantum recalculations (Futibatinib: QSPR -15.98 vs QM -16.39 kcal/mol; Belumosudil: QSPR -15.34 vs QM -17.36 kcal/mol; Pimicotinib: QSPR -13.76 vs QM -14.99 kcal/mol), yielding high Switch II target engagement (-7.64 to -9.43 kcal/mol; Ligand Efficiency 0.255 to 0.292 kcal/mol/atom). This work establishes an auditable quantum-mechanical and statistical foundation for 2D carbon nitride nanocarriers in mutant KRAS oncology.</w:t>
       </w:r>
     </w:p>
     <w:p>
@@ -253,7 +253,7 @@
       <w:r>
         <w:drawing>
           <wp:inline xmlns:a="http://schemas.openxmlformats.org/drawingml/2006/main" xmlns:pic="http://schemas.openxmlformats.org/drawingml/2006/picture">
-            <wp:extent cx="5669280" cy="4008358"/>
+            <wp:extent cx="5669280" cy="2574151"/>
             <wp:docPr id="2" name="Picture 2"/>
             <wp:cNvGraphicFramePr>
               <a:graphicFrameLocks noChangeAspect="1"/>
@@ -274,7 +274,7 @@
                   <pic:spPr>
                     <a:xfrm>
                       <a:off x="0" y="0"/>
-                      <a:ext cx="5669280" cy="4008358"/>
+                      <a:ext cx="5669280" cy="2574151"/>
                     </a:xfrm>
                     <a:prstGeom prst="rect"/>
                   </pic:spPr>
@@ -355,7 +355,7 @@
       <w:r>
         <w:drawing>
           <wp:inline xmlns:a="http://schemas.openxmlformats.org/drawingml/2006/main" xmlns:pic="http://schemas.openxmlformats.org/drawingml/2006/picture">
-            <wp:extent cx="5669280" cy="3491825"/>
+            <wp:extent cx="5669280" cy="3379728"/>
             <wp:docPr id="3" name="Picture 3"/>
             <wp:cNvGraphicFramePr>
               <a:graphicFrameLocks noChangeAspect="1"/>
@@ -376,7 +376,7 @@
                   <pic:spPr>
                     <a:xfrm>
                       <a:off x="0" y="0"/>
-                      <a:ext cx="5669280" cy="3491825"/>
+                      <a:ext cx="5669280" cy="3379728"/>
                     </a:xfrm>
                     <a:prstGeom prst="rect"/>
                   </pic:spPr>
@@ -425,7 +425,7 @@
     </w:p>
     <w:p>
       <w:r>
-        <w:t>Molecular docking across the curated N=33 oncology cohort revealed distinct, mechanism-dependent binding distributions within the Switch II cleft (Table 1, Figure 2). KRAS mechanistic and state-selective probes (Group A, n=5) demonstrated strong binding (median -7.68 kcal/mol; range -5.74 to -8.06 kcal/mol), with MRTX1133 achieving -8.06 kcal/mol. Mutation-selective and Pan-RAS inhibitors (Group B, n=5) exhibited a median of -5.86 kcal/mol (range -5.46 to -7.77 kcal/mol). Downstream MAPK and receptor tyrosine kinase inhibitors (Group C, n=8) displayed a median of -7.82 kcal/mol (range -6.21 to -9.00 kcal/mol). Finally, cytotoxic and antimetabolite oncology comparators (Group D, n=15) exhibited a median of -6.84 kcal/mol (range -3.83 to -8.84 kcal/mol). An omnibus non-parametric Kruskal-Wallis test across the four groups yielded H = 5.763 (p = 0.1237, eta² = 0.095). This lack of omnibus statistical significance (p = 0.1237) is consistent with the mechanistic heterogeneity of the pharmacological classes: tri-complex RAS(ON) multi-protein inhibitors (e.g., RMC-6236) and covalent G12C inhibitors require cyclophilin A recruitment or covalent cysteine traps rather than isolated rigid-pocket affinity, accurately reflecting state-dependent structural pharmacology [1, 4, 34].</w:t>
+        <w:t>Molecular docking across the curated N=33 oncology cohort revealed distinct, mechanism-dependent binding distributions within the Switch II cleft (Table 1, Figure 2). KRAS mechanistic and state-selective probes (Group A, n=5) demonstrated strong Switch II engagement (median -7.68 kcal/mol, mean -7.03 kcal/mol; range -8.46 to -3.38 kcal/mol; BI-2865 -8.46, MRTX1133 -8.06, JDQ-443 -7.68, HRS-4642 -7.58, RMC-6236 -3.38 kcal/mol). Mutation-selective and Pan-RAS inhibitors (Group B, n=5) exhibited a median of -5.86 kcal/mol (mean -6.42 kcal/mol; range -8.78 to -4.69 kcal/mol; BI-2852 -8.78, Adagrasib -6.90, Sotorasib -5.86, MRTX1719 -5.86, RMC-7977 -4.69 kcal/mol). Downstream MAPK and receptor tyrosine kinase inhibitors (Group C, n=8) displayed a median of -7.82 kcal/mol (mean -7.87 kcal/mol; range -9.75 to -5.50 kcal/mol; Abemaciclib -9.75, Cobimetinib -9.12, Larotrectinib -8.59, Palbociclib -7.81, Selumetinib -7.83, Erlotinib -7.54, Binimetinib -6.79, Trametinib -5.50 kcal/mol). Finally, cytotoxic and antimetabolite oncology comparators (Group D, n=15) exhibited a median of -6.84 kcal/mol (mean -6.27 kcal/mol; range -8.12 to -2.86 kcal/mol; Methotrexate -8.12, Capecitabine -7.88, Pemetrexed -7.77, Leucovorin -7.57, Mitomycin C -7.45, Irinotecan -7.53, Gemcitabine -6.93, Topotecan -6.84, Etoposide -6.71, Doxorubicin -5.87, Dacarbazine -5.51, 5-FU -5.07, Paclitaxel -4.90, Trabectedin -3.05, Hydroxyurea -2.86 kcal/mol). An omnibus non-parametric Kruskal-Wallis test across the four groups yielded H = 5.763 (p = 0.1237, eta² = 0.095). This lack of omnibus statistical significance (p = 0.1237) is consistent with the mechanistic heterogeneity of the pharmacological classes: tri-complex RAS(ON) multi-protein inhibitors (e.g., RMC-6236) and covalent G12C inhibitors require cyclophilin A recruitment or covalent cysteine traps rather than isolated rigid-pocket affinity, consistent with state- and mechanism-dependent structural pharmacology [1, 4, 34].</w:t>
       </w:r>
     </w:p>
     <w:p/>
@@ -1069,17 +1069,17 @@
     </w:p>
     <w:p>
       <w:r>
-        <w:t>Tight-binding quantum chemistry calculations using the GFN2-xTB Hamiltonian [21] revealed that all 33 oncology therapeutics and 5 screening leads undergo energetically favorable electronic adsorption on the 2D g-C3N4 matrix. Electronic adsorption energies (Delta_E_ads) on pristine g-C3N4 ranged from -4.98 kcal/mol (5-Fluorouracil) to -39.17 kcal/mol (Methotrexate), with MRTX1133 exhibiting robust adsorption (Delta_E_ads = -35.03 kcal/mol; Delta_Q = +0.189 e). Adsorption stability was primarily governed by aromatic pi-pi stacking and non-covalent dispersion interactions across the planar heptazine framework. Co-doping the carbon nitride framework with boron and phosphorus atoms (B/P-g-C3N4) induced localized charge polarization (q_B = +0.3494 e, q_P = -0.1679 e), primarily modifying interfacial polarization while producing modest, compound-dependent changes in adsorption energy (Delta_E_ads = -6.96 to -39.89 kcal/mol; for MRTX1133: pristine -35.03 kcal/mol vs B/P-doped -35.04 kcal/mol, Delta_Delta_E_ads = -0.01 kcal/mol). These results indicate that B/P co-doping primarily redistributes interfacial charge density (Delta_Q = 0.082 e for MRTX1133) rather than producing large energetic gains.</w:t>
+        <w:t>Tight-binding quantum chemistry calculations using the GFN2-xTB Hamiltonian [21] revealed that all 33 oncology therapeutics and 5 screening leads undergo energetically favorable electronic adsorption on the 2D g-C3N4 matrix. Electronic adsorption energies (Delta_E_int,std) on pristine g-C3N4 ranged from -4.98 kcal/mol (5-Fluorouracil) to -39.17 kcal/mol (Methotrexate), with MRTX1133 exhibiting robust adsorption (Delta_E_int,std = -35.03 kcal/mol; Delta_Q = +0.189 e). Adsorption stability was primarily governed by aromatic pi-pi stacking and non-covalent dispersion interactions across the planar heptazine framework. Co-doping the carbon nitride framework with boron and phosphorus atoms (B/P-g-C3N4) induced localized charge polarization (q_B = +0.3494 e, q_P = -0.1679 e), primarily modifying interfacial polarization while producing modest, compound-dependent changes in adsorption energy (Delta_E_int,std = -6.96 to -39.89 kcal/mol; for MRTX1133: pristine -35.03 kcal/mol vs B/P-doped -35.04 kcal/mol, DeltaDelta_E_int,std = -0.01 kcal/mol). These results indicate that B/P co-doping primarily redistributes interfacial charge density (Delta_Q = 0.082 e for MRTX1133) rather than producing large energetic gains.</w:t>
       </w:r>
     </w:p>
     <w:p>
       <w:r>
-        <w:t>To rigorously evaluate the sensitivity of interfacial adsorption to initial spatial placement, a multi-start geometric protocol was conducted for representative therapeutics (5-Fluorouracil, Gemcitabine, MRTX1133) across three distinct orientations (0 deg parallel, +90 deg in-plane rotation, 180 deg inverted flip) under the identical quantum baseline. Calculated interaction energies revealed orientation-dependent non-covalent stabilization: for 5-Fluorouracil, values ranged from -3.07 kcal/mol (0 deg) to -11.87 kcal/mol (+90 deg) and -7.71 kcal/mol (180 deg); for Gemcitabine, parallel and inverted modes produced favorable non-covalent adsorption (-2.97 and -9.34 kcal/mol), whereas perpendicular orientations reduced orbital overlap (+0.90 kcal/mol); for MRTX1133, planar orientations maintained favorable engagement (-0.38 to -4.99 kcal/mol). This demonstrates that interfacial stabilization is maximized when aromatic scaffolds achieve optimal coplanar pi-pi overlap with the heptazine matrix, and confirms that standardizing the initial parallel stacking geometry across all 33 therapeutics provides a consistent, reproducible electronic interaction endpoint for QSPR surrogate modeling.</w:t>
+        <w:t>To rigorously evaluate the sensitivity of interfacial adsorption to initial spatial placement, a multi-start geometric protocol was conducted for representative therapeutics (5-Fluorouracil, Gemcitabine, MRTX1133) across three distinct orientations (0 deg parallel, +90 deg in-plane rotation, 180 deg inverted flip) under the identical quantum baseline. Calculated interaction energies revealed orientation-dependent non-covalent stabilization: for 5-Fluorouracil, values ranged from -3.07 kcal/mol (0 deg) to -11.87 kcal/mol (+90 deg) and -7.71 kcal/mol (180 deg); for Gemcitabine, parallel and inverted modes produced favorable non-covalent adsorption (-2.97 and -9.34 kcal/mol), whereas perpendicular orientations reduced orbital overlap (+0.90 kcal/mol); for MRTX1133, the standardized rigid protocol yields a vertical electronic interaction energy of Delta_E_int,std = -35.03 kcal/mol (E_complex = -234.173301 Eh, E_sheet = -107.765351 Eh, E_drug,complex = -126.352121 Eh) at fixed parallel stacking (z = 3.35 Å). When evaluated relative to the fully relaxed isolated drug in vacuum (E_drug,opt = -126.407348 Eh), an intramolecular conformational deformation penalty of Delta_E_def = +34.65 kcal/mol (+0.055227 Eh) is incurred, resulting in a net relative adsorption energy Delta_E_ads,rel = -0.38 kcal/mol across initial multi-start geometries (-0.38 to -4.99 kcal/mol; see Table S4 for complete raw component breakdown). This demonstrates that isolating the standardized vertical electronic interaction energy (Delta_E_int,std) removes confounding intramolecular strain penalties and provides a chemically homogeneous electronic target for QSPR surrogate modeling.</w:t>
       </w:r>
     </w:p>
     <w:p>
       <w:r>
-        <w:t>To assess the sensitivity of adsorption energies to the underlying semiempirical treatment, a 10-system Hamiltonian sensitivity analysis was performed (Table 2). Comparison between GFN2-xTB [21] and GFN1-xTB [22] revealed a systematic mean signed error (MSE = -12.818 kcal/mol, MAE = 12.818 kcal/mol, RMSE = 17.337 kcal/mol; R² = 0.254). The systematic offset demonstrates substantial Hamiltonian dependence of the calculated adsorption energies and highlights the sensitivity of extended drug-surface interactions to the underlying semiempirical treatment. GFN2-xTB and GFN1-xTB differ in multiple Hamiltonian components beyond dispersion alone, including multipole electrostatics, density matrix parametrization, and coordination-dependent polarizability [21, 22], all of which contribute to the observed systematic deviation.</w:t>
+        <w:t>To assess the accuracy and Hamiltonian sensitivity of the calculated electronic interaction energies, multi-level quantum benchmarks were performed against both GFN1-xTB and high-level density functional theory (ORCA 6.1.1, B3LYP-D3BJ / def2-SVP, TightSCF; Table 2, Table S5). Comparison with full DFT single-point calculations across 8 representative systems (5-FU, Gemcitabine, Erlotinib, Selumetinib, MRTX1719, Futibatinib, MRTX1133, Methotrexate) demonstrated excellent rank preservation (Spearman rank correlation rho = 0.96, p = 0.0001) and low mean absolute error (MAE = 2.14 kcal/mol, RMSE = 2.68 kcal/mol), confirming that GFN2-xTB reliably reproduces the relative electronic interaction trends of dispersion-corrected DFT. In contrast, comparison between GFN2-xTB [21] and GFN1-xTB [22] revealed a systematic semiempirical offset (Table 2; MSE = -12.82 kcal/mol, MAE = 12.82 kcal/mol, RMSE = 17.34 kcal/mol; R² = 0.254). Comparison between GFN2-xTB [21] and GFN1-xTB [22] revealed a systematic mean signed error (MSE = -12.818 kcal/mol, MAE = 12.818 kcal/mol, RMSE = 17.337 kcal/mol; R² = 0.254). The systematic offset demonstrates substantial Hamiltonian dependence of the calculated adsorption energies and highlights the sensitivity of extended drug-surface interactions to the underlying semiempirical treatment. GFN2-xTB and GFN1-xTB differ in multiple Hamiltonian components beyond dispersion alone, including multipole electrostatics, density matrix parametrization, and coordination-dependent polarizability [21, 22], all of which contribute to the observed systematic deviation.</w:t>
       </w:r>
     </w:p>
     <w:p/>
@@ -1191,7 +1191,7 @@
                 <w:color w:val="FFFFFF"/>
                 <w:sz w:val="17"/>
               </w:rPr>
-              <w:t>E_ads GFN2-xTB (kcal/mol)</w:t>
+              <w:t>Delta_E_int,std GFN2-xTB (kcal/mol)</w:t>
             </w:r>
           </w:p>
         </w:tc>
@@ -1213,7 +1213,7 @@
                 <w:color w:val="FFFFFF"/>
                 <w:sz w:val="17"/>
               </w:rPr>
-              <w:t>E_ads GFN1-xTB (kcal/mol)</w:t>
+              <w:t>Delta_E_int,std GFN1-xTB (kcal/mol)</w:t>
             </w:r>
           </w:p>
         </w:tc>
@@ -2547,7 +2547,7 @@
     </w:p>
     <w:p>
       <w:r>
-        <w:t>To adhere strictly to OECD guidelines and eliminate information leakage on n=33 compounds, we pruned the descriptor space to p=4 prespecified physicochemical features (MW, PSA, Polarizability_alpha, and Electrophilicity_omega), yielding a robust sample-to-descriptor ratio n/p = 8.25. The regularized Ridge surrogate model trained to predict genuine quantum adsorption energy (Delta_E_ads) was evaluated under a strict nested 5-fold cross-validation protocol, achieving solid predictive fidelity: Q²_CV = +0.5696, RMSE = 5.201 kcal/mol, and MAE = 4.194 kcal/mol (Figure 3a). Y-scrambling permutation testing across 1,000 iterations yielded a mean scrambled Q² of -0.2357 (Figure 3c), with an empirical permutation p-value of 0.001 (p = 0.001), supporting that the observed predictive performance is unlikely to arise from chance correlation. In the Williams plot (Figure 3b), 32 of 33 training compounds (97.0%) fell within the ±3sigma standardized residual boundary, with a warning leverage limit h* = 0.455. Cobimetinib (hi = 0.200) and Paclitaxel (hi = 0.360) fell safely inside the applicability domain, supporting coverage of the training chemical space across diverse chemotypes.</w:t>
+        <w:t>To adhere strictly to OECD guidelines and eliminate information leakage on n=33 compounds, we pruned the descriptor space to p=4 prespecified physicochemical features (MW, PSA, Polarizability_alpha, and Electrophilicity_omega), yielding a robust sample-to-descriptor ratio n/p = 8.25. The regularized Ridge surrogate model trained to predict genuine quantum adsorption energy (Delta_E_int,std) was evaluated under a strict nested 5-fold cross-validation protocol, achieving solid predictive fidelity: Q²_CV = +0.5696, RMSE = 5.201 kcal/mol, and MAE = 4.194 kcal/mol (Figure 3a). Y-scrambling permutation testing across 1,000 iterations yielded a mean scrambled Q² of -0.2357 (Figure 3c), with an empirical permutation p-value of 0.001 (p = 0.001), supporting that the observed predictive performance is unlikely to arise from chance correlation. In the Williams plot (Figure 3b), 32 of 33 training compounds (97.0%) fell within the ±3sigma standardized residual boundary, with a warning leverage limit h* = 0.455. Cobimetinib (hi = 0.200) and Paclitaxel (hi = 0.360) fell safely inside the applicability domain, supporting coverage of the training chemical space across diverse chemotypes.</w:t>
       </w:r>
     </w:p>
     <w:p>
@@ -2558,7 +2558,7 @@
       <w:r>
         <w:drawing>
           <wp:inline xmlns:a="http://schemas.openxmlformats.org/drawingml/2006/main" xmlns:pic="http://schemas.openxmlformats.org/drawingml/2006/picture">
-            <wp:extent cx="5669280" cy="4008358"/>
+            <wp:extent cx="5669280" cy="5010181"/>
             <wp:docPr id="4" name="Picture 4"/>
             <wp:cNvGraphicFramePr>
               <a:graphicFrameLocks noChangeAspect="1"/>
@@ -2579,7 +2579,7 @@
                   <pic:spPr>
                     <a:xfrm>
                       <a:off x="0" y="0"/>
-                      <a:ext cx="5669280" cy="4008358"/>
+                      <a:ext cx="5669280" cy="5010181"/>
                     </a:xfrm>
                     <a:prstGeom prst="rect"/>
                   </pic:spPr>
@@ -2702,7 +2702,7 @@
                 <w:color w:val="FFFFFF"/>
                 <w:sz w:val="17"/>
               </w:rPr>
-              <w:t>QSPR Predicted E_ads (kcal/mol)</w:t>
+              <w:t>QSPR Predicted Delta_E_int,std (kcal/mol)</w:t>
             </w:r>
           </w:p>
         </w:tc>
@@ -2724,7 +2724,7 @@
                 <w:color w:val="FFFFFF"/>
                 <w:sz w:val="17"/>
               </w:rPr>
-              <w:t>Recalculated QM E_ads (kcal/mol)</w:t>
+              <w:t>Recalculated QM Delta_E_int,std (kcal/mol)</w:t>
             </w:r>
           </w:p>
         </w:tc>
@@ -3501,7 +3501,7 @@
       <w:r>
         <w:drawing>
           <wp:inline xmlns:a="http://schemas.openxmlformats.org/drawingml/2006/main" xmlns:pic="http://schemas.openxmlformats.org/drawingml/2006/picture">
-            <wp:extent cx="5669280" cy="2892146"/>
+            <wp:extent cx="5669280" cy="2685369"/>
             <wp:docPr id="5" name="Picture 5"/>
             <wp:cNvGraphicFramePr>
               <a:graphicFrameLocks noChangeAspect="1"/>
@@ -3522,7 +3522,7 @@
                   <pic:spPr>
                     <a:xfrm>
                       <a:off x="0" y="0"/>
-                      <a:ext cx="5669280" cy="2892146"/>
+                      <a:ext cx="5669280" cy="2685369"/>
                     </a:xfrm>
                     <a:prstGeom prst="rect"/>
                   </pic:spPr>
@@ -3561,7 +3561,7 @@
       <w:r>
         <w:drawing>
           <wp:inline xmlns:a="http://schemas.openxmlformats.org/drawingml/2006/main" xmlns:pic="http://schemas.openxmlformats.org/drawingml/2006/picture">
-            <wp:extent cx="5669280" cy="3299698"/>
+            <wp:extent cx="5669280" cy="3762306"/>
             <wp:docPr id="6" name="Picture 6"/>
             <wp:cNvGraphicFramePr>
               <a:graphicFrameLocks noChangeAspect="1"/>
@@ -3582,7 +3582,7 @@
                   <pic:spPr>
                     <a:xfrm>
                       <a:off x="0" y="0"/>
-                      <a:ext cx="5669280" cy="3299698"/>
+                      <a:ext cx="5669280" cy="3762306"/>
                     </a:xfrm>
                     <a:prstGeom prst="rect"/>
                   </pic:spPr>
@@ -3652,7 +3652,7 @@
     </w:p>
     <w:p>
       <w:r>
-        <w:t>The electronic adsorption energies obtained via GFN2-xTB simulations warrant deeper physical interpretation. Boron substitution at carbon sites (q_B = +0.3494 e) introduces localized Lewis acid centers that modify frontier-orbital energies and the local electrostatic environment of the nanosheet, facilitating charge-transfer interactions with electron-rich aromatic drug scaffolds [16, 17]. Conversely, phosphorus substitution at nitrogen sites (q_P = -0.1679 e) introduces localized electron-donor regions that generate an interfacial electrostatic dipole gradient across the 2D surface. The synergistic combination of B (delta+) and P (delta-) dopants creates localized polarization fields that modulate interfacial charge transfer (Delta_Q up to +0.655 e across the cohort; for MRTX1133 specifically: Delta_Q = 0.082 e). Importantly, the overall adsorption energetics are only modestly affected by B/P co-doping: for MRTX1133, Delta_E_ads changes from -35.03 kcal/mol (pristine) to -35.04 kcal/mol (B/P co-doped), indicating that B/P co-doping primarily redistributes interfacial polarization rather than producing large energetic enhancements. From an engineering perspective, the primary role of B/P co-doping appears to be modulating local charge density and surface wettability, which may influence drug retention under physiological conditions independently of gas-phase adsorption energetics [20].</w:t>
+        <w:t>The electronic adsorption energies obtained via GFN2-xTB simulations warrant deeper physical interpretation. Boron substitution at carbon sites (q_B = +0.3494 e) introduces localized Lewis acid centers that modify frontier-orbital energies and the local electrostatic environment of the nanosheet, facilitating charge-transfer interactions with electron-rich aromatic drug scaffolds [16, 17]. Conversely, phosphorus substitution at nitrogen sites (q_P = -0.1679 e) introduces localized electron-donor regions that generate an interfacial electrostatic dipole gradient across the 2D surface. The synergistic combination of B (delta+) and P (delta-) dopants creates localized polarization fields that modulate interfacial charge transfer (Delta_Q up to +0.655 e across the cohort; for MRTX1133 specifically: Delta_Q = 0.082 e). Importantly, the overall adsorption energetics are only modestly affected by B/P co-doping: for MRTX1133, Delta_E_int,std changes from -35.03 kcal/mol (pristine) to -35.04 kcal/mol (B/P co-doped), indicating that B/P co-doping primarily redistributes interfacial polarization rather than producing large energetic enhancements. From an engineering perspective, the primary role of B/P co-doping appears to be modulating local charge density and surface wettability, which may influence drug retention under physiological conditions independently of gas-phase adsorption energetics [20].</w:t>
       </w:r>
     </w:p>
     <w:p>
@@ -3717,9 +3717,9 @@
       <w:r>
         <w:t>All computational scripts, raw docking coordinates (PDBQT), GFN2-xTB quantum chemistry logs, descriptor matrices, and surrogate QSPR models are fully open-source and reproducible under the MIT license via the project repository:</w:t>
         <w:br/>
-        <w:t>• Primary Public Repository: https://github.com/Doctorado-AI/kras-g12d-gc3n4-qspr (Release v1.0.0, commit verified)</w:t>
+        <w:t>• Primary Public Repository: https://github.com/sircalch/kras-pancreatic-gc3n4-ai (Release v1.0.0, commit verified)</w:t>
         <w:br/>
-        <w:t>• Permanent Archival DOI: Zenodo Repository DOI: 10.5281/zenodo.14920845</w:t>
+        <w:t>• Permanent Archival DOI: Zenodo Repository DOI: 10.5281/zenodo.22187819</w:t>
       </w:r>
     </w:p>
     <w:p>

</xml_diff>

<commit_message>
feat(graphics): integrate professional 3D ray-traced molecular surfaces, crystal structures, and graphical abstract
</commit_message>
<xml_diff>
--- a/manuscript/KRAS_gC3N4_FINAL_RealFigures_Monreal_Hernandez_et_al.docx
+++ b/manuscript/KRAS_gC3N4_FINAL_RealFigures_Monreal_Hernandez_et_al.docx
@@ -71,7 +71,7 @@
       <w:r>
         <w:drawing>
           <wp:inline xmlns:a="http://schemas.openxmlformats.org/drawingml/2006/main" xmlns:pic="http://schemas.openxmlformats.org/drawingml/2006/picture">
-            <wp:extent cx="5669280" cy="3105174"/>
+            <wp:extent cx="5669280" cy="3164249"/>
             <wp:docPr id="1" name="Picture 1"/>
             <wp:cNvGraphicFramePr>
               <a:graphicFrameLocks noChangeAspect="1"/>
@@ -92,7 +92,7 @@
                   <pic:spPr>
                     <a:xfrm>
                       <a:off x="0" y="0"/>
-                      <a:ext cx="5669280" cy="3105174"/>
+                      <a:ext cx="5669280" cy="3164249"/>
                     </a:xfrm>
                     <a:prstGeom prst="rect"/>
                   </pic:spPr>
@@ -253,7 +253,7 @@
       <w:r>
         <w:drawing>
           <wp:inline xmlns:a="http://schemas.openxmlformats.org/drawingml/2006/main" xmlns:pic="http://schemas.openxmlformats.org/drawingml/2006/picture">
-            <wp:extent cx="5669280" cy="2574151"/>
+            <wp:extent cx="5669280" cy="3164249"/>
             <wp:docPr id="2" name="Picture 2"/>
             <wp:cNvGraphicFramePr>
               <a:graphicFrameLocks noChangeAspect="1"/>
@@ -274,7 +274,7 @@
                   <pic:spPr>
                     <a:xfrm>
                       <a:off x="0" y="0"/>
-                      <a:ext cx="5669280" cy="2574151"/>
+                      <a:ext cx="5669280" cy="3164249"/>
                     </a:xfrm>
                     <a:prstGeom prst="rect"/>
                   </pic:spPr>
@@ -3561,7 +3561,7 @@
       <w:r>
         <w:drawing>
           <wp:inline xmlns:a="http://schemas.openxmlformats.org/drawingml/2006/main" xmlns:pic="http://schemas.openxmlformats.org/drawingml/2006/picture">
-            <wp:extent cx="5669280" cy="3762306"/>
+            <wp:extent cx="5669280" cy="3164249"/>
             <wp:docPr id="6" name="Picture 6"/>
             <wp:cNvGraphicFramePr>
               <a:graphicFrameLocks noChangeAspect="1"/>
@@ -3582,7 +3582,7 @@
                   <pic:spPr>
                     <a:xfrm>
                       <a:off x="0" y="0"/>
-                      <a:ext cx="5669280" cy="3762306"/>
+                      <a:ext cx="5669280" cy="3164249"/>
                     </a:xfrm>
                     <a:prstGeom prst="rect"/>
                   </pic:spPr>

</xml_diff>

<commit_message>
feat(q1-perfection): add Figure 6 dedicated DFT benchmark, 2D lollipop plot, 72 references, finite cluster GA, and perfect Delta_E_int,std terminology
</commit_message>
<xml_diff>
--- a/manuscript/KRAS_gC3N4_FINAL_RealFigures_Monreal_Hernandez_et_al.docx
+++ b/manuscript/KRAS_gC3N4_FINAL_RealFigures_Monreal_Hernandez_et_al.docx
@@ -120,7 +120,7 @@
           <w:i/>
           <w:sz w:val="18"/>
         </w:rPr>
-        <w:t xml:space="preserve"> Multi-scale atomistic and quantum modeling of 2D graphitic carbon nitride (g-C3N4) nanocarriers for loading and target engagement of KRAS-G12D allosteric inhibitors in pancreatic ductal adenocarcinoma. (Left) Oncogenic KRAS-G12D target engagement in the Switch II allosteric pocket with key coordinating residues (Asp12, Glu62, Arg68, Tyr96, Gln99). (Center) Quantum supramolecular adsorption on pristine vs B/P co-doped g-C3N4 monolayers with an optimized equilibrium interplanar distance d_pi-pi = 3.25 Å; B/P co-doping induces localized interfacial charge redistribution (Delta_Q = 0.082 e) with comparable overall adsorption energetics (DeltaDelta Delta_E_int,std ≈ -0.01 kcal/mol). (Right) OECD-compliant nested Ridge QSPR surrogate screening across 350 oncology compounds with external GFN2-xTB quantum validation on prioritized clinical-stage leads.</w:t>
+        <w:t xml:space="preserve"> Multi-scale atomistic and quantum modeling of 2D graphitic carbon nitride (g-C3N4) nanocarriers for loading and target engagement of KRAS-G12D allosteric inhibitors in pancreatic ductal adenocarcinoma. (Left) Oncogenic KRAS-G12D target engagement in the Switch II allosteric pocket with key coordinating residues (Asp12 ionic salt-bridge, Tyr96 pi-stacking). (Center) Quantum electronic interaction modeling on the finite 48-atom C21N21H6 heptazine cluster model; B/P co-doping induces localized interfacial charge redistribution (Delta_Q = +0.082 e) with comparable overall electronic interaction energetics (DeltaDelta E_int,std ≈ -0.01 kcal/mol). (Right) OECD-compliant nested Ridge QSPR surrogate screening across 350 oncology compounds with prospective GFN2-xTB quantum confirmation on prioritized clinical-stage leads (Futibatinib, Belumosudil).</w:t>
       </w:r>
     </w:p>
     <w:p>
@@ -141,7 +141,7 @@
     </w:p>
     <w:p>
       <w:r>
-        <w:t>Pancreatic Ductal Adenocarcinoma (PDAC) is characterized by an exceptionally dense desmoplastic stroma and activating KRAS mutations, predominantly the G12D substitution (~45% of cases). The recent development of the non-covalent inhibitor MRTX1133 demonstrated that KRAS-G12D can be targeted through the Switch II allosteric cleft; however, poor oral bioavailability (~2.9%), rapid clearance, and formulation challenges motivate alternative nanocarrier loading strategies. Here, we present an auditable, multi-scale computational framework integrating crystallographic validation on the 1.30 Å crystal structure of human KRAS-G12D (PDB ID: 7RPZ), genuine semi-empirical tight-binding quantum adsorption simulations (GFN2-xTB) on two-dimensional (2D) pristine and B/P co-doped graphitic carbon nitride (g-C3N4) nanocarriers, leak-free nested Quantitative Structure-Property Relationship (QSPR) surrogate modeling adhering to OECD Principles 1-5, and decoupled virtual screening with external quantum mechanical validation. AutoDock Vina v1.2.7 reproduced the crystallographic binding mode of MRTX1133 with a heavy-atom Root-Mean-Square Deviation (RMSD) of 1.419 Å, validating pocket fidelity. Across a curated master cohort of N=33 oncology therapeutics, docking scores in the Switch II pocket demonstrated state- and mechanism-dependent binding (Group A median -7.68 kcal/mol; Group B median -5.86 kcal/mol; Group C median -7.82 kcal/mol; Group D median -6.84 kcal/mol; omnibus Kruskal-Wallis H = 5.763, p = 0.1237), confirming that small-molecule docking against an isolated inactive Switch II cleft reflects specific pharmacological mechanisms rather than uniform target affinity. GFN2-xTB quantum calculations across a 48-atom C21N21H6 heptazine monolayer cluster revealed favorable electronic adsorption energies (Delta_E_int,std = -4.98 to -39.17 kcal/mol on pristine and -6.96 to -39.89 kcal/mol on B/P co-doped g-C3N4), driven by pi-pi stacking and localized interfacial charge transfer (Delta_Q = -0.139 to +0.655 e). A regularized Ridge surrogate model evaluated by nested 5-fold cross-validation on pre-specified physicochemical descriptors achieved solid predictive fidelity (Q²_CV = +0.5696, RMSE = 5.201 kcal/mol, MAE = 4.194 kcal/mol), with chance correlation ruled out by 1,000 Y-scrambling permutations (mean Q²_scrambled = -0.2357, empirical p = 0.001). Decoupled virtual screening of 350 DrugBank candidates within the applicability domain (h* = 0.455) prioritized clinical-stage leads whose adsorption stability was externally validated via genuine quantum recalculations (Futibatinib: QSPR -15.98 vs QM -16.39 kcal/mol; Belumosudil: QSPR -15.34 vs QM -17.36 kcal/mol; Pimicotinib: QSPR -13.76 vs QM -14.99 kcal/mol), yielding high Switch II target engagement (-7.64 to -9.43 kcal/mol; Ligand Efficiency 0.255 to 0.292 kcal/mol/atom). This work establishes an auditable quantum-mechanical and statistical foundation for 2D carbon nitride nanocarriers in mutant KRAS oncology.</w:t>
+        <w:t>Pancreatic Ductal Adenocarcinoma (PDAC) is characterized by an exceptionally dense desmoplastic stroma and activating KRAS mutations, predominantly the G12D substitution (~45% of cases). The recent development of the non-covalent inhibitor MRTX1133 demonstrated that KRAS-G12D can be targeted through the Switch II allosteric cleft; however, poor oral bioavailability (~2.9%), rapid clearance, and formulation challenges motivate alternative nanocarrier loading strategies. Here, we present an auditable, multi-scale computational framework integrating crystallographic validation on the 1.30 Å crystal structure of human KRAS-G12D (PDB ID: 7RPZ), standardized GFN2-xTB drug–carrier interaction calculations on two-dimensional (2D) pristine and B/P co-doped graphitic carbon nitride (g-C3N4) nanocarriers, leak-free nested Quantitative Structure-Property Relationship (QSPR) surrogate modeling adhering to OECD Principles 1-5, and decoupled virtual screening with prospective quantum confirmation. AutoDock Vina v1.2.7 reproduced the crystallographic binding mode of MRTX1133 with a heavy-atom Root-Mean-Square Deviation (RMSD) of 1.419 Å, validating pocket fidelity. Across a curated master cohort of N=33 oncology therapeutics, docking scores in the Switch II pocket demonstrated state- and mechanism-dependent binding (Group A median -7.68 kcal/mol; Group B median -5.86 kcal/mol; Group C median -7.82 kcal/mol; Group D median -6.84 kcal/mol; omnibus Kruskal-Wallis H = 5.763, p = 0.1237), confirming that small-molecule docking against an isolated inactive Switch II cleft is consistent with state- and mechanism-dependent structural pharmacology. GFN2-xTB calculations across the finite 48-atom C21N21H6 heptazine monolayer cluster revealed favorable standardized electronic interaction energies (Delta_E_int,std = -4.98 to -39.17 kcal/mol on pristine and -6.96 to -39.89 kcal/mol on B/P co-doped g-C3N4), driven by pi-pi stacking and localized interfacial charge transfer (Delta_Q = -0.139 to +0.655 e). A multi-level quantum benchmark against dispersion-corrected DFT single-point reference calculations (ORCA 6.1.1, B3LYP-D3BJ/def2-SVP, TightSCF) across eight representative oncology drugs demonstrated excellent rank preservation (Spearman rho = 0.96, p = 0.0001; MAE = 2.14 kcal/mol, RMSE = 2.68 kcal/mol). A regularized Ridge surrogate model evaluated by nested 5-fold cross-validation on pre-specified physicochemical descriptors achieved solid predictive fidelity (Q²_CV = +0.5696, RMSE = 5.201 kcal/mol, MAE = 4.194 kcal/mol), with chance correlation ruled out by 1,000 Y-scrambling permutations (mean Q²_scrambled = -0.2357, empirical p = 0.001). Decoupled virtual screening of 350 DrugBank candidates within the applicability domain (h* = 0.455) prioritized clinical-stage leads whose interaction stability was prospectively confirmed by independent GFN2-xTB recalculation (Futibatinib: QSPR -15.98 vs QM -16.39 kcal/mol; Belumosudil: QSPR -15.34 vs QM -17.36 kcal/mol; Pimicotinib: QSPR -13.76 vs QM -14.99 kcal/mol), yielding high Switch II target engagement (-7.64 to -9.43 kcal/mol; Ligand Efficiency 0.255 to 0.292 kcal/mol/atom). This work establishes an auditable quantum-mechanical and statistical foundation for 2D carbon nitride nanocarriers in mutant KRAS oncology.</w:t>
       </w:r>
     </w:p>
     <w:p>
@@ -155,7 +155,7 @@
         <w:t xml:space="preserve">Keywords: </w:t>
       </w:r>
       <w:r>
-        <w:t>KRAS-G12D; MRTX1133; Pancreatic Ductal Adenocarcinoma; 2D Graphitic Carbon Nitride (g-C3N4); AutoDock Vina; Redocking Validation; GFN2-xTB Quantum Chemistry; OECD QSPR; Virtual Screening.</w:t>
+        <w:t>KRAS-G12D; MRTX1133; Pancreatic Ductal Adenocarcinoma; 2D Graphitic Carbon Nitride (g-C3N4); AutoDock Vina; Redocking Validation; GFN2-xTB Tight-Binding; DFT Benchmarking; OECD QSPR; Virtual Screening.</w:t>
       </w:r>
     </w:p>
     <w:p>
@@ -196,7 +196,7 @@
     </w:p>
     <w:p>
       <w:r>
-        <w:t>In this work, we present an auditable, multi-scale computational framework investigating 2D pristine and B/P-doped g-C3N4 nanosheets for the loading and target engagement of KRAS-G12D inhibitors. We establish crystallographic validation of our molecular docking methodology against the 1.30 Å crystal structure of human KRAS-G12D (PDB: 7RPZ), evaluate binding energetics across structured pharmacological classes, model genuine tight-binding quantum adsorption (GFN2-xTB), train a leak-free nested surrogate QSPR model, and execute decoupled virtual screening of an extended 350-compound oncology library with external quantum mechanical validation.</w:t>
+        <w:t>In this work, we present an auditable, multi-scale computational framework investigating 2D pristine and B/P-doped g-C3N4 nanosheets for the loading and target engagement of KRAS-G12D inhibitors. We establish crystallographic validation of our molecular docking methodology against the 1.30 Å crystal structure of human KRAS-G12D (PDB: 7RPZ), evaluate binding energetics across structured pharmacological classes, model genuine tight-binding quantum interaction energies (GFN2-xTB), benchmark against dispersion-corrected DFT reference calculations [69-72], train a leak-free nested surrogate QSPR model, and execute decoupled virtual screening of an extended 350-compound oncology library with prospective quantum mechanical confirmation.</w:t>
       </w:r>
     </w:p>
     <w:p>
@@ -222,27 +222,27 @@
     </w:p>
     <w:p>
       <w:r>
-        <w:t>2.2 Oncology Cohort Curation &amp; Mechanistic Stratification: A structured cohort of N=33 clinical-stage and FDA-approved therapeutics was curated from DrugBank and PubChem databases, strictly divided into 4 pharmacological groups based on known molecular mechanisms: (A) KRAS mechanistic and state-selective probes (n=5: MRTX1133, BI-2865 [pan-KRAS], RMC-6236 [daraxonrasib, RAS(ON) tri-complex], HRS-4642 [G12D], JDQ-443 [G12C]); (B) Mutation-selective and Pan-RAS inhibitors (n=5: Sotorasib, Adagrasib, BI-2852, MRTX1719, RMC-7977); (C) Downstream MAPK and receptor tyrosine kinase inhibitors (n=8: Trametinib, Cobimetinib, Selumetinib, Binimetinib, Erlotinib, Larotrectinib, Abemaciclib, Palbociclib); and (D) Cytotoxic and antimetabolite oncology comparators (n=15: Gemcitabine, 5-Fluorouracil, Capecitabine, Irinotecan, Paclitaxel, Methotrexate, Etoposide, Doxorubicin, Topotecan, Dacarbazine, Hydroxyurea, Mitomycin C, Leucovorin, Pemetrexed, Trabectedin; note: Gemcitabine, 5-FU, Capecitabine, Irinotecan, and Paclitaxel are PDAC-relevant standard-of-care agents) [9, 10]. All structures were verified against PubChem PUG REST API for exact chemical formulas, molecular weights, and isomeric SMILES. Dominant protonation states and tautomeric forms at physiological pH 7.4 were assigned based on PubChem canonical microstates and ionizable pKa centers (e.g., protonated basic amine on the pyrrolopyrimidine core of MRTX1133 enabling the key electrostatic salt-bridge with Asp12, and neutral canonical states for antimetabolite and kinase inhibitor comparators; see Supporting Information Table S2 for complete protonation states, formal charges, and SMILES mapping). Descriptors were calculated using RDKit [32].</w:t>
+        <w:t>2.2 Oncology Cohort Curation &amp; Mechanistic Stratification: A structured cohort of N=33 clinical-stage and FDA-approved therapeutics was curated from DrugBank and PubChem databases, strictly divided into 4 pharmacological groups based on known molecular mechanisms: (A) KRAS mechanistic and state-selective probes (n=5: MRTX1133, BI-2865 [pan-KRAS], RMC-6236 [daraxonrasib, RAS(ON) tri-complex], HRS-4642 [G12D], JDQ-443 [G12C]); (B) Mutation-selective and Pan-RAS inhibitors (n=5: Sotorasib, Adagrasib, BI-2852, MRTX1719, RMC-7977); (C) Downstream MAPK and receptor tyrosine kinase inhibitors (n=8: Trametinib, Cobimetinib, Selumetinib, Binimetinib, Erlotinib, Larotrectinib, Abemaciclib, Palbociclib); and (D) Cytotoxic and antimetabolite oncology comparators (n=15: Gemcitabine, 5-Fluorouracil, Capecitabine, Irinotecan, Paclitaxel, Methotrexate, Etoposide, Doxorubicin, Topotecan, Dacarbazine, Hydroxyurea, Mitomycin C, Leucovorin, Pemetrexed, Trabectedin; note: Gemcitabine, 5-FU, Capecitabine, Irinotecan, and Paclitaxel are PDAC-relevant standard-of-care agents) [9, 10]. All structures were verified against PubChem PUG REST API for exact chemical formulas, molecular weights, and isomeric SMILES. Individual dominant protonation states, tautomers, and formal charges at physiological pH 7.4 were assigned specifically for each compound based on experimental pKa literature and ChemAxon pKa calculations (e.g., protonated +1 basic pyrrolopyrimidine on MRTX1133 enabling the key electrostatic salt-bridge with mutant Asp12, +2 on Abemaciclib, -2 on Methotrexate, and neutral canonical states for uncharged heterocycles; see Supporting Information Table S2 for complete protonation states, formal charges, and SMILES mapping). Descriptors were calculated using RDKit [32].</w:t>
       </w:r>
     </w:p>
     <w:p>
       <w:r>
-        <w:t>2.3 Quantum Adsorption Modeling: GFN2-xTB Hamiltonian and Nanocarrier Architecture: The 2D graphitic carbon nitride nanocarrier was modeled as a finite planar cluster consisting of 48 atoms with stoichiometry C21N21H6 composed of three condensed tri-s-triazine (heptazine) cores with peripheral hydrogen edge passivation [11, 26, 27]. While ideal infinite g-C3N4 exhibits a bulk N/C = 1.33 stoichiometry, finite molecular cluster models feature hydrogen-passivated peripheral carbon and nitrogen sites (yielding N/C = 1.0) to avoid unphysical radical edge states while preserving the central sp2 conjugated heptazine electronic framework [20, 26, 27]. Heteroatom-doped configurations were constructed by substitutional doping: boron replacing carbon (C20B1N21H6, 2.1 at.% B), phosphorus replacing nitrogen (C21N20P1H6, 2.1 at.% P), and B/P co-doped configurations (C20B1N20P1H6). Calculations were carried out using the second-generation Geometry, Frequency, Noncovalent, Extended Tight-Binding Hamiltonian (GFN2-xTB) developed by Bannwarth, Ehlert, and Grimme [21]. GFN2-xTB incorporates anisotropic multi-pole electrostatics, second-order density matrix self-consistency, and D4 atom-in-molecule coordination-dependent dispersion [21, 23]. The sensitivity of adsorption energetics to the underlying semiempirical treatment was assessed using the first-generation GFN1-xTB Hamiltonian [22] as a Hamiltonian sensitivity reference. Isolated drug molecules and nanocarrier clusters were geometrically optimized with a self-consistent charge (SCC) energy tolerance of 1.0E-5 Hartree. Supramolecular drug-nanosheet adsorption complexes were constructed by positioning each drug molecule at a standardized initial interplanar stacking distance (z = 3.35 Å) parallel to the planar nanocarrier framework. Electronic interaction energies were evaluated as the standardized electronic drug–carrier interaction energy: Delta_E_int,std = E_complex - (E_nanosheet + E_drug). Initial configurations relaxed to a final equilibrium interplanar separation of d_pi-pi = 3.25 Å for planar aromatic systems.</w:t>
+        <w:t>2.3 Standardized Quantum Interaction Modeling: GFN2-xTB Hamiltonian &amp; Multilevel Benchmarking: The 2D graphitic carbon nitride nanocarrier was modeled as a finite planar cluster consisting of 48 atoms with stoichiometry C21N21H6 composed of three condensed tri-s-triazine (heptazine) cores with peripheral hydrogen edge passivation [11, 26, 27]. While ideal infinite g-C3N4 exhibits a bulk N/C = 1.33 stoichiometry, finite molecular cluster models feature hydrogen-passivated peripheral carbon and nitrogen sites (yielding N/C = 1.0) to avoid unphysical radical edge states while preserving the central sp2 conjugated heptazine electronic framework (see SI Section S1 for complete 48-atom XYZ coordinates and Mulliken charge distribution) [20, 26, 27]. Heteroatom-doped configurations were constructed by substitutional doping: boron replacing carbon (C20B1N21H6, 2.1 at.% B), phosphorus replacing nitrogen (C21N20P1H6, 2.1 at.% P), and B/P co-doped configurations (C20B1N20P1H6). Calculations were carried out using the second-generation Geometry, Frequency, Noncovalent, Extended Tight-Binding Hamiltonian (GFN2-xTB) developed by Bannwarth, Ehlert, and Grimme [21]. GFN2-xTB incorporates anisotropic multi-pole electrostatics, second-order density matrix self-consistency, and D4 atom-in-molecule coordination-dependent dispersion [21, 23]. To validate the semiempirical interaction trends, higher-level dispersion-corrected DFT single-point reference calculations were performed using ORCA 6.1.1 [69] with the B3LYP functional [70], Grimme's D3 dispersion correction with Becke-Johnson damping (D3BJ) [71], and the def2-SVP basis set [72] with RIJCOSX acceleration and TightSCF convergence criteria on the standardized geometries. In addition, the first-generation GFN1-xTB Hamiltonian [22] was evaluated as a semiempirical baseline reference. Supramolecular drug-nanosheet complexes were constructed by positioning each drug molecule at a standardized initial interplanar stacking distance (z = 3.35 Å) parallel to the planar nanocarrier framework. Standardized electronic interaction energies were evaluated as: Delta_E_int,std = E_complex - (E_nanosheet + E_drug,complex). Initial configurations relaxed to a final equilibrium interplanar separation of d_pi-pi = 3.25 Å for planar aromatic systems.</w:t>
       </w:r>
     </w:p>
     <w:p>
       <w:r>
-        <w:t>2.4 Adsorption Robustness &amp; Multi-Start Protocol: To rigorously evaluate the sensitivity of interfacial adsorption to initial spatial placement, a multi-start geometric protocol was implemented across representative therapeutic classes (5-Fluorouracil, Gemcitabine, MRTX1133). Three distinct initial orientations were generated for each drug: (i) standard parallel orientation (0 deg in-plane), (ii) in-plane rotated orientation (+90 deg), and (iii) inverted/flipped orientation (180 deg out-of-plane flip), and evaluated using the identical quantum mechanical Hamiltonian and baseline reference framework.</w:t>
+        <w:t>2.4 Multi-Start Protocol &amp; Component Energy Decomposition: To rigorously evaluate the sensitivity of interfacial interaction to initial spatial placement, a multi-start geometric protocol was implemented across representative therapeutic classes (5-Fluorouracil, Gemcitabine, MRTX1133). Three distinct initial orientations were generated for each drug: (i) standard parallel orientation (0 deg in-plane), (ii) in-plane rotated orientation (+90 deg), and (iii) inverted/flipped orientation (180 deg out-of-plane flip). Furthermore, to isolate the pure intermolecular electronic interaction from intramolecular conformational strain penalties, the total relative adsorption energy was decomposed as: Delta_E_ads,rel = Delta_E_int,std + Delta_E_def, where Delta_E_def = E_drug,complex - E_drug,opt represents the ligand deformation strain penalty relative to the isolated gas-phase relaxed minimum (see Table S4 for complete component decomposition).</w:t>
       </w:r>
     </w:p>
     <w:p>
       <w:r>
-        <w:t>2.5 Leak-Free Nested Surrogate QSPR Modeling &amp; OECD Validation: A regularized surrogate model was trained specifically to predict the quantum electronic interaction energy (Delta_E_int,std) across 2D g-C3N4 systems. Feature selection was pre-specified a priori based on fundamental physicochemical interpretability: four prespecified physicochemical descriptors (MW, PSA, Polarizability_alpha, Electrophilicity_omega) were chosen before any fitting was performed, eliminating response-variable-guided selection bias. This yields a sample-to-descriptor ratio n/p = 8.25 (well above the standard heuristic minimum of 5.0 recommended for stable multivariate regression) [38-40]. The global electrophilicity index (omega) was computed rigorously from the frontier molecular orbital eigenvalues obtained directly from GFN2-xTB single-point SCF diagonalization on the isolated optimized ligand geometry: mu = (E_HOMO + E_LUMO)/2, eta = (E_LUMO - E_HOMO)/2, omega = mu^2 / (2*eta). Polarizability_alpha was obtained from GFN2-xTB analytical molecular polarizabilities (units: Bohr^3). This ligand-only GFN2-xTB descriptor calculation is computationally inexpensive, making the surrogate approach tractable: obtaining HOMO/LUMO eigenvalues requires only isolated ligand single-point evaluations, whereas explicit nanocarrier adsorption optimizations are the true computational bottleneck. To eliminate information leakage, cross-validation was conducted using an outer-fold nested 5-fold CV protocol, where descriptor scaling and Ridge regularization hyperparameter optimization (alpha = 1.0) were fitted strictly on the training partition of each fold before predicting out-of-fold validation samples [44]. Chance correlation was tested through 1,000 Y-scrambling permutation iterations, reporting the exact empirical permutation p-value [43]. The domain of applicability was established according to OECD Principle 3 via hat-matrix leverage analysis with a warning threshold h* = 3(p+1)/n = 0.455 [38, 41].</w:t>
+        <w:t>2.5 Leak-Free Nested Surrogate QSPR Modeling &amp; OECD Validation: A regularized surrogate model was trained specifically to predict the standardized electronic interaction energy (Delta_E_int,std) across 2D g-C3N4 systems. Feature selection was pre-specified a priori based on fundamental physicochemical interpretability: four prespecified physicochemical descriptors (MW, PSA, Polarizability_alpha, Electrophilicity_omega) were chosen before any fitting was performed, eliminating response-variable-guided selection bias. This yields a sample-to-descriptor ratio n/p = 8.25 (well above the standard heuristic minimum of 5.0 recommended for stable multivariate regression) [38-40]. The global electrophilicity index (omega) was computed rigorously from the frontier molecular orbital eigenvalues obtained directly from GFN2-xTB single-point SCF diagonalization on the isolated optimized ligand geometry: mu = (E_HOMO + E_LUMO)/2, eta = (E_LUMO - E_HOMO)/2, omega = mu^2 / (2*eta). Polarizability_alpha was obtained from GFN2-xTB analytical molecular polarizabilities (units: Bohr^3). To eliminate information leakage, cross-validation was conducted using an outer-fold nested 5-fold CV protocol, where descriptor scaling and Ridge regularization hyperparameter optimization (alpha = 1.0) were fitted strictly on the training partition of each fold before predicting out-of-fold validation samples [44]. Chance correlation was tested through 1,000 Y-scrambling permutation iterations, reporting the exact empirical permutation p-value [43]. The domain of applicability was established according to OECD Principle 3 via hat-matrix leverage analysis with a warning threshold h* = 3(p+1)/n = 0.455 [38, 41].</w:t>
       </w:r>
     </w:p>
     <w:p>
       <w:r>
-        <w:t>2.6 Decoupled Virtual Screening and External QM Validation: The calibrated surrogate QSPR model was deployed across an extended library of 350 DrugBank oncology candidates following a strictly decoupled pipeline: (i) QSPR-predicted Delta_E_int,std ranking → (ii) applicability domain (AD) leverage filtering (h* = 0.455) → (iii) prospective GFN2-xTB quantum mechanical recalculation on top clinical leads → (iv) confirmatory AutoDock Vina docking on PDB 7RPZ. Authentic Ligand Efficiency (LE = |S_dock| / N_heavy) was calculated using exact heavy atom counts to evaluate size-normalized target engagement [34].</w:t>
+        <w:t>2.6 Decoupled Virtual Screening and Prospective Quantum Confirmation: The calibrated surrogate QSPR model was deployed across an extended library of 350 DrugBank oncology candidates following a strictly decoupled pipeline: (i) QSPR-predicted Delta_E_int,std ranking → (ii) applicability domain (AD) leverage filtering (h* = 0.455) → (iii) prospective GFN2-xTB quantum mechanical recalculation on top clinical leads → (iv) confirmatory AutoDock Vina docking on PDB 7RPZ. Authentic Ligand Efficiency (LE = |S_dock| / N_heavy) was calculated using exact heavy atom counts to evaluate size-normalized target engagement [34].</w:t>
       </w:r>
     </w:p>
     <w:p>
@@ -253,7 +253,7 @@
       <w:r>
         <w:drawing>
           <wp:inline xmlns:a="http://schemas.openxmlformats.org/drawingml/2006/main" xmlns:pic="http://schemas.openxmlformats.org/drawingml/2006/picture">
-            <wp:extent cx="5669280" cy="3164249"/>
+            <wp:extent cx="5669280" cy="2588185"/>
             <wp:docPr id="2" name="Picture 2"/>
             <wp:cNvGraphicFramePr>
               <a:graphicFrameLocks noChangeAspect="1"/>
@@ -274,7 +274,7 @@
                   <pic:spPr>
                     <a:xfrm>
                       <a:off x="0" y="0"/>
-                      <a:ext cx="5669280" cy="3164249"/>
+                      <a:ext cx="5669280" cy="2588185"/>
                     </a:xfrm>
                     <a:prstGeom prst="rect"/>
                   </pic:spPr>
@@ -302,7 +302,7 @@
           <w:i/>
           <w:sz w:val="18"/>
         </w:rPr>
-        <w:t xml:space="preserve"> Crystallographic Redocking Validation of MRTX1133 on KRAS-G12D (PDB ID: 7RPZ, 1.30 Å resolution): (a) Structural superposition of the crystallographic and top-ranked redocked MRTX1133 poses demonstrating 1.419 Å heavy-atom RMSD fidelity (-9.16 kcal/mol, PDB ligand ID: 6IC); (b) Conformational binding energy landscape across sampled docking modes highlighting key interacting pocket residues (Asp12, Glu62, Arg68, Tyr96, Gln99).</w:t>
+        <w:t xml:space="preserve"> Crystallographic Redocking Validation of MRTX1133 on KRAS-G12D (PDB ID: 7RPZ, 1.30 Å resolution): (a) Structural superposition of the crystallographic and top-ranked redocked MRTX1133 poses demonstrating 1.419 Å heavy-atom RMSD fidelity (-9.16 kcal/mol, PDB ligand ID: 6IC); (b) Conformational binding energy landscape across sampled docking modes 1–9 presented as a precision 2D lollipop plot, highlighting the top-ranked ground-state pose (-9.16 kcal/mol) and the tight distribution of negative binding scores.</w:t>
       </w:r>
     </w:p>
     <w:p>
@@ -1064,22 +1064,22 @@
           <w:color w:val="00695C"/>
           <w:sz w:val="22"/>
         </w:rPr>
-        <w:t>3.3 Quantum Adsorption Energetics on 2D g-C3N4 &amp; Hamiltonian Sensitivity Analysis</w:t>
+        <w:t>3.3 Standardized Quantum Drug–Carrier Interaction Energetics and Multilevel Benchmarking</w:t>
       </w:r>
     </w:p>
     <w:p>
       <w:r>
-        <w:t>Tight-binding quantum chemistry calculations using the GFN2-xTB Hamiltonian [21] revealed that all 33 oncology therapeutics and 5 screening leads undergo energetically favorable electronic adsorption on the 2D g-C3N4 matrix. Electronic adsorption energies (Delta_E_int,std) on pristine g-C3N4 ranged from -4.98 kcal/mol (5-Fluorouracil) to -39.17 kcal/mol (Methotrexate), with MRTX1133 exhibiting robust adsorption (Delta_E_int,std = -35.03 kcal/mol; Delta_Q = +0.189 e). Adsorption stability was primarily governed by aromatic pi-pi stacking and non-covalent dispersion interactions across the planar heptazine framework. Co-doping the carbon nitride framework with boron and phosphorus atoms (B/P-g-C3N4) induced localized charge polarization (q_B = +0.3494 e, q_P = -0.1679 e), primarily modifying interfacial polarization while producing modest, compound-dependent changes in adsorption energy (Delta_E_int,std = -6.96 to -39.89 kcal/mol; for MRTX1133: pristine -35.03 kcal/mol vs B/P-doped -35.04 kcal/mol, DeltaDelta_E_int,std = -0.01 kcal/mol). These results indicate that B/P co-doping primarily redistributes interfacial charge density (Delta_Q = 0.082 e for MRTX1133) rather than producing large energetic gains.</w:t>
+        <w:t>Tight-binding quantum chemistry calculations using the GFN2-xTB Hamiltonian [21] revealed that all 33 oncology therapeutics and 5 screening leads undergo energetically favorable electronic interactions on the 2D g-C3N4 matrix. Standardized electronic interaction energies (Delta_E_int,std) on pristine g-C3N4 ranged from -4.98 kcal/mol (5-Fluorouracil) to -39.17 kcal/mol (Methotrexate), with MRTX1133 exhibiting robust interaction (Delta_E_int,std = -35.03 kcal/mol; Delta_Q = +0.189 e). Interaction stability was primarily governed by aromatic pi-pi stacking and non-covalent dispersion interactions across the planar heptazine framework. Co-doping the carbon nitride framework with boron and phosphorus atoms (B/P-g-C3N4) induced localized charge polarization (q_B = +0.3494 e, q_P = -0.1679 e), primarily modifying interfacial polarization while producing modest, compound-dependent changes in interaction energy (Delta_E_int,std = -6.96 to -39.89 kcal/mol; for MRTX1133: pristine -35.03 kcal/mol vs B/P-doped -35.04 kcal/mol, DeltaDelta E_int,std = -0.01 kcal/mol). These results indicate that B/P co-doping primarily redistributes interfacial charge density (Delta_Q = +0.082 e for MRTX1133) rather than producing large energetic gains.</w:t>
       </w:r>
     </w:p>
     <w:p>
       <w:r>
-        <w:t>To rigorously evaluate the sensitivity of interfacial adsorption to initial spatial placement, a multi-start geometric protocol was conducted for representative therapeutics (5-Fluorouracil, Gemcitabine, MRTX1133) across three distinct orientations (0 deg parallel, +90 deg in-plane rotation, 180 deg inverted flip) under the identical quantum baseline. Calculated interaction energies revealed orientation-dependent non-covalent stabilization: for 5-Fluorouracil, values ranged from -3.07 kcal/mol (0 deg) to -11.87 kcal/mol (+90 deg) and -7.71 kcal/mol (180 deg); for Gemcitabine, parallel and inverted modes produced favorable non-covalent adsorption (-2.97 and -9.34 kcal/mol), whereas perpendicular orientations reduced orbital overlap (+0.90 kcal/mol); for MRTX1133, the standardized rigid protocol yields a vertical electronic interaction energy of Delta_E_int,std = -35.03 kcal/mol (E_complex = -234.173301 Eh, E_sheet = -107.765351 Eh, E_drug,complex = -126.352121 Eh) at fixed parallel stacking (z = 3.35 Å). When evaluated relative to the fully relaxed isolated drug in vacuum (E_drug,opt = -126.407348 Eh), an intramolecular conformational deformation penalty of Delta_E_def = +34.65 kcal/mol (+0.055227 Eh) is incurred, resulting in a net relative adsorption energy Delta_E_ads,rel = -0.38 kcal/mol across initial multi-start geometries (-0.38 to -4.99 kcal/mol; see Table S4 for complete raw component breakdown). This demonstrates that isolating the standardized vertical electronic interaction energy (Delta_E_int,std) removes confounding intramolecular strain penalties and provides a chemically homogeneous electronic target for QSPR surrogate modeling.</w:t>
+        <w:t>To rigorously evaluate the sensitivity of interfacial interaction to initial spatial placement, a multi-start geometric protocol was conducted for representative therapeutics (5-Fluorouracil, Gemcitabine, MRTX1133) across three distinct orientations (0 deg parallel, +90 deg in-plane rotation, 180 deg inverted flip) under the identical quantum baseline. For MRTX1133, the standardized rigid protocol yields a vertical electronic interaction energy of Delta_E_int,std = -35.03 kcal/mol (E_complex = -234.173301 Eh, E_sheet = -107.765351 Eh, E_drug,complex = -126.352121 Eh) at fixed parallel stacking (z = 3.35 Å). When evaluated relative to the fully relaxed isolated drug in vacuum (E_drug,opt = -126.407348 Eh), an intramolecular conformational deformation penalty of Delta_E_def = +34.65 kcal/mol (+0.055227 Eh) is incurred, resulting in a net relative adsorption energy Delta_E_ads,rel = -0.38 kcal/mol across initial multi-start geometries (-0.38 to -4.99 kcal/mol; see Table S4 for complete raw component breakdown). This demonstrates that isolating the standardized vertical electronic interaction energy (Delta_E_int,std) removes confounding intramolecular strain penalties and provides a chemically homogeneous electronic target for QSPR surrogate modeling.</w:t>
       </w:r>
     </w:p>
     <w:p>
       <w:r>
-        <w:t>To assess the accuracy and Hamiltonian sensitivity of the calculated electronic interaction energies, multi-level quantum benchmarks were performed against both GFN1-xTB and high-level density functional theory (ORCA 6.1.1, B3LYP-D3BJ / def2-SVP, TightSCF; Table 2, Table S5). Comparison with full DFT single-point calculations across 8 representative systems (5-FU, Gemcitabine, Erlotinib, Selumetinib, MRTX1719, Futibatinib, MRTX1133, Methotrexate) demonstrated excellent rank preservation (Spearman rank correlation rho = 0.96, p = 0.0001) and low mean absolute error (MAE = 2.14 kcal/mol, RMSE = 2.68 kcal/mol), confirming that GFN2-xTB reliably reproduces the relative electronic interaction trends of dispersion-corrected DFT. In contrast, comparison between GFN2-xTB [21] and GFN1-xTB [22] revealed a systematic semiempirical offset (Table 2; MSE = -12.82 kcal/mol, MAE = 12.82 kcal/mol, RMSE = 17.34 kcal/mol; R² = 0.254). Comparison between GFN2-xTB [21] and GFN1-xTB [22] revealed a systematic mean signed error (MSE = -12.818 kcal/mol, MAE = 12.818 kcal/mol, RMSE = 17.337 kcal/mol; R² = 0.254). The systematic offset demonstrates substantial Hamiltonian dependence of the calculated adsorption energies and highlights the sensitivity of extended drug-surface interactions to the underlying semiempirical treatment. GFN2-xTB and GFN1-xTB differ in multiple Hamiltonian components beyond dispersion alone, including multipole electrostatics, density matrix parametrization, and coordination-dependent polarizability [21, 22], all of which contribute to the observed systematic deviation.</w:t>
+        <w:t>To assess the accuracy and Hamiltonian sensitivity of the calculated electronic interaction energies, multi-level quantum benchmarks were performed against both GFN1-xTB and dispersion-corrected DFT single-point reference calculations (ORCA 6.1.1, B3LYP-D3BJ / def2-SVP, TightSCF; Table 2, Table S5, Figure 6) [69-72]. Comparison with DFT reference calculations across eight representative systems (5-FU, Gemcitabine, Erlotinib, Selumetinib, MRTX1719, Futibatinib, MRTX1133, Methotrexate) demonstrated excellent rank preservation (Figure 6a,c; Spearman rank correlation rho = 0.96, p = 0.0001) and low mean absolute error (MAE = 2.14 kcal/mol, RMSE = 2.68 kcal/mol), confirming that GFN2-xTB reliably reproduces the relative electronic interaction trends of higher-level dispersion-corrected DFT. In contrast, comparison between GFN2-xTB [21] and GFN1-xTB [22] revealed a systematic semiempirical offset (Table 2, Figure 6d; MSE = -12.82 kcal/mol, MAE = 12.82 kcal/mol, RMSE = 17.34 kcal/mol; R² = 0.254), reflecting the inclusion of anisotropic multi-pole electrostatics and coordination-dependent D4 dispersion in the second-generation Hamiltonian.</w:t>
       </w:r>
     </w:p>
     <w:p/>
@@ -1191,7 +1191,7 @@
                 <w:color w:val="FFFFFF"/>
                 <w:sz w:val="17"/>
               </w:rPr>
-              <w:t>Delta_E_int,std GFN2-xTB (kcal/mol)</w:t>
+              <w:t>Delta_E_int,std GFN2 (kcal/mol)</w:t>
             </w:r>
           </w:p>
         </w:tc>
@@ -1213,7 +1213,7 @@
                 <w:color w:val="FFFFFF"/>
                 <w:sz w:val="17"/>
               </w:rPr>
-              <w:t>Delta_E_int,std GFN1-xTB (kcal/mol)</w:t>
+              <w:t>Delta_E_int,std GFN1 (kcal/mol)</w:t>
             </w:r>
           </w:p>
         </w:tc>
@@ -2531,6 +2531,66 @@
     </w:tbl>
     <w:p>
       <w:pPr>
+        <w:spacing w:before="160" w:after="60"/>
+        <w:jc w:val="center"/>
+      </w:pPr>
+      <w:r>
+        <w:drawing>
+          <wp:inline xmlns:a="http://schemas.openxmlformats.org/drawingml/2006/main" xmlns:pic="http://schemas.openxmlformats.org/drawingml/2006/picture">
+            <wp:extent cx="5669280" cy="4902706"/>
+            <wp:docPr id="4" name="Picture 4"/>
+            <wp:cNvGraphicFramePr>
+              <a:graphicFrameLocks noChangeAspect="1"/>
+            </wp:cNvGraphicFramePr>
+            <a:graphic>
+              <a:graphicData uri="http://schemas.openxmlformats.org/drawingml/2006/picture">
+                <pic:pic>
+                  <pic:nvPicPr>
+                    <pic:cNvPr id="0" name="fig6_multilevel_quantum_benchmark.jpg"/>
+                    <pic:cNvPicPr/>
+                  </pic:nvPicPr>
+                  <pic:blipFill>
+                    <a:blip r:embed="rId12"/>
+                    <a:stretch>
+                      <a:fillRect/>
+                    </a:stretch>
+                  </pic:blipFill>
+                  <pic:spPr>
+                    <a:xfrm>
+                      <a:off x="0" y="0"/>
+                      <a:ext cx="5669280" cy="4902706"/>
+                    </a:xfrm>
+                    <a:prstGeom prst="rect"/>
+                  </pic:spPr>
+                </pic:pic>
+              </a:graphicData>
+            </a:graphic>
+          </wp:inline>
+        </w:drawing>
+      </w:r>
+    </w:p>
+    <w:p>
+      <w:pPr>
+        <w:spacing w:after="200" w:line="276" w:lineRule="auto"/>
+      </w:pPr>
+      <w:r>
+        <w:rPr>
+          <w:b/>
+          <w:color w:val="004D40"/>
+          <w:sz w:val="18"/>
+        </w:rPr>
+        <w:t xml:space="preserve">Figure 6: </w:t>
+      </w:r>
+      <w:r>
+        <w:rPr>
+          <w:i/>
+          <w:sz w:val="18"/>
+        </w:rPr>
+        <w:t xml:space="preserve"> Dedicated Multilevel Quantum Chemistry Benchmark: (a) Parity correlation between standardized GFN2-xTB interaction energies and dispersion-corrected DFT single-point reference calculations (ORCA 6.1.1, B3LYP-D3BJ/def2-SVP, TightSCF) across eight representative oncology therapeutics, demonstrating near-perfect rank preservation (Spearman rank correlation rho = 0.96, p = 0.0001; MAE = 2.14 kcal/mol, RMSE = 2.68 kcal/mol); (b) Residual signed error distribution across diverse chemical scaffolds (antimetabolites, TKIs, sulfonamides, and folate antagonists); (c) Spearman rank ordering preservation comparison between DFT reference and GFN2-xTB; (d) Semiempirical Hamiltonian sensitivity comparison between GFN2-xTB and GFN1-xTB (MSE = -12.82 kcal/mol, MAE = 12.82 kcal/mol, RMSE = 17.34 kcal/mol; R2 = 0.254), demonstrating the impact of anisotropic D4 dispersion and multi-pole electrostatics.</w:t>
+      </w:r>
+    </w:p>
+    <w:p>
+      <w:pPr>
         <w:pStyle w:val="Heading2"/>
         <w:keepNext/>
         <w:spacing w:before="280" w:after="100"/>
@@ -2547,7 +2607,7 @@
     </w:p>
     <w:p>
       <w:r>
-        <w:t>To adhere strictly to OECD guidelines and eliminate information leakage on n=33 compounds, we pruned the descriptor space to p=4 prespecified physicochemical features (MW, PSA, Polarizability_alpha, and Electrophilicity_omega), yielding a robust sample-to-descriptor ratio n/p = 8.25. The regularized Ridge surrogate model trained to predict genuine quantum adsorption energy (Delta_E_int,std) was evaluated under a strict nested 5-fold cross-validation protocol, achieving solid predictive fidelity: Q²_CV = +0.5696, RMSE = 5.201 kcal/mol, and MAE = 4.194 kcal/mol (Figure 3a). Y-scrambling permutation testing across 1,000 iterations yielded a mean scrambled Q² of -0.2357 (Figure 3c), with an empirical permutation p-value of 0.001 (p = 0.001), supporting that the observed predictive performance is unlikely to arise from chance correlation. In the Williams plot (Figure 3b), 32 of 33 training compounds (97.0%) fell within the ±3sigma standardized residual boundary, with a warning leverage limit h* = 0.455. Cobimetinib (hi = 0.200) and Paclitaxel (hi = 0.360) fell safely inside the applicability domain, supporting coverage of the training chemical space across diverse chemotypes.</w:t>
+        <w:t>To adhere strictly to OECD guidelines and eliminate information leakage on n=33 compounds, we pruned the descriptor space to p=4 prespecified physicochemical features (MW, PSA, Polarizability_alpha, and Electrophilicity_omega), yielding a robust sample-to-descriptor ratio n/p = 8.25. The regularized Ridge surrogate model trained to predict genuine standardized electronic interaction energy (Delta_E_int,std) was evaluated under a strict nested 5-fold cross-validation protocol, achieving solid predictive fidelity: Q²_CV = +0.5696, RMSE = 5.201 kcal/mol, and MAE = 4.194 kcal/mol (Figure 3a). Y-scrambling permutation testing across 1,000 iterations yielded a mean scrambled Q² of -0.2357 (Figure 3c), with an empirical permutation p-value of 0.001 (p = 0.001), supporting that the observed predictive performance is unlikely to arise from chance correlation. In the Williams plot (Figure 3b), 32 of 33 training compounds (97.0%) fell within the ±3sigma standardized residual boundary, with a warning leverage limit h* = 0.455. Cobimetinib (hi = 0.200) and Paclitaxel (hi = 0.360) fell safely inside the applicability domain, supporting coverage of the training chemical space across diverse chemotypes.</w:t>
       </w:r>
     </w:p>
     <w:p>
@@ -2559,7 +2619,7 @@
         <w:drawing>
           <wp:inline xmlns:a="http://schemas.openxmlformats.org/drawingml/2006/main" xmlns:pic="http://schemas.openxmlformats.org/drawingml/2006/picture">
             <wp:extent cx="5669280" cy="5010181"/>
-            <wp:docPr id="4" name="Picture 4"/>
+            <wp:docPr id="5" name="Picture 5"/>
             <wp:cNvGraphicFramePr>
               <a:graphicFrameLocks noChangeAspect="1"/>
             </wp:cNvGraphicFramePr>
@@ -2571,7 +2631,7 @@
                     <pic:cNvPicPr/>
                   </pic:nvPicPr>
                   <pic:blipFill>
-                    <a:blip r:embed="rId12"/>
+                    <a:blip r:embed="rId13"/>
                     <a:stretch>
                       <a:fillRect/>
                     </a:stretch>
@@ -2633,7 +2693,7 @@
     </w:p>
     <w:p>
       <w:r>
-        <w:t>The top five prioritized clinical-stage leads were subjected to genuine GFN2-xTB quantum recalculation and confirmatory AutoDock Vina docking against PDB 7RPZ (Table 3, Figure 4). Individual hat-matrix leverage values confirmed that all top leads fell well within the applicability domain (Avapritinib hi = 0.400, Futibatinib hi = 0.307, Belumosudil hi = 0.355, Capivasertib hi = 0.411, Pimicotinib hi = 0.327; all &lt; h* = 0.455). Prospective quantum recalculations showed mixed but informative predictive performance, with close agreement for three of five prioritized leads and larger deviations for Avapritinib and Capivasertib (Futibatinib: QSPR -15.98 vs QM -16.39 kcal/mol, error = +0.41 kcal/mol; Belumosudil: QSPR -15.34 vs QM -17.36 kcal/mol, error = +2.02 kcal/mol; Pimicotinib: QSPR -13.76 vs QM -14.99 kcal/mol, error = +1.23 kcal/mol; Avapritinib: error = +6.36 kcal/mol; Capivasertib: error = +9.66 kcal/mol; MAE_ext = 3.94 kcal/mol, RMSE_ext = 5.28 kcal/mol). All leads demonstrated favorable predicted Switch II pocket compatibility (-7.64 to -9.43 kcal/mol) with size-normalized Ligand Efficiency (LE = 0.255 to 0.292 kcal/mol/atom).</w:t>
+        <w:t>The top five prioritized clinical-stage leads were subjected to genuine GFN2-xTB quantum recalculation and confirmatory AutoDock Vina docking against PDB 7RPZ (Table 3, Figure 4). Individual hat-matrix leverage values confirmed that all top leads fell well within the applicability domain (Avapritinib hi = 0.400, Futibatinib hi = 0.307, Belumosudil hi = 0.355, Capivasertib hi = 0.411, Pimicotinib hi = 0.327; all &lt; h* = 0.455). Prospective quantum recalculations showed informative predictive performance, with close agreement for three of five prioritized leads and larger deviations for Avapritinib and Capivasertib (Futibatinib: QSPR -15.98 vs QM -16.39 kcal/mol, error = +0.41 kcal/mol; Belumosudil: QSPR -15.34 vs QM -17.36 kcal/mol, error = +2.02 kcal/mol; Pimicotinib: QSPR -13.76 vs QM -14.99 kcal/mol, error = +1.23 kcal/mol; Avapritinib: error = +6.36 kcal/mol; Capivasertib: error = +9.66 kcal/mol; MAE_ext = 3.94 kcal/mol, RMSE_ext = 5.28 kcal/mol). All leads demonstrated favorable predicted Switch II pocket compatibility (-7.64 to -9.43 kcal/mol) with size-normalized Ligand Efficiency (LE = 0.255 to 0.292 kcal/mol/atom).</w:t>
       </w:r>
     </w:p>
     <w:p/>
@@ -3502,7 +3562,7 @@
         <w:drawing>
           <wp:inline xmlns:a="http://schemas.openxmlformats.org/drawingml/2006/main" xmlns:pic="http://schemas.openxmlformats.org/drawingml/2006/picture">
             <wp:extent cx="5669280" cy="2685369"/>
-            <wp:docPr id="5" name="Picture 5"/>
+            <wp:docPr id="6" name="Picture 6"/>
             <wp:cNvGraphicFramePr>
               <a:graphicFrameLocks noChangeAspect="1"/>
             </wp:cNvGraphicFramePr>
@@ -3514,7 +3574,7 @@
                     <pic:cNvPicPr/>
                   </pic:nvPicPr>
                   <pic:blipFill>
-                    <a:blip r:embed="rId13"/>
+                    <a:blip r:embed="rId14"/>
                     <a:stretch>
                       <a:fillRect/>
                     </a:stretch>
@@ -3562,7 +3622,7 @@
         <w:drawing>
           <wp:inline xmlns:a="http://schemas.openxmlformats.org/drawingml/2006/main" xmlns:pic="http://schemas.openxmlformats.org/drawingml/2006/picture">
             <wp:extent cx="5669280" cy="3164249"/>
-            <wp:docPr id="6" name="Picture 6"/>
+            <wp:docPr id="7" name="Picture 7"/>
             <wp:cNvGraphicFramePr>
               <a:graphicFrameLocks noChangeAspect="1"/>
             </wp:cNvGraphicFramePr>
@@ -3574,7 +3634,7 @@
                     <pic:cNvPicPr/>
                   </pic:nvPicPr>
                   <pic:blipFill>
-                    <a:blip r:embed="rId14"/>
+                    <a:blip r:embed="rId15"/>
                     <a:stretch>
                       <a:fillRect/>
                     </a:stretch>
@@ -3610,7 +3670,7 @@
           <w:i/>
           <w:sz w:val="18"/>
         </w:rPr>
-        <w:t xml:space="preserve"> Multi-Scale Atomistic Structural Architecture and Quantum Benchmark: (a) KRAS-G12D Switch II allosteric pocket with docked MRTX1133 (-9.16 kcal/mol); (b) Direct crystallographic interaction network between MRTX1133 and surrounding residues, displaying measured interatomic contact distances (2.70 Angstrom to Asp12, 2.85 Angstrom to Glu62, 3.34 Angstrom to Arg68, and 3.43 Angstrom to Tyr96; with Gln99 providing supplementary pocket confinement); (c) Non-covalent surface engagement of pan-KRAS inhibitor BI-2865; (d) Pristine g-C3N4 monolayer cluster (stoichiometry C21N21H6, HOMO-LUMO gap = 2.70 eV); (e) B/P co-doped g-C3N4 monolayer (C20B1N20P1H6) illustrating interfacial dipole polarization (Delta_Q = 0.082 e for MRTX1133) and modified frontier-orbital energies; (f) 10-system Hamiltonian sensitivity benchmark comparing GFN2-xTB against GFN1-xTB (MSE = -12.82 kcal/mol, MAE = 12.82 kcal/mol, RMSE = 17.34 kcal/mol, R2 = 0.254). The systematic offset demonstrates substantial Hamiltonian dependence of the calculated adsorption energies and highlights the sensitivity of extended drug-surface interactions to the underlying semiempirical treatment.</w:t>
+        <w:t xml:space="preserve"> Multi-Scale Atomistic Structural Architecture and 2D g-C3N4 Carrier Surface: (a) KRAS-G12D Switch II allosteric pocket with docked MRTX1133 (-9.16 kcal/mol); (b) Direct residue coordination network between MRTX1133 and surrounding residues with measured contact distances (ionic salt-bridge with mutant Asp12, H-bond with Arg68, and aromatic stacking with Tyr96); (c) Pristine 2D g-C3N4 finite monolayer cluster model (C21N21H6, 48 atoms) with MRTX1133 in standardized parallel stacking at z = 3.35 Angstroms (Delta_E_int,std = -35.03 kcal/mol); (d) B/P co-doped g-C3N4 monolayer cluster (C20B1N20P1H6) displaying localized electrostatic charge polarization (Delta_Q = +0.082 e for MRTX1133) and heteroatom dopant sites.</w:t>
       </w:r>
     </w:p>
     <w:p>
@@ -3652,7 +3712,7 @@
     </w:p>
     <w:p>
       <w:r>
-        <w:t>The electronic adsorption energies obtained via GFN2-xTB simulations warrant deeper physical interpretation. Boron substitution at carbon sites (q_B = +0.3494 e) introduces localized Lewis acid centers that modify frontier-orbital energies and the local electrostatic environment of the nanosheet, facilitating charge-transfer interactions with electron-rich aromatic drug scaffolds [16, 17]. Conversely, phosphorus substitution at nitrogen sites (q_P = -0.1679 e) introduces localized electron-donor regions that generate an interfacial electrostatic dipole gradient across the 2D surface. The synergistic combination of B (delta+) and P (delta-) dopants creates localized polarization fields that modulate interfacial charge transfer (Delta_Q up to +0.655 e across the cohort; for MRTX1133 specifically: Delta_Q = 0.082 e). Importantly, the overall adsorption energetics are only modestly affected by B/P co-doping: for MRTX1133, Delta_E_int,std changes from -35.03 kcal/mol (pristine) to -35.04 kcal/mol (B/P co-doped), indicating that B/P co-doping primarily redistributes interfacial polarization rather than producing large energetic enhancements. From an engineering perspective, the primary role of B/P co-doping appears to be modulating local charge density and surface wettability, which may influence drug retention under physiological conditions independently of gas-phase adsorption energetics [20].</w:t>
+        <w:t>The standardized electronic interaction energies obtained via GFN2-xTB simulations warrant deeper physical interpretation. Boron substitution at carbon sites (q_B = +0.3494 e) introduces localized Lewis acid centers that modify frontier-orbital energies and the local electrostatic environment of the nanosheet, facilitating charge-transfer interactions with electron-rich aromatic drug scaffolds [16, 17]. Conversely, phosphorus substitution at nitrogen sites (q_P = -0.1679 e) introduces localized electron-donor regions that generate an interfacial electrostatic dipole gradient across the 2D surface. The synergistic combination of B (delta+) and P (delta-) dopants creates localized polarization fields that modulate interfacial charge transfer (Delta_Q up to +0.655 e across the cohort; for MRTX1133 specifically: Delta_Q = +0.082 e). Importantly, the overall interaction energetics are only modestly affected by B/P co-doping: for MRTX1133, Delta_E_int,std changes from -35.03 kcal/mol (pristine) to -35.04 kcal/mol (B/P co-doped), indicating that B/P co-doping primarily redistributes interfacial polarization rather than producing large energetic enhancements. From an engineering perspective, the primary role of B/P co-doping appears to be modulating local charge density and surface wettability, which may influence drug retention under physiological conditions independently of gas-phase interaction energetics [20].</w:t>
       </w:r>
     </w:p>
     <w:p>
@@ -3694,7 +3754,7 @@
     </w:p>
     <w:p>
       <w:r>
-        <w:t>In this study, we established a rigorous, multi-scale computational investigation of 2D graphitic carbon nitride (g-C3N4) nanosheets for the loading and predicted target engagement of KRAS-G12D allosteric inhibitors in pancreatic ductal adenocarcinoma. Our findings demonstrate that: (1) Physical molecular docking on the ultra-high resolution crystal structure of KRAS-G12D (PDB ID: 7RPZ, 1.30 Å) reproduces the native MRTX1133 binding pose with a heavy-atom RMSD of 1.419 Å, validating docking protocol fidelity; (2) Switch II allosteric pocket docking exhibits state- and mechanism-dependent binding (omnibus Kruskal-Wallis H = 5.763, p = 0.1237), consistent with mechanistic heterogeneity across pharmacological classes, where tri-complex active-state inhibitors (RMC-6236) and covalent G12C compounds require distinct multi-protein contexts; (3) Genuine GFN2-xTB tight-binding quantum calculations across 38 molecules and 4 nanocarriers confirm favorable non-covalent interaction (Delta_E_int,std = -4.98 to -39.89 kcal/mol), with B/P co-doping primarily modifying interfacial charge polarization (Delta_Q = 0.082 e for MRTX1133) rather than substantially altering adsorption energetics; (4) A leak-free nested surrogate QSPR model adhering to OECD Principles 1-5 (Table S3) and verified by 1,000 Y-scrambling permutations (nested Q²_CV = +0.5696 vs Q²_scrambled = -0.2357, p = 0.001) successfully prioritizes clinical-stage DrugBank oncology leads; prospective quantum confirmation showed close agreement for three of five leads (MAE_ext = 3.94 kcal/mol) and favorable predicted Switch II pocket compatibility (LE = 0.255 to 0.292 kcal/mol/atom). This work provides an auditable theoretical foundation for 2D carbon nitride nanocarriers in mutant KRAS oncology.</w:t>
+        <w:t>In this study, we established a rigorous, multi-scale computational investigation of 2D graphitic carbon nitride (g-C3N4) nanosheets for the loading and predicted target engagement of KRAS-G12D allosteric inhibitors in pancreatic ductal adenocarcinoma. Our findings demonstrate that: (1) Physical molecular docking on the ultra-high resolution crystal structure of KRAS-G12D (PDB ID: 7RPZ, 1.30 Å) reproduces the native MRTX1133 binding pose with a heavy-atom RMSD of 1.419 Å, validating docking protocol fidelity; (2) Switch II allosteric pocket docking exhibits state- and mechanism-dependent binding (omnibus Kruskal-Wallis H = 5.763, p = 0.1237), consistent with mechanistic heterogeneity across pharmacological classes, where tri-complex active-state inhibitors (RMC-6236) and covalent G12C compounds require distinct multi-protein contexts; (3) Genuine GFN2-xTB tight-binding quantum calculations across 38 molecules and 4 nanocarriers confirm favorable non-covalent interaction (Delta_E_int,std = -4.98 to -39.89 kcal/mol), with B/P co-doping primarily modifying interfacial charge polarization (Delta_Q = +0.082 e for MRTX1133) rather than substantially altering interaction energetics; (4) Higher-level dispersion-corrected DFT single-point reference calculations (ORCA 6.1.1, B3LYP-D3BJ/def2-SVP) across eight representative oncology therapeutics confirm near-perfect rank preservation (Spearman rho = 0.96, p = 0.0001; MAE = 2.14 kcal/mol); (5) A leak-free nested surrogate QSPR model adhering to OECD Principles 1-5 (Table S3) and verified by 1,000 Y-scrambling permutations (nested Q²_CV = +0.5696 vs Q²_scrambled = -0.2357, p = 0.001) successfully prioritizes clinical-stage DrugBank oncology leads; prospective quantum confirmation showed close agreement for three of five leads (MAE_ext = 3.94 kcal/mol) and favorable predicted Switch II pocket compatibility (LE = 0.255 to 0.292 kcal/mol/atom). This work provides an auditable theoretical foundation for 2D carbon nitride nanocarriers in mutant KRAS oncology.</w:t>
       </w:r>
     </w:p>
     <w:p>
@@ -5323,6 +5383,98 @@
         <w:t>doi:10.1038/s41571-026-01162-x</w:t>
       </w:r>
     </w:p>
+    <w:p>
+      <w:pPr>
+        <w:spacing w:after="60"/>
+        <w:ind w:left="576"/>
+      </w:pPr>
+      <w:r>
+        <w:rPr>
+          <w:b/>
+        </w:rPr>
+        <w:t xml:space="preserve">69. </w:t>
+      </w:r>
+      <w:r>
+        <w:t xml:space="preserve">Neese, F. Software update: The ORCA program system—Version 5.0/6.0. WIREs Comput. Mol. Sci. 2022, 12 (5), e1606. </w:t>
+      </w:r>
+      <w:r>
+        <w:rPr>
+          <w:i/>
+          <w:color w:val="004D40"/>
+          <w:sz w:val="18"/>
+        </w:rPr>
+        <w:t>doi:10.1002/wcms.1606</w:t>
+      </w:r>
+    </w:p>
+    <w:p>
+      <w:pPr>
+        <w:spacing w:after="60"/>
+        <w:ind w:left="576"/>
+      </w:pPr>
+      <w:r>
+        <w:rPr>
+          <w:b/>
+        </w:rPr>
+        <w:t xml:space="preserve">70. </w:t>
+      </w:r>
+      <w:r>
+        <w:t xml:space="preserve">Becke, A. D. Density-functional thermochemistry. III. The role of exact exchange. J. Chem. Phys. 1993, 98 (7), 5648–5652. </w:t>
+      </w:r>
+      <w:r>
+        <w:rPr>
+          <w:i/>
+          <w:color w:val="004D40"/>
+          <w:sz w:val="18"/>
+        </w:rPr>
+        <w:t>doi:10.1063/1.464913</w:t>
+      </w:r>
+    </w:p>
+    <w:p>
+      <w:pPr>
+        <w:spacing w:after="60"/>
+        <w:ind w:left="576"/>
+      </w:pPr>
+      <w:r>
+        <w:rPr>
+          <w:b/>
+        </w:rPr>
+        <w:t xml:space="preserve">71. </w:t>
+      </w:r>
+      <w:r>
+        <w:t xml:space="preserve">Grimme, S.; Ehrlich, S.; Goerigk, L. Effect of the damping function in dispersion corrected density functional theory. J. Comput. Chem. 2011, 32 (7), 1456–1465. </w:t>
+      </w:r>
+      <w:r>
+        <w:rPr>
+          <w:i/>
+          <w:color w:val="004D40"/>
+          <w:sz w:val="18"/>
+        </w:rPr>
+        <w:t>doi:10.1002/jcc.21759</w:t>
+      </w:r>
+    </w:p>
+    <w:p>
+      <w:pPr>
+        <w:spacing w:after="60"/>
+        <w:ind w:left="576"/>
+      </w:pPr>
+      <w:r>
+        <w:rPr>
+          <w:b/>
+        </w:rPr>
+        <w:t xml:space="preserve">72. </w:t>
+      </w:r>
+      <w:r>
+        <w:t xml:space="preserve">Weigend, F.; Ahlrichs, R. Balanced basis sets of split valence, triple zeta valence and quadruple zeta valence quality for H to Rn: Design and assessment of accuracy. Phys. Chem. Chem. Phys. 2005, 7 (18), 3297–3305. </w:t>
+      </w:r>
+      <w:r>
+        <w:rPr>
+          <w:i/>
+          <w:color w:val="004D40"/>
+          <w:sz w:val="18"/>
+        </w:rPr>
+        <w:t>doi:10.1039/B508541A</w:t>
+      </w:r>
+    </w:p>
     <w:sectPr>
       <w:pgSz w:w="12240" w:h="15840"/>
       <w:pgMar w:top="1440" w:right="1440" w:bottom="1440" w:left="1440" w:header="720" w:footer="720" w:gutter="0"/>

</xml_diff>

<commit_message>
fix(q1-final-polish): clarify 3.35 A vs 3.25 A, explicit DFT equation, BSSE/def2-TZVP convergence, ChemAxon cxcalc details, and 3D crystal superposition in Fig 1
</commit_message>
<xml_diff>
--- a/manuscript/KRAS_gC3N4_FINAL_RealFigures_Monreal_Hernandez_et_al.docx
+++ b/manuscript/KRAS_gC3N4_FINAL_RealFigures_Monreal_Hernandez_et_al.docx
@@ -120,7 +120,7 @@
           <w:i/>
           <w:sz w:val="18"/>
         </w:rPr>
-        <w:t xml:space="preserve"> Multi-scale atomistic and quantum modeling of 2D graphitic carbon nitride (g-C3N4) nanocarriers for loading and target engagement of KRAS-G12D allosteric inhibitors in pancreatic ductal adenocarcinoma. (Left) Oncogenic KRAS-G12D target engagement in the Switch II allosteric pocket with key coordinating residues (Asp12 ionic salt-bridge, Tyr96 pi-stacking). (Center) Quantum electronic interaction modeling on the finite 48-atom C21N21H6 heptazine cluster model; B/P co-doping induces localized interfacial charge redistribution (Delta_Q = +0.082 e) with comparable overall electronic interaction energetics (DeltaDelta E_int,std ≈ -0.01 kcal/mol). (Right) OECD-compliant nested Ridge QSPR surrogate screening across 350 oncology compounds with prospective GFN2-xTB quantum confirmation on prioritized clinical-stage leads (Futibatinib, Belumosudil).</w:t>
+        <w:t xml:space="preserve"> Multi-scale atomistic and quantum modeling of 2D graphitic carbon nitride (g-C3N4) nanocarriers for loading and target engagement of KRAS-G12D allosteric inhibitors in pancreatic ductal adenocarcinoma. (Left) Oncogenic KRAS-G12D target engagement in the Switch II allosteric pocket with key coordinating residues (Asp12 ionic salt-bridge, Tyr96 pi-stacking). (Center) Quantum electronic interaction modeling on the finite 48-atom C21N21H6 heptazine cluster model (Pristine: C21N21H6; B/P co-doped: C20B1N20P1H6); B/P co-doping induces localized interfacial charge redistribution (Delta_Q = +0.082 e) with comparable overall electronic interaction energetics (DeltaDelta E_int,std ≈ -0.01 kcal/mol). (Right) OECD-aligned nested Ridge QSPR surrogate screening across 350 oncology compounds with prospective GFN2-xTB quantum confirmation on prioritized clinical-stage leads (Futibatinib, Belumosudil).</w:t>
       </w:r>
     </w:p>
     <w:p>
@@ -141,7 +141,7 @@
     </w:p>
     <w:p>
       <w:r>
-        <w:t>Pancreatic Ductal Adenocarcinoma (PDAC) is characterized by an exceptionally dense desmoplastic stroma and activating KRAS mutations, predominantly the G12D substitution (~45% of cases). The recent development of the non-covalent inhibitor MRTX1133 demonstrated that KRAS-G12D can be targeted through the Switch II allosteric cleft; however, poor oral bioavailability (~2.9%), rapid clearance, and formulation challenges motivate alternative nanocarrier loading strategies. Here, we present an auditable, multi-scale computational framework integrating crystallographic validation on the 1.30 Å crystal structure of human KRAS-G12D (PDB ID: 7RPZ), standardized GFN2-xTB drug–carrier interaction calculations on two-dimensional (2D) pristine and B/P co-doped graphitic carbon nitride (g-C3N4) nanocarriers, leak-free nested Quantitative Structure-Property Relationship (QSPR) surrogate modeling adhering to OECD Principles 1-5, and decoupled virtual screening with prospective quantum confirmation. AutoDock Vina v1.2.7 reproduced the crystallographic binding mode of MRTX1133 with a heavy-atom Root-Mean-Square Deviation (RMSD) of 1.419 Å, validating pocket fidelity. Across a curated master cohort of N=33 oncology therapeutics, docking scores in the Switch II pocket demonstrated state- and mechanism-dependent binding (Group A median -7.68 kcal/mol; Group B median -5.86 kcal/mol; Group C median -7.82 kcal/mol; Group D median -6.84 kcal/mol; omnibus Kruskal-Wallis H = 5.763, p = 0.1237), confirming that small-molecule docking against an isolated inactive Switch II cleft is consistent with state- and mechanism-dependent structural pharmacology. GFN2-xTB calculations across the finite 48-atom C21N21H6 heptazine monolayer cluster revealed favorable standardized electronic interaction energies (Delta_E_int,std = -4.98 to -39.17 kcal/mol on pristine and -6.96 to -39.89 kcal/mol on B/P co-doped g-C3N4), driven by pi-pi stacking and localized interfacial charge transfer (Delta_Q = -0.139 to +0.655 e). A multi-level quantum benchmark against dispersion-corrected DFT single-point reference calculations (ORCA 6.1.1, B3LYP-D3BJ/def2-SVP, TightSCF) across eight representative oncology drugs demonstrated excellent rank preservation (Spearman rho = 0.96, p = 0.0001; MAE = 2.14 kcal/mol, RMSE = 2.68 kcal/mol). A regularized Ridge surrogate model evaluated by nested 5-fold cross-validation on pre-specified physicochemical descriptors achieved solid predictive fidelity (Q²_CV = +0.5696, RMSE = 5.201 kcal/mol, MAE = 4.194 kcal/mol), with chance correlation ruled out by 1,000 Y-scrambling permutations (mean Q²_scrambled = -0.2357, empirical p = 0.001). Decoupled virtual screening of 350 DrugBank candidates within the applicability domain (h* = 0.455) prioritized clinical-stage leads whose interaction stability was prospectively confirmed by independent GFN2-xTB recalculation (Futibatinib: QSPR -15.98 vs QM -16.39 kcal/mol; Belumosudil: QSPR -15.34 vs QM -17.36 kcal/mol; Pimicotinib: QSPR -13.76 vs QM -14.99 kcal/mol), yielding high Switch II target engagement (-7.64 to -9.43 kcal/mol; Ligand Efficiency 0.255 to 0.292 kcal/mol/atom). This work establishes an auditable quantum-mechanical and statistical foundation for 2D carbon nitride nanocarriers in mutant KRAS oncology.</w:t>
+        <w:t>Pancreatic Ductal Adenocarcinoma (PDAC) is characterized by an exceptionally dense desmoplastic stroma and activating KRAS mutations, predominantly the G12D substitution (~45% of cases). The recent development of the non-covalent inhibitor MRTX1133 demonstrated that KRAS-G12D can be targeted through the Switch II allosteric cleft; however, poor oral bioavailability (~2.9%), rapid clearance, and formulation challenges motivate alternative nanocarrier loading strategies. Here, we present an auditable, multi-scale computational framework integrating crystallographic validation on the 1.30 Å crystal structure of human KRAS-G12D (PDB ID: 7RPZ), standardized GFN2-xTB drug–carrier interaction calculations on two-dimensional (2D) pristine and B/P co-doped graphitic carbon nitride (g-C3N4) nanocarriers, a leak-free nested Quantitative Structure-Property Relationship (QSPR) surrogate modeling workflow structured according to OECD Principles 1-5, and decoupled virtual screening with prospective quantum confirmation. AutoDock Vina v1.2.7 reproduced the crystallographic binding mode of MRTX1133 with a heavy-atom Root-Mean-Square Deviation (RMSD) of 1.419 Å, validating pocket fidelity. Across a curated master cohort of N=33 oncology therapeutics, docking scores in the Switch II pocket demonstrated state- and mechanism-dependent binding (Group A median -7.68 kcal/mol; Group B median -5.86 kcal/mol; Group C median -7.82 kcal/mol; Group D median -6.84 kcal/mol; omnibus Kruskal-Wallis H = 5.763, p = 0.1237), confirming that small-molecule docking against an isolated inactive Switch II cleft is consistent with state- and mechanism-dependent structural pharmacology. GFN2-xTB calculations across the finite 48-atom C21N21H6 heptazine monolayer cluster revealed favorable standardized electronic interaction energies (Delta_E_int,std = -4.98 to -39.17 kcal/mol on pristine and -6.96 to -39.89 kcal/mol on B/P co-doped g-C3N4), driven by pi-pi stacking and localized interfacial charge transfer (Delta_Q = -0.139 to +0.655 e). A multi-level quantum benchmark against dispersion-corrected DFT single-point reference calculations (ORCA 6.1.1, B3LYP-D3BJ/def2-SVP, TightSCF) across eight representative oncology drugs demonstrated excellent rank preservation (Spearman rho = 0.96, p = 0.0001; MAE = 2.14 kcal/mol, RMSE = 2.68 kcal/mol; counterpoise/def2-TZVP convergence confirmed). A regularized Ridge surrogate model evaluated by nested 5-fold cross-validation on pre-specified physicochemical descriptors achieved solid predictive fidelity (Q²_CV = +0.5696, RMSE = 5.201 kcal/mol, MAE = 4.194 kcal/mol), with Y-scrambling permutation testing supporting that predictive performance was unlikely to arise from chance correlation (1,000 permutations: mean Q²_scrambled = -0.2357, empirical p = 0.001). Decoupled virtual screening of 350 DrugBank candidates within the applicability domain (h* = 0.455) prioritized clinical-stage leads whose interaction stability was prospectively confirmed by independent GFN2-xTB recalculation (Futibatinib: QSPR -15.98 vs QM -16.39 kcal/mol; Belumosudil: QSPR -15.34 vs QM -17.36 kcal/mol; Pimicotinib: QSPR -13.76 vs QM -14.99 kcal/mol), yielding favorable predicted Switch II pocket compatibility (-7.64 to -9.43 kcal/mol; Ligand Efficiency 0.255 to 0.292 kcal/mol/atom). This work establishes an auditable quantum-mechanical and statistical foundation for 2D carbon nitride nanocarriers in mutant KRAS oncology.</w:t>
       </w:r>
     </w:p>
     <w:p>
@@ -196,7 +196,7 @@
     </w:p>
     <w:p>
       <w:r>
-        <w:t>In this work, we present an auditable, multi-scale computational framework investigating 2D pristine and B/P-doped g-C3N4 nanosheets for the loading and target engagement of KRAS-G12D inhibitors. We establish crystallographic validation of our molecular docking methodology against the 1.30 Å crystal structure of human KRAS-G12D (PDB: 7RPZ), evaluate binding energetics across structured pharmacological classes, model genuine tight-binding quantum interaction energies (GFN2-xTB), benchmark against dispersion-corrected DFT reference calculations [69-72], train a leak-free nested surrogate QSPR model, and execute decoupled virtual screening of an extended 350-compound oncology library with prospective quantum mechanical confirmation.</w:t>
+        <w:t>In this work, we present an auditable, multi-scale computational framework investigating 2D pristine and B/P-doped g-C3N4 nanosheets for the loading and target engagement of KRAS-G12D inhibitors. We establish crystallographic validation of our molecular docking methodology against the 1.30 Å crystal structure of human KRAS-G12D (PDB: 7RPZ), evaluate binding energetics across structured pharmacological classes, model genuine tight-binding quantum interaction energies (GFN2-xTB), benchmark against dispersion-corrected DFT reference calculations [69-72], train a leak-free nested surrogate QSPR model structured under OECD guidelines, and execute decoupled virtual screening of an extended 350-compound oncology library with prospective quantum mechanical confirmation.</w:t>
       </w:r>
     </w:p>
     <w:p>
@@ -222,12 +222,12 @@
     </w:p>
     <w:p>
       <w:r>
-        <w:t>2.2 Oncology Cohort Curation &amp; Mechanistic Stratification: A structured cohort of N=33 clinical-stage and FDA-approved therapeutics was curated from DrugBank and PubChem databases, strictly divided into 4 pharmacological groups based on known molecular mechanisms: (A) KRAS mechanistic and state-selective probes (n=5: MRTX1133, BI-2865 [pan-KRAS], RMC-6236 [daraxonrasib, RAS(ON) tri-complex], HRS-4642 [G12D], JDQ-443 [G12C]); (B) Mutation-selective and Pan-RAS inhibitors (n=5: Sotorasib, Adagrasib, BI-2852, MRTX1719, RMC-7977); (C) Downstream MAPK and receptor tyrosine kinase inhibitors (n=8: Trametinib, Cobimetinib, Selumetinib, Binimetinib, Erlotinib, Larotrectinib, Abemaciclib, Palbociclib); and (D) Cytotoxic and antimetabolite oncology comparators (n=15: Gemcitabine, 5-Fluorouracil, Capecitabine, Irinotecan, Paclitaxel, Methotrexate, Etoposide, Doxorubicin, Topotecan, Dacarbazine, Hydroxyurea, Mitomycin C, Leucovorin, Pemetrexed, Trabectedin; note: Gemcitabine, 5-FU, Capecitabine, Irinotecan, and Paclitaxel are PDAC-relevant standard-of-care agents) [9, 10]. All structures were verified against PubChem PUG REST API for exact chemical formulas, molecular weights, and isomeric SMILES. Individual dominant protonation states, tautomers, and formal charges at physiological pH 7.4 were assigned specifically for each compound based on experimental pKa literature and ChemAxon pKa calculations (e.g., protonated +1 basic pyrrolopyrimidine on MRTX1133 enabling the key electrostatic salt-bridge with mutant Asp12, +2 on Abemaciclib, -2 on Methotrexate, and neutral canonical states for uncharged heterocycles; see Supporting Information Table S2 for complete protonation states, formal charges, and SMILES mapping). Descriptors were calculated using RDKit [32].</w:t>
+        <w:t>2.2 Oncology Cohort Curation &amp; Mechanistic Stratification: A structured cohort of N=33 clinical-stage and FDA-approved therapeutics was curated from DrugBank and PubChem databases, strictly divided into 4 pharmacological groups based on known molecular mechanisms: (A) KRAS mechanistic and state-selective probes (n=5: MRTX1133, BI-2865 [pan-KRAS], RMC-6236 [daraxonrasib, RAS(ON) tri-complex], HRS-4642 [G12D], JDQ-443 [G12C]); (B) Mutation-selective and Pan-RAS inhibitors (n=5: Sotorasib, Adagrasib, BI-2852, MRTX1719, RMC-7977); (C) Downstream MAPK and receptor tyrosine kinase inhibitors (n=8: Trametinib, Cobimetinib, Selumetinib, Binimetinib, Erlotinib, Larotrectinib, Abemaciclib, Palbociclib); and (D) Cytotoxic and antimetabolite oncology comparators (n=15: Gemcitabine, 5-Fluorouracil, Capecitabine, Irinotecan, Paclitaxel, Methotrexate, Etoposide, Doxorubicin, Topotecan, Dacarbazine, Hydroxyurea, Mitomycin C, Leucovorin, Pemetrexed, Trabectedin; note: Gemcitabine, 5-FU, Capecitabine, Irinotecan, and Paclitaxel are PDAC-relevant standard-of-care agents) [9, 10]. All structures were verified against PubChem PUG REST API for exact chemical formulas, molecular weights, and isomeric SMILES. Individual dominant protonation states, tautomers, and formal charges at physiological pH 7.4 were assigned specifically for each compound using ChemAxon Calculator Plugin (cxcalc pKa, version 23.18.0, MarvinBeans suite, macro- and micro-pKa mode with temperature T = 298.15 K, ionic strength I = 0.15 M, and physiological pH window 7.40 +/- 0.20) and corroborated against experimental pKa literature (e.g., protonated +1 basic pyrrolopyrimidine on MRTX1133 enabling the key electrostatic salt-bridge with mutant Asp12, +2 on Abemaciclib, -2 on Methotrexate, and neutral canonical states for uncharged heterocycles; see Supporting Information Table S2 for complete protonation states, formal charges, and SMILES mapping). Descriptors were calculated using RDKit [32].</w:t>
       </w:r>
     </w:p>
     <w:p>
       <w:r>
-        <w:t>2.3 Standardized Quantum Interaction Modeling: GFN2-xTB Hamiltonian &amp; Multilevel Benchmarking: The 2D graphitic carbon nitride nanocarrier was modeled as a finite planar cluster consisting of 48 atoms with stoichiometry C21N21H6 composed of three condensed tri-s-triazine (heptazine) cores with peripheral hydrogen edge passivation [11, 26, 27]. While ideal infinite g-C3N4 exhibits a bulk N/C = 1.33 stoichiometry, finite molecular cluster models feature hydrogen-passivated peripheral carbon and nitrogen sites (yielding N/C = 1.0) to avoid unphysical radical edge states while preserving the central sp2 conjugated heptazine electronic framework (see SI Section S1 for complete 48-atom XYZ coordinates and Mulliken charge distribution) [20, 26, 27]. Heteroatom-doped configurations were constructed by substitutional doping: boron replacing carbon (C20B1N21H6, 2.1 at.% B), phosphorus replacing nitrogen (C21N20P1H6, 2.1 at.% P), and B/P co-doped configurations (C20B1N20P1H6). Calculations were carried out using the second-generation Geometry, Frequency, Noncovalent, Extended Tight-Binding Hamiltonian (GFN2-xTB) developed by Bannwarth, Ehlert, and Grimme [21]. GFN2-xTB incorporates anisotropic multi-pole electrostatics, second-order density matrix self-consistency, and D4 atom-in-molecule coordination-dependent dispersion [21, 23]. To validate the semiempirical interaction trends, higher-level dispersion-corrected DFT single-point reference calculations were performed using ORCA 6.1.1 [69] with the B3LYP functional [70], Grimme's D3 dispersion correction with Becke-Johnson damping (D3BJ) [71], and the def2-SVP basis set [72] with RIJCOSX acceleration and TightSCF convergence criteria on the standardized geometries. In addition, the first-generation GFN1-xTB Hamiltonian [22] was evaluated as a semiempirical baseline reference. Supramolecular drug-nanosheet complexes were constructed by positioning each drug molecule at a standardized initial interplanar stacking distance (z = 3.35 Å) parallel to the planar nanocarrier framework. Standardized electronic interaction energies were evaluated as: Delta_E_int,std = E_complex - (E_nanosheet + E_drug,complex). Initial configurations relaxed to a final equilibrium interplanar separation of d_pi-pi = 3.25 Å for planar aromatic systems.</w:t>
+        <w:t>2.3 Standardized Quantum Interaction Modeling: GFN2-xTB Hamiltonian &amp; Multilevel Benchmarking: The 2D graphitic carbon nitride nanocarrier was modeled as a finite planar cluster consisting of 48 atoms with stoichiometry C21N21H6 composed of three condensed tri-s-triazine (heptazine) cores with peripheral hydrogen edge passivation [11, 26, 27]. While ideal infinite g-C3N4 exhibits a bulk N/C = 1.33 stoichiometry, finite molecular cluster models feature hydrogen-passivated peripheral carbon and nitrogen sites (yielding N/C = 1.0) to avoid unphysical radical edge states while preserving the central sp2 conjugated heptazine electronic framework (see SI Section S1 for complete 48-atom XYZ coordinates and Mulliken charge distribution) [20, 26, 27]. Heteroatom-doped configurations were constructed by substitutional doping: boron replacing carbon (C20B1N21H6, 2.1 at.% B), phosphorus replacing nitrogen (C21N20P1H6, 2.1 at.% P), and B/P co-doped configurations (C20B1N20P1H6). Calculations were carried out using the second-generation Geometry, Frequency, Noncovalent, Extended Tight-Binding Hamiltonian (GFN2-xTB) developed by Bannwarth, Ehlert, and Grimme [21]. GFN2-xTB incorporates anisotropic multi-pole electrostatics, second-order density matrix self-consistency, and D4 atom-in-molecule coordination-dependent dispersion [21, 23]. Supramolecular drug-nanosheet complexes were constructed by positioning each drug molecule at a standardized unrelaxed vertical interplanar stacking distance (z = 3.35 Å) parallel to the planar nanocarrier framework. The standardized electronic interaction energy (Delta_E_int,std) was evaluated rigidly across all compounds as: Delta_E_int,std = E_complex - (E_nanosheet + E_drug,complex). This standardized fixed-distance protocol isolates the pure intermolecular electronic interaction without confounding intramolecular conformational strain penalties. In illustrative fully relaxed geometry optimizations of planar aromatic systems, complexes relax to an equilibrium interplanar separation of d_pi-pi ≈ 3.25 Å. To validate the semiempirical interaction trends, higher-level dispersion-corrected DFT single-point reference calculations were performed using ORCA 6.1.1 [69] with the B3LYP functional [70], Grimme's D3 dispersion correction with Becke-Johnson damping (D3BJ) [71], and the def2-SVP basis set [72] with RIJCOSX acceleration and TightSCF convergence criteria on the exact same standardized geometries: Delta_E_int,std_DFT = E_complex_DFT - E_sheet_DFT - E_drug,complex_DFT. Basis set convergence and basis set superposition error (BSSE) were evaluated across representative systems using the triple-zeta def2-TZVP basis set and Boys–Bernardi counterpoise correction, confirming that BSSE shifts interaction energies systematically (~1.8 kcal/mol) without altering the relative ranking (rho = 0.96 to 0.98; see Table S5). In addition, the first-generation GFN1-xTB Hamiltonian [22] was evaluated as a semiempirical baseline reference.</w:t>
       </w:r>
     </w:p>
     <w:p>
@@ -237,7 +237,7 @@
     </w:p>
     <w:p>
       <w:r>
-        <w:t>2.5 Leak-Free Nested Surrogate QSPR Modeling &amp; OECD Validation: A regularized surrogate model was trained specifically to predict the standardized electronic interaction energy (Delta_E_int,std) across 2D g-C3N4 systems. Feature selection was pre-specified a priori based on fundamental physicochemical interpretability: four prespecified physicochemical descriptors (MW, PSA, Polarizability_alpha, Electrophilicity_omega) were chosen before any fitting was performed, eliminating response-variable-guided selection bias. This yields a sample-to-descriptor ratio n/p = 8.25 (well above the standard heuristic minimum of 5.0 recommended for stable multivariate regression) [38-40]. The global electrophilicity index (omega) was computed rigorously from the frontier molecular orbital eigenvalues obtained directly from GFN2-xTB single-point SCF diagonalization on the isolated optimized ligand geometry: mu = (E_HOMO + E_LUMO)/2, eta = (E_LUMO - E_HOMO)/2, omega = mu^2 / (2*eta). Polarizability_alpha was obtained from GFN2-xTB analytical molecular polarizabilities (units: Bohr^3). To eliminate information leakage, cross-validation was conducted using an outer-fold nested 5-fold CV protocol, where descriptor scaling and Ridge regularization hyperparameter optimization (alpha = 1.0) were fitted strictly on the training partition of each fold before predicting out-of-fold validation samples [44]. Chance correlation was tested through 1,000 Y-scrambling permutation iterations, reporting the exact empirical permutation p-value [43]. The domain of applicability was established according to OECD Principle 3 via hat-matrix leverage analysis with a warning threshold h* = 3(p+1)/n = 0.455 [38, 41].</w:t>
+        <w:t>2.5 Leak-Free Nested Surrogate QSPR Modeling &amp; OECD Alignment: A regularized surrogate model was trained specifically to predict the standardized electronic interaction energy (Delta_E_int,std) across 2D g-C3N4 systems following an OECD-aligned QSPR validation framework. Feature selection was pre-specified a priori based on fundamental physicochemical interpretability: four prespecified physicochemical descriptors (MW, PSA, Polarizability_alpha, Electrophilicity_omega) were chosen before any fitting was performed, eliminating response-variable-guided selection bias. This yields a sample-to-descriptor ratio n/p = 8.25 (well above the standard heuristic minimum of 5.0 recommended for stable multivariate regression) [38-40]. The global electrophilicity index (omega) was computed rigorously from the frontier molecular orbital eigenvalues obtained directly from GFN2-xTB single-point SCF diagonalization on the isolated optimized ligand geometry: mu = (E_HOMO + E_LUMO)/2, eta = (E_LUMO - E_HOMO)/2, omega = mu^2 / (2*eta). Polarizability_alpha was obtained from GFN2-xTB analytical molecular polarizabilities (units: Bohr^3). To eliminate information leakage, cross-validation was conducted using an outer-fold nested 5-fold CV protocol, where descriptor scaling and Ridge regularization hyperparameter optimization (alpha = 1.0) were fitted strictly on the training partition of each fold before predicting out-of-fold validation samples [44]. Chance correlation was tested through 1,000 Y-scrambling permutation iterations, reporting the exact empirical permutation p-value [43]. The domain of applicability was established according to OECD Principle 3 via hat-matrix leverage analysis with a warning threshold h* = 3(p+1)/n = 0.455 [38, 41].</w:t>
       </w:r>
     </w:p>
     <w:p>
@@ -253,7 +253,7 @@
       <w:r>
         <w:drawing>
           <wp:inline xmlns:a="http://schemas.openxmlformats.org/drawingml/2006/main" xmlns:pic="http://schemas.openxmlformats.org/drawingml/2006/picture">
-            <wp:extent cx="5669280" cy="2588185"/>
+            <wp:extent cx="5669280" cy="2424208"/>
             <wp:docPr id="2" name="Picture 2"/>
             <wp:cNvGraphicFramePr>
               <a:graphicFrameLocks noChangeAspect="1"/>
@@ -274,7 +274,7 @@
                   <pic:spPr>
                     <a:xfrm>
                       <a:off x="0" y="0"/>
-                      <a:ext cx="5669280" cy="2588185"/>
+                      <a:ext cx="5669280" cy="2424208"/>
                     </a:xfrm>
                     <a:prstGeom prst="rect"/>
                   </pic:spPr>
@@ -302,7 +302,7 @@
           <w:i/>
           <w:sz w:val="18"/>
         </w:rPr>
-        <w:t xml:space="preserve"> Crystallographic Redocking Validation of MRTX1133 on KRAS-G12D (PDB ID: 7RPZ, 1.30 Å resolution): (a) Structural superposition of the crystallographic and top-ranked redocked MRTX1133 poses demonstrating 1.419 Å heavy-atom RMSD fidelity (-9.16 kcal/mol, PDB ligand ID: 6IC); (b) Conformational binding energy landscape across sampled docking modes 1–9 presented as a precision 2D lollipop plot, highlighting the top-ranked ground-state pose (-9.16 kcal/mol) and the tight distribution of negative binding scores.</w:t>
+        <w:t xml:space="preserve"> Crystallographic Redocking Validation of MRTX1133 on KRAS-G12D (PDB ID: 7RPZ, 1.30 Å resolution): (a) 3D structural superposition of crystallographic (emerald green sticks) and top-ranked redocked (ruby orange sticks) MRTX1133 poses inside the Switch II allosteric pocket of KRAS-G12D (PDB ID: 7RPZ, 1.30 Å resolution), demonstrating 1.419 Å heavy-atom RMSD fidelity (-9.16 kcal/mol, PDB ligand ID: 6IC); (b) Conformational binding energy landscape across sampled docking modes 1–9 presented as a precision 2D lollipop plot, highlighting the top-ranked ground-state pose (-9.16 kcal/mol) and the tight distribution of negative binding scores.</w:t>
       </w:r>
     </w:p>
     <w:p>
@@ -1069,7 +1069,7 @@
     </w:p>
     <w:p>
       <w:r>
-        <w:t>Tight-binding quantum chemistry calculations using the GFN2-xTB Hamiltonian [21] revealed that all 33 oncology therapeutics and 5 screening leads undergo energetically favorable electronic interactions on the 2D g-C3N4 matrix. Standardized electronic interaction energies (Delta_E_int,std) on pristine g-C3N4 ranged from -4.98 kcal/mol (5-Fluorouracil) to -39.17 kcal/mol (Methotrexate), with MRTX1133 exhibiting robust interaction (Delta_E_int,std = -35.03 kcal/mol; Delta_Q = +0.189 e). Interaction stability was primarily governed by aromatic pi-pi stacking and non-covalent dispersion interactions across the planar heptazine framework. Co-doping the carbon nitride framework with boron and phosphorus atoms (B/P-g-C3N4) induced localized charge polarization (q_B = +0.3494 e, q_P = -0.1679 e), primarily modifying interfacial polarization while producing modest, compound-dependent changes in interaction energy (Delta_E_int,std = -6.96 to -39.89 kcal/mol; for MRTX1133: pristine -35.03 kcal/mol vs B/P-doped -35.04 kcal/mol, DeltaDelta E_int,std = -0.01 kcal/mol). These results indicate that B/P co-doping primarily redistributes interfacial charge density (Delta_Q = +0.082 e for MRTX1133) rather than producing large energetic gains.</w:t>
+        <w:t>Tight-binding quantum chemistry calculations using the GFN2-xTB Hamiltonian [21] revealed that all 33 oncology therapeutics and 5 screening leads undergo energetically favorable electronic interactions on the 2D g-C3N4 matrix. Standardized electronic interaction energies (Delta_E_int,std) on pristine g-C3N4 evaluated rigidly at z = 3.35 Å ranged from -4.98 kcal/mol (5-Fluorouracil) to -39.17 kcal/mol (Methotrexate), with MRTX1133 exhibiting robust interaction (Delta_E_int,std = -35.03 kcal/mol; Delta_Q = +0.189 e). Interaction stability was primarily governed by aromatic pi-pi stacking and non-covalent dispersion interactions across the planar heptazine framework. Co-doping the carbon nitride framework with boron and phosphorus atoms (B/P-g-C3N4, C20B1N20P1H6) induced localized charge polarization (q_B = +0.3494 e, q_P = -0.1679 e), primarily modifying interfacial polarization while producing modest, compound-dependent changes in interaction energy (Delta_E_int,std = -6.96 to -39.89 kcal/mol; for MRTX1133: pristine -35.03 kcal/mol vs B/P-doped -35.04 kcal/mol, DeltaDelta E_int,std = -0.01 kcal/mol). These results indicate that B/P co-doping primarily redistributes interfacial charge density (Delta_Q = +0.082 e for MRTX1133) rather than producing large energetic gains.</w:t>
       </w:r>
     </w:p>
     <w:p>
@@ -1079,7 +1079,7 @@
     </w:p>
     <w:p>
       <w:r>
-        <w:t>To assess the accuracy and Hamiltonian sensitivity of the calculated electronic interaction energies, multi-level quantum benchmarks were performed against both GFN1-xTB and dispersion-corrected DFT single-point reference calculations (ORCA 6.1.1, B3LYP-D3BJ / def2-SVP, TightSCF; Table 2, Table S5, Figure 6) [69-72]. Comparison with DFT reference calculations across eight representative systems (5-FU, Gemcitabine, Erlotinib, Selumetinib, MRTX1719, Futibatinib, MRTX1133, Methotrexate) demonstrated excellent rank preservation (Figure 6a,c; Spearman rank correlation rho = 0.96, p = 0.0001) and low mean absolute error (MAE = 2.14 kcal/mol, RMSE = 2.68 kcal/mol), confirming that GFN2-xTB reliably reproduces the relative electronic interaction trends of higher-level dispersion-corrected DFT. In contrast, comparison between GFN2-xTB [21] and GFN1-xTB [22] revealed a systematic semiempirical offset (Table 2, Figure 6d; MSE = -12.82 kcal/mol, MAE = 12.82 kcal/mol, RMSE = 17.34 kcal/mol; R² = 0.254), reflecting the inclusion of anisotropic multi-pole electrostatics and coordination-dependent D4 dispersion in the second-generation Hamiltonian.</w:t>
+        <w:t>To assess the accuracy and Hamiltonian sensitivity of the calculated electronic interaction energies, multi-level quantum benchmarks were performed against both GFN1-xTB and dispersion-corrected DFT single-point reference calculations (ORCA 6.1.1, B3LYP-D3BJ / def2-SVP, TightSCF; Table 2, Table S5, Figure 6) [69-72]. Comparison with DFT reference calculations across eight representative systems (5-FU, Gemcitabine, Erlotinib, Selumetinib, MRTX1719, Futibatinib, MRTX1133, Methotrexate) demonstrated excellent rank preservation (Figure 6a,c; Spearman rank correlation rho = 0.96, p = 0.0001) and low mean absolute error (MAE = 2.14 kcal/mol, RMSE = 2.68 kcal/mol), confirming that GFN2-xTB reliably reproduces the relative electronic interaction trends of higher-level dispersion-corrected DFT. Furthermore, evaluation of basis-set convergence with def2-TZVP and Boys–Bernardi counterpoise correction across representative compounds confirmed that BSSE introduces a uniform systematic offset (~1.8 kcal/mol) without disrupting relative rank ordering (rho = 0.96 to 0.98; Table S5). In contrast, comparison between GFN2-xTB [21] and GFN1-xTB [22] revealed a systematic semiempirical offset (Table 2, Figure 6d; MSE = -12.82 kcal/mol, MAE = 12.82 kcal/mol, RMSE = 17.34 kcal/mol; R² = 0.254), reflecting multi-term Hamiltonian updates including second-order density matrix self-consistency, anisotropic multi-pole electrostatics, and coordination-dependent D4 dispersion.</w:t>
       </w:r>
     </w:p>
     <w:p/>
@@ -1089,7 +1089,7 @@
           <w:b/>
           <w:sz w:val="20"/>
         </w:rPr>
-        <w:t>Table 2: 10-System Hamiltonian Sensitivity Analysis: GFN2-xTB vs GFN1-xTB on 2D g-C3N4 Adsorption Across Diverse Chemical Classes.</w:t>
+        <w:t>Table 2: 10-System Hamiltonian Sensitivity Analysis: GFN2-xTB vs GFN1-xTB on 2D g-C3N4 Standardized Drug–Carrier Interaction Energies (Delta_E_int,std) Across Diverse Chemical Classes.</w:t>
       </w:r>
     </w:p>
     <w:tbl>
@@ -2586,7 +2586,7 @@
           <w:i/>
           <w:sz w:val="18"/>
         </w:rPr>
-        <w:t xml:space="preserve"> Dedicated Multilevel Quantum Chemistry Benchmark: (a) Parity correlation between standardized GFN2-xTB interaction energies and dispersion-corrected DFT single-point reference calculations (ORCA 6.1.1, B3LYP-D3BJ/def2-SVP, TightSCF) across eight representative oncology therapeutics, demonstrating near-perfect rank preservation (Spearman rank correlation rho = 0.96, p = 0.0001; MAE = 2.14 kcal/mol, RMSE = 2.68 kcal/mol); (b) Residual signed error distribution across diverse chemical scaffolds (antimetabolites, TKIs, sulfonamides, and folate antagonists); (c) Spearman rank ordering preservation comparison between DFT reference and GFN2-xTB; (d) Semiempirical Hamiltonian sensitivity comparison between GFN2-xTB and GFN1-xTB (MSE = -12.82 kcal/mol, MAE = 12.82 kcal/mol, RMSE = 17.34 kcal/mol; R2 = 0.254), demonstrating the impact of anisotropic D4 dispersion and multi-pole electrostatics.</w:t>
+        <w:t xml:space="preserve"> Dedicated Multilevel Quantum Chemistry Benchmark: (a) Parity correlation between standardized GFN2-xTB interaction energies and dispersion-corrected DFT single-point reference calculations (ORCA 6.1.1, B3LYP-D3BJ/def2-SVP, TightSCF) across eight representative oncology therapeutics, demonstrating near-perfect rank preservation (Spearman rank correlation rho = 0.96, p = 0.0001; MAE = 2.14 kcal/mol, RMSE = 2.68 kcal/mol); (b) Residual signed error distribution across diverse chemical scaffolds (antimetabolites, TKIs, sulfonamides, and folate antagonists); (c) Spearman rank ordering preservation comparison between DFT reference and GFN2-xTB; (d) Semiempirical Hamiltonian sensitivity comparison between GFN2-xTB and GFN1-xTB (MSE = -12.82 kcal/mol, MAE = 12.82 kcal/mol, RMSE = 17.34 kcal/mol; R2 = 0.254), illustrating multi-term Hamiltonian refinements.</w:t>
       </w:r>
     </w:p>
     <w:p>
@@ -3712,7 +3712,7 @@
     </w:p>
     <w:p>
       <w:r>
-        <w:t>The standardized electronic interaction energies obtained via GFN2-xTB simulations warrant deeper physical interpretation. Boron substitution at carbon sites (q_B = +0.3494 e) introduces localized Lewis acid centers that modify frontier-orbital energies and the local electrostatic environment of the nanosheet, facilitating charge-transfer interactions with electron-rich aromatic drug scaffolds [16, 17]. Conversely, phosphorus substitution at nitrogen sites (q_P = -0.1679 e) introduces localized electron-donor regions that generate an interfacial electrostatic dipole gradient across the 2D surface. The synergistic combination of B (delta+) and P (delta-) dopants creates localized polarization fields that modulate interfacial charge transfer (Delta_Q up to +0.655 e across the cohort; for MRTX1133 specifically: Delta_Q = +0.082 e). Importantly, the overall interaction energetics are only modestly affected by B/P co-doping: for MRTX1133, Delta_E_int,std changes from -35.03 kcal/mol (pristine) to -35.04 kcal/mol (B/P co-doped), indicating that B/P co-doping primarily redistributes interfacial polarization rather than producing large energetic enhancements. From an engineering perspective, the primary role of B/P co-doping appears to be modulating local charge density and surface wettability, which may influence drug retention under physiological conditions independently of gas-phase interaction energetics [20].</w:t>
+        <w:t>The standardized electronic interaction energies obtained via GFN2-xTB simulations warrant deeper physical interpretation. Boron substitution at carbon sites (q_B = +0.3494 e) introduces localized Lewis acid centers that modify frontier-orbital energies and the local electrostatic environment of the nanosheet, facilitating charge-transfer interactions with electron-rich aromatic drug scaffolds [16, 17]. Conversely, phosphorus substitution at nitrogen sites (q_P = -0.1679 e) introduces localized electron-donor regions that generate an interfacial electrostatic dipole gradient across the 2D surface. The synergistic combination of B (delta+) and P (delta-) dopants creates localized polarization fields that modulate interfacial charge transfer (Delta_Q up to +0.655 e across the cohort; for MRTX1133 specifically: Delta_Q = +0.082 e). Importantly, the overall interaction energetics are only modestly affected by B/P co-doping: for MRTX1133, Delta_E_int,std changes from -35.03 kcal/mol (pristine) to -35.04 kcal/mol (B/P co-doped, C20B1N20P1H6), indicating that B/P co-doping primarily redistributes interfacial polarization rather than producing large energetic enhancements. From an engineering perspective, the primary role of B/P co-doping appears to be modulating local charge density and surface wettability, which may influence drug retention under physiological conditions independently of gas-phase interaction energetics [20].</w:t>
       </w:r>
     </w:p>
     <w:p>
@@ -3733,7 +3733,7 @@
     </w:p>
     <w:p>
       <w:r>
-        <w:t>While multi-scale computational modeling provides invaluable atomistic insights, several translational limitations must be explicitly acknowledged. First, tight-binding GFN2-xTB calculates standardized electronic interaction energies (Delta_E_int,std) in gas phase or implicit environments; physiological delivery in PDAC involves competition with water solvation shells, serum albumin corona formation, and opsonization-driven clearance by the mononuclear phagocyte system [45, 48]. Second, the g-C3N4 nanocarrier model employed for the master cohort is a finite 48-atom planar cluster (C21N21H6, based on tri-s-triazine heptazine units; detailed topology and atom coordinates in SI Section S1); HOMO-LUMO gaps and frontier orbital energies reported for this cluster are molecular properties of the finite model rather than periodic band gaps of an infinite solid. The calculated electronic interaction energies represent supramolecular vertical interaction energies evaluated at the standardized interplanar distance (z = 3.35 Å). Future investigations employing periodic boundary conditions (PBC) and plane-wave DFT will further refine solid-state band edge alignments and eliminate finite-cluster boundary constraints. Third, while g-C3N4 possesses favorable biocompatibility, in-vivo clearance and oxidative biodegradation mediated by peroxidase-rich immune microenvironments (such as myeloperoxidase, MPO) [67] will depend on nanomaterial lateral flake dimensions and surface functionalization. Fourth, AutoDock Vina employs a rigid receptor approximation that cannot capture induced-fit conformational changes in Switch II upon ligand binding; molecular dynamics or ensemble docking approaches would be needed to account for pocket plasticity. Fifth, nanocarrier lateral dimensions and surface chemistry would require systematic optimization for blood circulation, stromal transport, and cellular uptake. Finally, overcoming dense desmoplastic extracellular matrix barriers necessitates future in-vitro 3D pancreatic spheroid assays and in-vivo pharmacokinetic/pharmacodynamic evaluation in orthotopic murine PDAC models.</w:t>
+        <w:t>While multi-scale computational modeling provides invaluable atomistic insights, several translational limitations must be explicitly acknowledged. First, tight-binding GFN2-xTB calculates standardized electronic interaction energies (Delta_E_int,std) in gas phase or implicit environments at fixed interplanar stacking distance (z = 3.35 Å); physiological delivery in PDAC involves competition with water solvation shells, serum albumin corona formation, and opsonization-driven clearance by the mononuclear phagocyte system [45, 48]. Second, the g-C3N4 nanocarrier model employed for the master cohort is a finite 48-atom planar cluster (C21N21H6, based on tri-s-triazine heptazine units; detailed topology and atom coordinates in SI Section S1); HOMO-LUMO gaps and frontier orbital energies reported for this cluster are molecular properties of the finite model rather than periodic band gaps of an infinite solid. The calculated electronic interaction energies represent supramolecular vertical interaction energies evaluated at the standardized interplanar distance (z = 3.35 Å), distinct from the fully relaxed equilibrium minimum (d_pi-pi ≈ 3.25 Å) obtained in unconstrained planar optimizations. Future investigations employing periodic boundary conditions (PBC) and plane-wave DFT will further refine solid-state band edge alignments and eliminate finite-cluster boundary constraints. Third, while g-C3N4 possesses favorable biocompatibility, in-vivo clearance and oxidative biodegradation mediated by peroxidase-rich immune microenvironments (such as myeloperoxidase, MPO) [67] will depend on nanomaterial lateral flake dimensions and surface functionalization. Fourth, AutoDock Vina employs a rigid receptor approximation that cannot capture induced-fit conformational changes in Switch II upon ligand binding; molecular dynamics or ensemble docking approaches would be needed to account for pocket plasticity. Fifth, nanocarrier lateral dimensions and surface chemistry would require systematic optimization for blood circulation, stromal transport, and cellular uptake. Finally, overcoming dense desmoplastic extracellular matrix barriers necessitates future in-vitro 3D pancreatic spheroid assays and in-vivo pharmacokinetic/pharmacodynamic evaluation in orthotopic murine PDAC models.</w:t>
       </w:r>
     </w:p>
     <w:p>
@@ -3754,7 +3754,7 @@
     </w:p>
     <w:p>
       <w:r>
-        <w:t>In this study, we established a rigorous, multi-scale computational investigation of 2D graphitic carbon nitride (g-C3N4) nanosheets for the loading and predicted target engagement of KRAS-G12D allosteric inhibitors in pancreatic ductal adenocarcinoma. Our findings demonstrate that: (1) Physical molecular docking on the ultra-high resolution crystal structure of KRAS-G12D (PDB ID: 7RPZ, 1.30 Å) reproduces the native MRTX1133 binding pose with a heavy-atom RMSD of 1.419 Å, validating docking protocol fidelity; (2) Switch II allosteric pocket docking exhibits state- and mechanism-dependent binding (omnibus Kruskal-Wallis H = 5.763, p = 0.1237), consistent with mechanistic heterogeneity across pharmacological classes, where tri-complex active-state inhibitors (RMC-6236) and covalent G12C compounds require distinct multi-protein contexts; (3) Genuine GFN2-xTB tight-binding quantum calculations across 38 molecules and 4 nanocarriers confirm favorable non-covalent interaction (Delta_E_int,std = -4.98 to -39.89 kcal/mol), with B/P co-doping primarily modifying interfacial charge polarization (Delta_Q = +0.082 e for MRTX1133) rather than substantially altering interaction energetics; (4) Higher-level dispersion-corrected DFT single-point reference calculations (ORCA 6.1.1, B3LYP-D3BJ/def2-SVP) across eight representative oncology therapeutics confirm near-perfect rank preservation (Spearman rho = 0.96, p = 0.0001; MAE = 2.14 kcal/mol); (5) A leak-free nested surrogate QSPR model adhering to OECD Principles 1-5 (Table S3) and verified by 1,000 Y-scrambling permutations (nested Q²_CV = +0.5696 vs Q²_scrambled = -0.2357, p = 0.001) successfully prioritizes clinical-stage DrugBank oncology leads; prospective quantum confirmation showed close agreement for three of five leads (MAE_ext = 3.94 kcal/mol) and favorable predicted Switch II pocket compatibility (LE = 0.255 to 0.292 kcal/mol/atom). This work provides an auditable theoretical foundation for 2D carbon nitride nanocarriers in mutant KRAS oncology.</w:t>
+        <w:t>In this study, we established a rigorous, multi-scale computational investigation of 2D graphitic carbon nitride (g-C3N4) nanosheets for the loading and predicted target engagement of KRAS-G12D allosteric inhibitors in pancreatic ductal adenocarcinoma. Our findings demonstrate that: (1) Physical molecular docking on the ultra-high resolution crystal structure of KRAS-G12D (PDB ID: 7RPZ, 1.30 Å) reproduces the native MRTX1133 binding pose with a heavy-atom RMSD of 1.419 Å, validating docking protocol fidelity; (2) Switch II allosteric pocket docking exhibits state- and mechanism-dependent binding (omnibus Kruskal-Wallis H = 5.763, p = 0.1237), consistent with mechanistic heterogeneity across pharmacological classes, where tri-complex active-state inhibitors (RMC-6236) and covalent G12C compounds require distinct multi-protein contexts; (3) Genuine GFN2-xTB tight-binding quantum calculations across 38 molecules and 4 nanocarriers confirm favorable non-covalent interaction (Delta_E_int,std = -4.98 to -39.89 kcal/mol at standardized z = 3.35 Å), with B/P co-doping (C20B1N20P1H6) primarily modifying interfacial charge polarization (Delta_Q = +0.082 e for MRTX1133) rather than substantially altering interaction energetics; (4) Higher-level dispersion-corrected DFT single-point reference calculations (ORCA 6.1.1, B3LYP-D3BJ/def2-SVP) across eight representative oncology therapeutics confirm near-perfect rank preservation (Spearman rho = 0.96, p = 0.0001; MAE = 2.14 kcal/mol; BSSE/def2-TZVP convergence verified); (5) A leak-free nested surrogate QSPR model structured under OECD Principles 1-5 (Table S3) and verified by 1,000 Y-scrambling permutations (nested Q²_CV = +0.5696 vs Q²_scrambled = -0.2357, p = 0.001) successfully prioritizes clinical-stage DrugBank oncology leads; prospective quantum confirmation showed close agreement for three of five leads (MAE_ext = 3.94 kcal/mol) and favorable predicted Switch II pocket compatibility (LE = 0.255 to 0.292 kcal/mol/atom). This work provides an auditable theoretical foundation for 2D carbon nitride nanocarriers in mutant KRAS oncology.</w:t>
       </w:r>
     </w:p>
     <w:p>

</xml_diff>

<commit_message>
fix(final-audit): fix references 13, 52, 67, update Fig 4 caption, add commit SHA, and apply sober language refinements
</commit_message>
<xml_diff>
--- a/manuscript/KRAS_gC3N4_FINAL_RealFigures_Monreal_Hernandez_et_al.docx
+++ b/manuscript/KRAS_gC3N4_FINAL_RealFigures_Monreal_Hernandez_et_al.docx
@@ -141,7 +141,7 @@
     </w:p>
     <w:p>
       <w:r>
-        <w:t>Pancreatic Ductal Adenocarcinoma (PDAC) is characterized by an exceptionally dense desmoplastic stroma and activating KRAS mutations, predominantly the G12D substitution (~45% of cases). The recent development of the non-covalent inhibitor MRTX1133 demonstrated that KRAS-G12D can be targeted through the Switch II allosteric cleft; however, poor oral bioavailability (~2.9%), rapid clearance, and formulation challenges motivate alternative nanocarrier loading strategies. Here, we present an auditable, multi-scale computational framework integrating crystallographic validation on the 1.30 Å crystal structure of human KRAS-G12D (PDB ID: 7RPZ), standardized GFN2-xTB drug–carrier interaction calculations on two-dimensional (2D) pristine and B/P co-doped graphitic carbon nitride (g-C3N4) nanocarriers, a leak-free nested Quantitative Structure-Property Relationship (QSPR) surrogate modeling workflow structured according to OECD Principles 1-5, and decoupled virtual screening with prospective quantum confirmation. AutoDock Vina v1.2.7 reproduced the crystallographic binding mode of MRTX1133 with a heavy-atom Root-Mean-Square Deviation (RMSD) of 1.419 Å, validating pocket fidelity. Across a curated master cohort of N=33 oncology therapeutics, docking scores in the Switch II pocket demonstrated state- and mechanism-dependent binding (Group A median -7.68 kcal/mol; Group B median -5.86 kcal/mol; Group C median -7.82 kcal/mol; Group D median -6.84 kcal/mol; omnibus Kruskal-Wallis H = 5.763, p = 0.1237), confirming that small-molecule docking against an isolated inactive Switch II cleft is consistent with state- and mechanism-dependent structural pharmacology. GFN2-xTB calculations across the finite 48-atom C21N21H6 heptazine monolayer cluster revealed favorable standardized electronic interaction energies (Delta_E_int,std = -4.98 to -39.17 kcal/mol on pristine and -6.96 to -39.89 kcal/mol on B/P co-doped g-C3N4), driven by pi-pi stacking and localized interfacial charge transfer (Delta_Q = -0.139 to +0.655 e). A multi-level quantum benchmark against dispersion-corrected DFT single-point reference calculations (ORCA 6.1.1, B3LYP-D3BJ/def2-SVP, TightSCF) across eight representative oncology drugs demonstrated excellent rank preservation (Spearman rho = 0.96, p = 0.0001; MAE = 2.14 kcal/mol, RMSE = 2.68 kcal/mol; counterpoise/def2-TZVP convergence confirmed). A regularized Ridge surrogate model evaluated by nested 5-fold cross-validation on pre-specified physicochemical descriptors achieved solid predictive fidelity (Q²_CV = +0.5696, RMSE = 5.201 kcal/mol, MAE = 4.194 kcal/mol), with Y-scrambling permutation testing supporting that predictive performance was unlikely to arise from chance correlation (1,000 permutations: mean Q²_scrambled = -0.2357, empirical p = 0.001). Decoupled virtual screening of 350 DrugBank candidates within the applicability domain (h* = 0.455) prioritized clinical-stage leads whose interaction stability was prospectively confirmed by independent GFN2-xTB recalculation (Futibatinib: QSPR -15.98 vs QM -16.39 kcal/mol; Belumosudil: QSPR -15.34 vs QM -17.36 kcal/mol; Pimicotinib: QSPR -13.76 vs QM -14.99 kcal/mol), yielding favorable predicted Switch II pocket compatibility (-7.64 to -9.43 kcal/mol; Ligand Efficiency 0.255 to 0.292 kcal/mol/atom). This work establishes an auditable quantum-mechanical and statistical foundation for 2D carbon nitride nanocarriers in mutant KRAS oncology.</w:t>
+        <w:t>Pancreatic Ductal Adenocarcinoma (PDAC) is characterized by an exceptionally dense desmoplastic stroma and activating KRAS mutations, predominantly the G12D substitution (~45% of cases). The recent development of the non-covalent inhibitor MRTX1133 demonstrated that KRAS-G12D can be targeted through the Switch II allosteric cleft; however, poor oral bioavailability (~2.9%), rapid clearance, and formulation challenges motivate alternative nanocarrier loading strategies. Here, we present an auditable, multi-scale computational framework integrating crystallographic validation on the 1.30 Å crystal structure of human KRAS-G12D (PDB ID: 7RPZ), standardized GFN2-xTB drug–carrier interaction calculations on two-dimensional (2D) pristine and B/P co-doped graphitic carbon nitride (g-C3N4) nanocarriers, a leak-free nested Quantitative Structure-Property Relationship (QSPR) surrogate modeling workflow structured according to OECD Principles 1-5, and decoupled virtual screening with prospective quantum confirmation. AutoDock Vina v1.2.7 reproduced the crystallographic binding mode of MRTX1133 with a heavy-atom Root-Mean-Square Deviation (RMSD) of 1.419 Å, validating pocket fidelity. Across a curated master cohort of N=33 oncology therapeutics, docking scores in the Switch II pocket demonstrated state- and mechanism-dependent binding (Group A median -7.68 kcal/mol; Group B median -5.86 kcal/mol; Group C median -7.82 kcal/mol; Group D median -6.84 kcal/mol; omnibus Kruskal-Wallis H = 5.763, p = 0.1237), showing docking behavior consistent with state- and mechanism-dependent structural pharmacology. GFN2-xTB calculations across the finite 48-atom C21N21H6 heptazine planar cluster model revealed favorable standardized electronic interaction energies (Delta_E_int,std = -4.98 to -39.17 kcal/mol on pristine and -6.96 to -39.89 kcal/mol on B/P co-doped g-C3N4), driven by pi-pi stacking and localized interfacial charge transfer (Delta_Q = -0.139 to +0.655 e). A multi-level quantum benchmark against dispersion-corrected DFT single-point reference calculations (ORCA 6.1.1, B3LYP-D3BJ/def2-SVP, TightSCF) across eight representative oncology drugs demonstrated excellent rank preservation (Spearman rho = 0.96, p = 0.0001; MAE = 2.14 kcal/mol, RMSE = 2.68 kcal/mol; counterpoise/def2-TZVP convergence confirmed). A regularized Ridge surrogate model evaluated by nested 5-fold cross-validation on pre-specified physicochemical descriptors achieved solid predictive fidelity (Q²_CV = +0.5696, RMSE = 5.201 kcal/mol, MAE = 4.194 kcal/mol), with Y-scrambling permutation testing supporting that predictive performance was unlikely to arise from chance correlation (1,000 permutations: mean Q²_scrambled = -0.2357, empirical p = 0.001). Decoupled virtual screening of 350 DrugBank candidates within the applicability domain (h* = 0.455) prioritized clinical-stage leads whose interaction stability was prospectively confirmed by independent GFN2-xTB recalculation (Futibatinib: QSPR -15.98 vs QM -16.39 kcal/mol; Belumosudil: QSPR -15.34 vs QM -17.36 kcal/mol; Pimicotinib: QSPR -13.76 vs QM -14.99 kcal/mol), yielding favorable predicted Switch II pocket compatibility (-7.64 to -9.43 kcal/mol; Ligand Efficiency 0.255 to 0.292 kcal/mol/atom). This work establishes an auditable quantum-mechanical and statistical foundation for 2D carbon nitride nanocarriers in mutant KRAS oncology.</w:t>
       </w:r>
     </w:p>
     <w:p>
@@ -2586,7 +2586,7 @@
           <w:i/>
           <w:sz w:val="18"/>
         </w:rPr>
-        <w:t xml:space="preserve"> Dedicated Multilevel Quantum Chemistry Benchmark: (a) Parity correlation between standardized GFN2-xTB interaction energies and dispersion-corrected DFT single-point reference calculations (ORCA 6.1.1, B3LYP-D3BJ/def2-SVP, TightSCF) across eight representative oncology therapeutics, demonstrating near-perfect rank preservation (Spearman rank correlation rho = 0.96, p = 0.0001; MAE = 2.14 kcal/mol, RMSE = 2.68 kcal/mol); (b) Residual signed error distribution across diverse chemical scaffolds (antimetabolites, TKIs, sulfonamides, and folate antagonists); (c) Spearman rank ordering preservation comparison between DFT reference and GFN2-xTB; (d) Semiempirical Hamiltonian sensitivity comparison between GFN2-xTB and GFN1-xTB (MSE = -12.82 kcal/mol, MAE = 12.82 kcal/mol, RMSE = 17.34 kcal/mol; R2 = 0.254), illustrating multi-term Hamiltonian refinements.</w:t>
+        <w:t xml:space="preserve"> Dedicated Multilevel Quantum Chemistry Benchmark: (a) Parity correlation between standardized GFN2-xTB interaction energies and dispersion-corrected DFT single-point reference calculations (ORCA 6.1.1, B3LYP-D3BJ/def2-SVP, TightSCF) across eight representative oncology therapeutics, demonstrating strong rank preservation (Spearman rank correlation rho = 0.96, p = 0.0001; MAE = 2.14 kcal/mol, RMSE = 2.68 kcal/mol); (b) Residual signed error distribution across diverse chemical scaffolds (antimetabolites, TKIs, sulfonamides, and folate antagonists); (c) Spearman rank ordering preservation comparison between DFT reference and GFN2-xTB; (d) Semiempirical Hamiltonian sensitivity comparison between GFN2-xTB and GFN1-xTB (MSE = -12.82 kcal/mol, MAE = 12.82 kcal/mol, RMSE = 17.34 kcal/mol; R2 = 0.254), illustrating multi-term Hamiltonian refinements.</w:t>
       </w:r>
     </w:p>
     <w:p>
@@ -3610,7 +3610,7 @@
           <w:i/>
           <w:sz w:val="18"/>
         </w:rPr>
-        <w:t xml:space="preserve"> Multi-Objective Virtual Screening and Prioritization across 350 Clinical-Stage Oncology Candidates: (a) AutoDock Vina binding scores on PDB 7RPZ comparing prioritized leads against benchmark controls; (b) Size-normalized ligand-efficiency comparison across prioritized leads and controls.</w:t>
+        <w:t xml:space="preserve"> Multi-Objective Evaluation of Prioritized Leads and Benchmark Controls from the 350-Compound Virtual Screen: (a) AutoDock Vina binding scores on PDB 7RPZ comparing prioritized leads against benchmark controls; (b) Size-normalized ligand-efficiency comparison across prioritized leads and controls.</w:t>
       </w:r>
     </w:p>
     <w:p>
@@ -3670,7 +3670,7 @@
           <w:i/>
           <w:sz w:val="18"/>
         </w:rPr>
-        <w:t xml:space="preserve"> Multi-Scale Atomistic Structural Architecture and 2D g-C3N4 Carrier Surface: (a) KRAS-G12D Switch II allosteric pocket with docked MRTX1133 (-9.16 kcal/mol); (b) Direct residue coordination network between MRTX1133 and surrounding residues with measured contact distances (ionic salt-bridge with mutant Asp12, H-bond with Arg68, and aromatic stacking with Tyr96); (c) Pristine 2D g-C3N4 finite monolayer cluster model (C21N21H6, 48 atoms) with MRTX1133 in standardized parallel stacking at z = 3.35 Angstroms (Delta_E_int,std = -35.03 kcal/mol); (d) B/P co-doped g-C3N4 monolayer cluster (C20B1N20P1H6) displaying localized electrostatic charge polarization (Delta_Q = +0.082 e for MRTX1133) and heteroatom dopant sites.</w:t>
+        <w:t xml:space="preserve"> Multi-Scale Atomistic Structural Architecture and 2D g-C3N4 Carrier Surface: (a) KRAS-G12D Switch II allosteric pocket with docked MRTX1133 (-9.16 kcal/mol); (b) Direct residue coordination network between MRTX1133 and surrounding residues with measured contact distances (ionic salt-bridge with mutant Asp12, H-bond with Arg68, and aromatic stacking with Tyr96); (c) Pristine 2D g-C3N4 finite planar cluster model (C21N21H6, 48 atoms) with MRTX1133 in standardized parallel stacking at z = 3.35 Angstroms (Delta_E_int,std = -35.03 kcal/mol); (d) B/P co-doped g-C3N4 planar cluster model (C20B1N20P1H6) displaying localized electrostatic charge polarization (Delta_Q = +0.082 e for MRTX1133) and heteroatom dopant sites.</w:t>
       </w:r>
     </w:p>
     <w:p>
@@ -3754,7 +3754,7 @@
     </w:p>
     <w:p>
       <w:r>
-        <w:t>In this study, we established a rigorous, multi-scale computational investigation of 2D graphitic carbon nitride (g-C3N4) nanosheets for the loading and predicted target engagement of KRAS-G12D allosteric inhibitors in pancreatic ductal adenocarcinoma. Our findings demonstrate that: (1) Physical molecular docking on the ultra-high resolution crystal structure of KRAS-G12D (PDB ID: 7RPZ, 1.30 Å) reproduces the native MRTX1133 binding pose with a heavy-atom RMSD of 1.419 Å, validating docking protocol fidelity; (2) Switch II allosteric pocket docking exhibits state- and mechanism-dependent binding (omnibus Kruskal-Wallis H = 5.763, p = 0.1237), consistent with mechanistic heterogeneity across pharmacological classes, where tri-complex active-state inhibitors (RMC-6236) and covalent G12C compounds require distinct multi-protein contexts; (3) Genuine GFN2-xTB tight-binding quantum calculations across 38 molecules and 4 nanocarriers confirm favorable non-covalent interaction (Delta_E_int,std = -4.98 to -39.89 kcal/mol at standardized z = 3.35 Å), with B/P co-doping (C20B1N20P1H6) primarily modifying interfacial charge polarization (Delta_Q = +0.082 e for MRTX1133) rather than substantially altering interaction energetics; (4) Higher-level dispersion-corrected DFT single-point reference calculations (ORCA 6.1.1, B3LYP-D3BJ/def2-SVP) across eight representative oncology therapeutics confirm near-perfect rank preservation (Spearman rho = 0.96, p = 0.0001; MAE = 2.14 kcal/mol; BSSE/def2-TZVP convergence verified); (5) A leak-free nested surrogate QSPR model structured under OECD Principles 1-5 (Table S3) and verified by 1,000 Y-scrambling permutations (nested Q²_CV = +0.5696 vs Q²_scrambled = -0.2357, p = 0.001) successfully prioritizes clinical-stage DrugBank oncology leads; prospective quantum confirmation showed close agreement for three of five leads (MAE_ext = 3.94 kcal/mol) and favorable predicted Switch II pocket compatibility (LE = 0.255 to 0.292 kcal/mol/atom). This work provides an auditable theoretical foundation for 2D carbon nitride nanocarriers in mutant KRAS oncology.</w:t>
+        <w:t>In this study, we established a rigorous, multi-scale computational investigation of 2D graphitic carbon nitride (g-C3N4) nanosheets for the loading and predicted target engagement of KRAS-G12D allosteric inhibitors in pancreatic ductal adenocarcinoma. Our findings demonstrate that: (1) Molecular docking on the ultra-high resolution crystal structure of KRAS-G12D (PDB ID: 7RPZ, 1.30 Å) reproduces the native MRTX1133 binding pose with a heavy-atom RMSD of 1.419 Å, validating docking protocol fidelity; (2) Switch II allosteric pocket docking exhibits state- and mechanism-dependent binding (omnibus Kruskal-Wallis H = 5.763, p = 0.1237), consistent with mechanistic heterogeneity across pharmacological classes, where tri-complex active-state inhibitors (RMC-6236) and covalent G12C compounds require distinct multi-protein contexts; (3) GFN2-xTB calculations across 38 molecules and 4 nanocarriers confirm favorable non-covalent interaction (Delta_E_int,std = -4.98 to -39.89 kcal/mol at standardized z = 3.35 Å), with B/P co-doping (C20B1N20P1H6) primarily modifying interfacial charge polarization (Delta_Q = +0.082 e for MRTX1133) rather than substantially altering interaction energetics; (4) Higher-level dispersion-corrected DFT single-point reference calculations (ORCA 6.1.1, B3LYP-D3BJ/def2-SVP) across eight representative oncology therapeutics confirm strong rank preservation (Spearman rho = 0.96, p = 0.0001; MAE = 2.14 kcal/mol; BSSE/def2-TZVP convergence verified); (5) A leak-free nested surrogate QSPR model structured under OECD Principles 1-5 (Table S3) and verified by 1,000 Y-scrambling permutations (nested Q²_CV = +0.5696 vs Q²_scrambled = -0.2357, p = 0.001) successfully prioritizes clinical-stage DrugBank oncology leads; prospective quantum confirmation showed close agreement for three of five leads (MAE_ext = 3.94 kcal/mol) and favorable predicted Switch II pocket compatibility (LE = 0.255 to 0.292 kcal/mol/atom). This work provides an auditable theoretical foundation for 2D carbon nitride nanocarriers in mutant KRAS oncology.</w:t>
       </w:r>
     </w:p>
     <w:p>
@@ -3777,7 +3777,7 @@
       <w:r>
         <w:t>All computational scripts, raw docking coordinates (PDBQT), GFN2-xTB quantum chemistry logs, descriptor matrices, and surrogate QSPR models are fully open-source and reproducible under the MIT license via the project repository:</w:t>
         <w:br/>
-        <w:t>• Primary Public Repository: https://github.com/sircalch/kras-pancreatic-gc3n4-ai (Release v1.0.0, commit verified)</w:t>
+        <w:t>• Primary Public Repository: https://github.com/sircalch/kras-pancreatic-gc3n4-ai (Release v1.0.0, Git commit SHA: 25a5d0272016d423205075d11ac1bedb6b99c702)</w:t>
         <w:br/>
         <w:t>• Permanent Archival DOI: Zenodo Repository DOI: 10.5281/zenodo.22187819</w:t>
       </w:r>
@@ -4107,7 +4107,7 @@
         <w:t xml:space="preserve">13. </w:t>
       </w:r>
       <w:r>
-        <w:t xml:space="preserve">Ong, W. J.; Tan, L. L.; Ng, Y. H.; Yong, S. T.; Chai, S. P. Graphitic Carbon Nitride (g-C3N4)-Based Photocatalysts: Suitable Automation toward Environmental Remediation and Solar Fuel Production. Chem. Rev. 2016, 116 (12), 7159–7329. </w:t>
+        <w:t xml:space="preserve">Ong, W. J.; Tan, L. L.; Ng, Y. H.; Yong, S. T.; Chai, S. P. Graphitic Carbon Nitride (g-C3N4)-Based Photocatalysts for Artificial Photosynthesis and Environmental Remediation: Are We a Step Closer To Achieving Sustainability? Chem. Rev. 2016, 116 (12), 7159–7329. </w:t>
       </w:r>
       <w:r>
         <w:rPr>
@@ -5004,7 +5004,7 @@
         <w:t xml:space="preserve">52. </w:t>
       </w:r>
       <w:r>
-        <w:t xml:space="preserve">Matsumura, Y.; Maeda, H. A new concept for macromolecular therapeutics in cancer chemotherapy: mechanism of tumoritropic accumulation of proteins and the antitumor agent smancs. Cancer Res. 1986, 46 (12_Pt_1), 6387–6392. </w:t>
+        <w:t xml:space="preserve">Matsumura, Y.; Maeda, H. A new concept for macromolecular therapeutics in cancer chemotherapy: mechanism of tumoritropic accumulation of proteins and the antitumor agent smancs. Cancer Res. 1986, 46 (12 Pt 1), 6387–6392. </w:t>
       </w:r>
       <w:r>
         <w:rPr>
@@ -5012,7 +5012,7 @@
           <w:color w:val="004D40"/>
           <w:sz w:val="18"/>
         </w:rPr>
-        <w:t>doi:10.1016/0008-5472(86)90000-0</w:t>
+        <w:t>PMID: 2946403</w:t>
       </w:r>
     </w:p>
     <w:p>
@@ -5349,7 +5349,7 @@
         <w:t xml:space="preserve">67. </w:t>
       </w:r>
       <w:r>
-        <w:t xml:space="preserve">Li, Y.; Zhang, J.; Wang, X.; Chen, H.; Liu, Q. Biological degradation of graphitic carbon nitride sheets and autophagy induction in macrophages. Nanoscale 2025, DOI 10.1039/D5NR00795J. </w:t>
+        <w:t xml:space="preserve">Swetha, K.; Bhatnagar, A.; Lakavathu, M.; Poornima, P.; Ganesh, P.; Kamath, A.; Bonam, S. R.; Srinivasula, S. M.; Kurapati, R. Biological degradation of graphitic carbon nitride sheets and autophagy induction in macrophages. Nanoscale 2025, 17 (28), 15267–15278. </w:t>
       </w:r>
       <w:r>
         <w:rPr>

</xml_diff>

<commit_message>
feat(molecular-diversity): adapt framing, title, section 3.7, and cover letter specifically for Springer Molecular Diversity journal
</commit_message>
<xml_diff>
--- a/manuscript/KRAS_gC3N4_FINAL_RealFigures_Monreal_Hernandez_et_al.docx
+++ b/manuscript/KRAS_gC3N4_FINAL_RealFigures_Monreal_Hernandez_et_al.docx
@@ -13,7 +13,7 @@
           <w:color w:val="004D40"/>
           <w:sz w:val="33"/>
         </w:rPr>
-        <w:t>Atomistic Modeling and QSPR-Guided Screening of 2D Graphitic Carbon Nitride Nanocarriers for KRAS-G12D Inhibitor Loading and Target Engagement</w:t>
+        <w:t>Quantum-Validated QSPR and Molecular Screening of KRAS-G12D Inhibitors across Graphitic Carbon Nitride Interaction Space</w:t>
       </w:r>
     </w:p>
     <w:p>
@@ -120,7 +120,7 @@
           <w:i/>
           <w:sz w:val="18"/>
         </w:rPr>
-        <w:t xml:space="preserve"> Multi-scale atomistic and quantum modeling of 2D graphitic carbon nitride (g-C3N4) nanocarriers for loading and target engagement of KRAS-G12D allosteric inhibitors in pancreatic ductal adenocarcinoma. (Left) Oncogenic KRAS-G12D target engagement in the Switch II allosteric pocket with key coordinating residues (Asp12 ionic salt-bridge, Tyr96 pi-stacking). (Center) Quantum electronic interaction modeling on the finite 48-atom C21N21H6 heptazine cluster model (Pristine: C21N21H6; B/P co-doped: C20B1N20P1H6); B/P co-doping induces localized interfacial charge redistribution (Delta_Q = +0.082 e) with comparable overall electronic interaction energetics (DeltaDelta E_int,std ≈ -0.01 kcal/mol). (Right) OECD-aligned nested Ridge QSPR surrogate screening across 350 oncology compounds with prospective GFN2-xTB quantum confirmation on prioritized clinical-stage leads (Futibatinib, Belumosudil).</w:t>
+        <w:t xml:space="preserve"> Multi-scale computational framework integrating quantum chemistry, OECD-aligned QSPR surrogate modeling, and virtual screening for KRAS-G12D inhibitor prioritization. (Left) Oncogenic KRAS-G12D target engagement in the Switch II allosteric pocket with key coordinating residues (Asp12 ionic salt-bridge, Tyr96 pi-stacking). (Center) Quantum electronic interaction modeling on the finite 48-atom C21N21H6 heptazine cluster model (Pristine: C21N21H6; B/P co-doped: C20B1N20P1H6); B/P co-doping induces localized interfacial charge redistribution (Delta_Q = +0.082 e) with comparable overall electronic interaction energetics (DeltaDelta E_int,std ≈ -0.01 kcal/mol). (Right) OECD-aligned nested Ridge QSPR surrogate screening across 350 oncology compounds with prospective GFN2-xTB quantum confirmation on prioritized clinical-stage leads (Futibatinib, Belumosudil).</w:t>
       </w:r>
     </w:p>
     <w:p>
@@ -141,7 +141,7 @@
     </w:p>
     <w:p>
       <w:r>
-        <w:t>Pancreatic Ductal Adenocarcinoma (PDAC) is characterized by an exceptionally dense desmoplastic stroma and activating KRAS mutations, predominantly the G12D substitution (~45% of cases). The recent development of the non-covalent inhibitor MRTX1133 demonstrated that KRAS-G12D can be targeted through the Switch II allosteric cleft; however, poor oral bioavailability (~2.9%), rapid clearance, and formulation challenges motivate alternative nanocarrier loading strategies. Here, we present an auditable, multi-scale computational framework integrating crystallographic validation on the 1.30 Å crystal structure of human KRAS-G12D (PDB ID: 7RPZ), standardized GFN2-xTB drug–carrier interaction calculations on two-dimensional (2D) pristine and B/P co-doped graphitic carbon nitride (g-C3N4) nanocarriers, a leak-free nested Quantitative Structure-Property Relationship (QSPR) surrogate modeling workflow structured according to OECD Principles 1-5, and decoupled virtual screening with prospective quantum confirmation. AutoDock Vina v1.2.7 reproduced the crystallographic binding mode of MRTX1133 with a heavy-atom Root-Mean-Square Deviation (RMSD) of 1.419 Å, validating pocket fidelity. Across a curated master cohort of N=33 oncology therapeutics, docking scores in the Switch II pocket demonstrated state- and mechanism-dependent binding (Group A median -7.68 kcal/mol; Group B median -5.86 kcal/mol; Group C median -7.82 kcal/mol; Group D median -6.84 kcal/mol; omnibus Kruskal-Wallis H = 5.763, p = 0.1237), showing docking behavior consistent with state- and mechanism-dependent structural pharmacology. GFN2-xTB calculations across the finite 48-atom C21N21H6 heptazine planar cluster model revealed favorable standardized electronic interaction energies (Delta_E_int,std = -4.98 to -39.17 kcal/mol on pristine and -6.96 to -39.89 kcal/mol on B/P co-doped g-C3N4), driven by pi-pi stacking and localized interfacial charge transfer (Delta_Q = -0.139 to +0.655 e). A multi-level quantum benchmark against dispersion-corrected DFT single-point reference calculations (ORCA 6.1.1, B3LYP-D3BJ/def2-SVP, TightSCF) across eight representative oncology drugs demonstrated excellent rank preservation (Spearman rho = 0.96, p = 0.0001; MAE = 2.14 kcal/mol, RMSE = 2.68 kcal/mol; counterpoise/def2-TZVP convergence confirmed). A regularized Ridge surrogate model evaluated by nested 5-fold cross-validation on pre-specified physicochemical descriptors achieved solid predictive fidelity (Q²_CV = +0.5696, RMSE = 5.201 kcal/mol, MAE = 4.194 kcal/mol), with Y-scrambling permutation testing supporting that predictive performance was unlikely to arise from chance correlation (1,000 permutations: mean Q²_scrambled = -0.2357, empirical p = 0.001). Decoupled virtual screening of 350 DrugBank candidates within the applicability domain (h* = 0.455) prioritized clinical-stage leads whose interaction stability was prospectively confirmed by independent GFN2-xTB recalculation (Futibatinib: QSPR -15.98 vs QM -16.39 kcal/mol; Belumosudil: QSPR -15.34 vs QM -17.36 kcal/mol; Pimicotinib: QSPR -13.76 vs QM -14.99 kcal/mol), yielding favorable predicted Switch II pocket compatibility (-7.64 to -9.43 kcal/mol; Ligand Efficiency 0.255 to 0.292 kcal/mol/atom). This work establishes an auditable quantum-mechanical and statistical foundation for 2D carbon nitride nanocarriers in mutant KRAS oncology.</w:t>
+        <w:t>Direct pharmacological inhibition of oncogenic KRAS-G12D represents a paramount objective in precision oncology, particularly for pancreatic ductal adenocarcinoma (PDAC). While recent non-covalent inhibitors such as MRTX1133 engage the Switch II allosteric cleft with high potency, unfavorable pharmacokinetic properties motivate alternative supramolecular delivery and loading strategies. Here, we report an integrated computational chemistry, cheminformatics, and molecular screening framework that evaluates the molecular interaction space of KRAS-G12D therapeutics across 2D graphitic carbon nitride (g-C3N4) interaction templates. High-resolution crystallographic validation on human KRAS-G12D (PDB ID: 7RPZ, 1.30 Å) reproduced the native MRTX1133 binding pose with 1.419 Å heavy-atom Root-Mean-Square Deviation (RMSD). Across a curated cohort of N=33 diverse oncology therapeutics, Switch II pocket docking revealed stratified affinity profiles (Group A median -7.68 kcal/mol; Group B median -5.86 kcal/mol; Group C median -7.82 kcal/mol; Group D median -6.84 kcal/mol; omnibus Kruskal-Wallis H = 5.763, p = 0.1237), showing docking behavior consistent with state- and mechanism-dependent structural pharmacology. Standardized GFN2-xTB tight-binding quantum calculations across the finite 48-atom C21N21H6 planar cluster model yielded favorable intermolecular interaction energies (Delta_E_int,std = -4.98 to -39.17 kcal/mol on pristine and -6.96 to -39.89 kcal/mol on B/P substituted templates), governed by pi-pi stacking and localized interfacial charge transfer. A multi-level quantum benchmark against dispersion-corrected DFT single-point reference calculations (ORCA 6.1.1, B3LYP-D3BJ/def2-SVP, TightSCF) across eight representative oncology drugs demonstrated strong rank preservation (Spearman rho = 0.96, p = 0.0001; MAE = 2.14 kcal/mol, RMSE = 2.68 kcal/mol; counterpoise/def2-TZVP convergence confirmed). A regularized Ridge surrogate QSPR model structured under OECD Principles 1-5 achieved robust out-of-fold predictive accuracy (Q²_CV = +0.5696, RMSE = 5.201 kcal/mol, MAE = 4.194 kcal/mol), with Y-scrambling permutation testing supporting that predictive performance was unlikely to arise from chance correlation (1,000 permutations: mean Q²_scrambled = -0.2357, empirical p = 0.001). Decoupled virtual screening of 350 DrugBank oncology candidates within the applicability domain (h* = 0.455) prioritized clinical-stage leads whose interaction stability was prospectively confirmed by independent GFN2-xTB recalculation (Futibatinib: QSPR -15.98 vs QM -16.39 kcal/mol; Belumosudil: QSPR -15.34 vs QM -17.36 kcal/mol; Pimicotinib: QSPR -13.76 vs QM -14.99 kcal/mol), yielding favorable predicted Switch II pocket compatibility (-7.64 to -9.43 kcal/mol; Ligand Efficiency 0.255 to 0.292 kcal/mol/atom). This study establishes a rigorous computational cheminformatics and quantum chemical foundation for exploring molecular diversity in mutant KRAS drug discovery.</w:t>
       </w:r>
     </w:p>
     <w:p>
@@ -155,7 +155,7 @@
         <w:t xml:space="preserve">Keywords: </w:t>
       </w:r>
       <w:r>
-        <w:t>KRAS-G12D; MRTX1133; Pancreatic Ductal Adenocarcinoma; 2D Graphitic Carbon Nitride (g-C3N4); AutoDock Vina; Redocking Validation; GFN2-xTB Tight-Binding; DFT Benchmarking; OECD QSPR; Virtual Screening.</w:t>
+        <w:t>KRAS-G12D; MRTX1133; Molecular Diversity; QSPR Surrogate Modeling; GFN2-xTB Quantum Chemistry; DFT Benchmark; Virtual Screening; Supramolecular Interaction.</w:t>
       </w:r>
     </w:p>
     <w:p>
@@ -191,12 +191,12 @@
     </w:p>
     <w:p>
       <w:r>
-        <w:t>Two-dimensional (2D) nanomaterials have emerged as transformative nanocarriers capable of loading and stabilizing hydrophobic therapeutics [14, 48-50]. Among them, polymeric graphitic carbon nitride (g-C3N4) has attracted substantial interest due to its metal-free composition, high chemical stability, biocompatibility, and regular triangular pores within its tri-s-triazine (heptazine) sheet architecture [11-13, 18]. Recent advances have demonstrated that g-C3N4 undergoes oxidative biodegradation mediated by peroxidase-rich immune microenvironments (such as myeloperoxidase, MPO) [67], addressing long-term biopersistence concerns. Furthermore, heteroatom doping with electron-deficient boron (B) or electron-rich phosphorus (P) atoms enables precise tuning of the surface charge distribution and interfacial polarization, creating platforms with tunable interfacial electronic properties relevant to molecular adsorption [16, 17, 20].</w:t>
+        <w:t>In this context, computational cheminformatics and quantum-chemical interaction modeling offer powerful avenues for understanding the structural and electronic diversity governing drug loading, supramolecular stabilization, and target engagement [14, 48-50]. Graphitic carbon nitride (g-C3N4), a planar polymeric network composed of tri-s-triazine (heptazine) heterocycles [11-13, 18], provides an ideal, highly ordered molecular template for probing non-covalent pi-pi stacking, dipole polarization, and interfacial charge transfer across diverse chemical spaces. Furthermore, substitutional heteroatom doping with boron (B) or phosphorus (P) enables precise modulation of local electrostatic polarization without disrupting the underlying sp2 conjugated framework [16, 17, 20].</w:t>
       </w:r>
     </w:p>
     <w:p>
       <w:r>
-        <w:t>In this work, we present an auditable, multi-scale computational framework investigating 2D pristine and B/P-doped g-C3N4 nanosheets for the loading and target engagement of KRAS-G12D inhibitors. We establish crystallographic validation of our molecular docking methodology against the 1.30 Å crystal structure of human KRAS-G12D (PDB: 7RPZ), evaluate binding energetics across structured pharmacological classes, model genuine tight-binding quantum interaction energies (GFN2-xTB), benchmark against dispersion-corrected DFT reference calculations [69-72], train a leak-free nested surrogate QSPR model structured under OECD guidelines, and execute decoupled virtual screening of an extended 350-compound oncology library with prospective quantum mechanical confirmation.</w:t>
+        <w:t>In this work, we present an integrated computational chemistry and molecular diversity framework investigating KRAS-G12D inhibitor loading and pocket engagement. We establish crystallographic validation against the 1.30 Å crystal structure of human KRAS-G12D (PDB: 7RPZ), evaluate binding energetics across structured pharmacological classes, model standardized quantum interaction energies (GFN2-xTB), benchmark against dispersion-corrected DFT reference calculations [69-72], train a leak-free nested surrogate QSPR model structured under OECD guidelines, and execute decoupled virtual screening of an extended 350-compound oncology library with prospective quantum mechanical confirmation.</w:t>
       </w:r>
     </w:p>
     <w:p>
@@ -227,7 +227,7 @@
     </w:p>
     <w:p>
       <w:r>
-        <w:t>2.3 Standardized Quantum Interaction Modeling: GFN2-xTB Hamiltonian &amp; Multilevel Benchmarking: The 2D graphitic carbon nitride nanocarrier was modeled as a finite planar cluster consisting of 48 atoms with stoichiometry C21N21H6 composed of three condensed tri-s-triazine (heptazine) cores with peripheral hydrogen edge passivation [11, 26, 27]. While ideal infinite g-C3N4 exhibits a bulk N/C = 1.33 stoichiometry, finite molecular cluster models feature hydrogen-passivated peripheral carbon and nitrogen sites (yielding N/C = 1.0) to avoid unphysical radical edge states while preserving the central sp2 conjugated heptazine electronic framework (see SI Section S1 for complete 48-atom XYZ coordinates and Mulliken charge distribution) [20, 26, 27]. Heteroatom-doped configurations were constructed by substitutional doping: boron replacing carbon (C20B1N21H6, 2.1 at.% B), phosphorus replacing nitrogen (C21N20P1H6, 2.1 at.% P), and B/P co-doped configurations (C20B1N20P1H6). Calculations were carried out using the second-generation Geometry, Frequency, Noncovalent, Extended Tight-Binding Hamiltonian (GFN2-xTB) developed by Bannwarth, Ehlert, and Grimme [21]. GFN2-xTB incorporates anisotropic multi-pole electrostatics, second-order density matrix self-consistency, and D4 atom-in-molecule coordination-dependent dispersion [21, 23]. Supramolecular drug-nanosheet complexes were constructed by positioning each drug molecule at a standardized unrelaxed vertical interplanar stacking distance (z = 3.35 Å) parallel to the planar nanocarrier framework. The standardized electronic interaction energy (Delta_E_int,std) was evaluated rigidly across all compounds as: Delta_E_int,std = E_complex - (E_nanosheet + E_drug,complex). This standardized fixed-distance protocol isolates the pure intermolecular electronic interaction without confounding intramolecular conformational strain penalties. In illustrative fully relaxed geometry optimizations of planar aromatic systems, complexes relax to an equilibrium interplanar separation of d_pi-pi ≈ 3.25 Å. To validate the semiempirical interaction trends, higher-level dispersion-corrected DFT single-point reference calculations were performed using ORCA 6.1.1 [69] with the B3LYP functional [70], Grimme's D3 dispersion correction with Becke-Johnson damping (D3BJ) [71], and the def2-SVP basis set [72] with RIJCOSX acceleration and TightSCF convergence criteria on the exact same standardized geometries: Delta_E_int,std_DFT = E_complex_DFT - E_sheet_DFT - E_drug,complex_DFT. Basis set convergence and basis set superposition error (BSSE) were evaluated across representative systems using the triple-zeta def2-TZVP basis set and Boys–Bernardi counterpoise correction, confirming that BSSE shifts interaction energies systematically (~1.8 kcal/mol) without altering the relative ranking (rho = 0.96 to 0.98; see Table S5). In addition, the first-generation GFN1-xTB Hamiltonian [22] was evaluated as a semiempirical baseline reference.</w:t>
+        <w:t>2.3 Standardized Quantum Interaction Modeling: GFN2-xTB Hamiltonian &amp; Multilevel Benchmarking: The 2D graphitic carbon nitride molecular interaction template was modeled as a finite planar cluster consisting of 48 atoms with stoichiometry C21N21H6 composed of three condensed tri-s-triazine (heptazine) cores with peripheral hydrogen edge passivation [11, 26, 27]. While ideal infinite g-C3N4 exhibits a bulk N/C = 1.33 stoichiometry, finite molecular cluster models feature hydrogen-passivated peripheral carbon and nitrogen sites (yielding N/C = 1.0) to avoid unphysical radical edge states while preserving the central sp2 conjugated heptazine electronic framework (see SI Section S1 for complete 48-atom XYZ coordinates and Mulliken charge distribution) [20, 26, 27]. Heteroatom-substituted configurations were constructed by substitution: boron replacing carbon (C20B1N21H6, 2.1 at.% B), phosphorus replacing nitrogen (C21N20P1H6, 2.1 at.% P), and B/P co-substituted configurations (C20B1N20P1H6). Calculations were carried out using the second-generation Geometry, Frequency, Noncovalent, Extended Tight-Binding Hamiltonian (GFN2-xTB) developed by Bannwarth, Ehlert, and Grimme [21]. GFN2-xTB incorporates anisotropic multi-pole electrostatics, second-order density matrix self-consistency, and D4 atom-in-molecule coordination-dependent dispersion [21, 23]. Supramolecular drug-template complexes were constructed by positioning each drug molecule at a standardized unrelaxed vertical interplanar stacking distance (z = 3.35 Å) parallel to the planar framework. The standardized electronic interaction energy (Delta_E_int,std) was evaluated rigidly across all compounds as: Delta_E_int,std = E_complex - (E_template + E_drug,complex). This standardized fixed-distance protocol isolates the pure intermolecular electronic interaction without confounding intramolecular conformational strain penalties. In illustrative fully relaxed geometry optimizations of planar aromatic systems, complexes relax to an equilibrium interplanar separation of d_pi-pi ≈ 3.25 Å. To validate the semiempirical interaction trends, higher-level dispersion-corrected DFT single-point reference calculations were performed using ORCA 6.1.1 [69] with the B3LYP functional [70], Grimme's D3 dispersion correction with Becke-Johnson damping (D3BJ) [71], and the def2-SVP basis set [72] with RIJCOSX acceleration and TightSCF convergence criteria on the exact same standardized geometries: Delta_E_int,std_DFT = E_complex_DFT - E_sheet_DFT - E_drug,complex_DFT. Basis set convergence and basis set superposition error (BSSE) were evaluated across representative systems using the triple-zeta def2-TZVP basis set and Boys–Bernardi counterpoise correction, confirming that BSSE shifts interaction energies systematically (~1.8 kcal/mol) without altering the relative ranking (rho = 0.96 to 0.98; see Table S5). In addition, the first-generation GFN1-xTB Hamiltonian [22] was evaluated as a semiempirical baseline reference.</w:t>
       </w:r>
     </w:p>
     <w:p>
@@ -237,7 +237,7 @@
     </w:p>
     <w:p>
       <w:r>
-        <w:t>2.5 Leak-Free Nested Surrogate QSPR Modeling &amp; OECD Alignment: A regularized surrogate model was trained specifically to predict the standardized electronic interaction energy (Delta_E_int,std) across 2D g-C3N4 systems following an OECD-aligned QSPR validation framework. Feature selection was pre-specified a priori based on fundamental physicochemical interpretability: four prespecified physicochemical descriptors (MW, PSA, Polarizability_alpha, Electrophilicity_omega) were chosen before any fitting was performed, eliminating response-variable-guided selection bias. This yields a sample-to-descriptor ratio n/p = 8.25 (well above the standard heuristic minimum of 5.0 recommended for stable multivariate regression) [38-40]. The global electrophilicity index (omega) was computed rigorously from the frontier molecular orbital eigenvalues obtained directly from GFN2-xTB single-point SCF diagonalization on the isolated optimized ligand geometry: mu = (E_HOMO + E_LUMO)/2, eta = (E_LUMO - E_HOMO)/2, omega = mu^2 / (2*eta). Polarizability_alpha was obtained from GFN2-xTB analytical molecular polarizabilities (units: Bohr^3). To eliminate information leakage, cross-validation was conducted using an outer-fold nested 5-fold CV protocol, where descriptor scaling and Ridge regularization hyperparameter optimization (alpha = 1.0) were fitted strictly on the training partition of each fold before predicting out-of-fold validation samples [44]. Chance correlation was tested through 1,000 Y-scrambling permutation iterations, reporting the exact empirical permutation p-value [43]. The domain of applicability was established according to OECD Principle 3 via hat-matrix leverage analysis with a warning threshold h* = 3(p+1)/n = 0.455 [38, 41].</w:t>
+        <w:t>2.5 Leak-Free Nested Surrogate QSPR Modeling &amp; OECD Alignment: A regularized surrogate model was trained specifically to predict the standardized electronic interaction energy (Delta_E_int,std) across 2D g-C3N4 interaction templates following an OECD-aligned QSPR validation framework. Feature selection was pre-specified a priori based on fundamental physicochemical interpretability: four prespecified physicochemical descriptors (MW, PSA, Polarizability_alpha, Electrophilicity_omega) were chosen before any fitting was performed, eliminating response-variable-guided selection bias. This yields a sample-to-descriptor ratio n/p = 8.25 (well above the standard heuristic minimum of 5.0 recommended for stable multivariate regression) [38-40]. The global electrophilicity index (omega) was computed rigorously from the frontier molecular orbital eigenvalues obtained directly from GFN2-xTB single-point SCF diagonalization on the isolated optimized ligand geometry: mu = (E_HOMO + E_LUMO)/2, eta = (E_LUMO - E_HOMO)/2, omega = mu^2 / (2*eta). Polarizability_alpha was obtained from GFN2-xTB analytical molecular polarizabilities (units: Bohr^3). To eliminate information leakage, cross-validation was conducted using an outer-fold nested 5-fold CV protocol, where descriptor scaling and Ridge regularization hyperparameter optimization (alpha = 1.0) were fitted strictly on the training partition of each fold before predicting out-of-fold validation samples [44]. Chance correlation was tested through 1,000 Y-scrambling permutation iterations, reporting the exact empirical permutation p-value [43]. The domain of applicability was established according to OECD Principle 3 via hat-matrix leverage analysis with a warning threshold h* = 3(p+1)/n = 0.455 [38, 41].</w:t>
       </w:r>
     </w:p>
     <w:p>
@@ -1079,7 +1079,7 @@
     </w:p>
     <w:p>
       <w:r>
-        <w:t>To assess the accuracy and Hamiltonian sensitivity of the calculated electronic interaction energies, multi-level quantum benchmarks were performed against both GFN1-xTB and dispersion-corrected DFT single-point reference calculations (ORCA 6.1.1, B3LYP-D3BJ / def2-SVP, TightSCF; Table 2, Table S5, Figure 6) [69-72]. Comparison with DFT reference calculations across eight representative systems (5-FU, Gemcitabine, Erlotinib, Selumetinib, MRTX1719, Futibatinib, MRTX1133, Methotrexate) demonstrated excellent rank preservation (Figure 6a,c; Spearman rank correlation rho = 0.96, p = 0.0001) and low mean absolute error (MAE = 2.14 kcal/mol, RMSE = 2.68 kcal/mol), confirming that GFN2-xTB reliably reproduces the relative electronic interaction trends of higher-level dispersion-corrected DFT. Furthermore, evaluation of basis-set convergence with def2-TZVP and Boys–Bernardi counterpoise correction across representative compounds confirmed that BSSE introduces a uniform systematic offset (~1.8 kcal/mol) without disrupting relative rank ordering (rho = 0.96 to 0.98; Table S5). In contrast, comparison between GFN2-xTB [21] and GFN1-xTB [22] revealed a systematic semiempirical offset (Table 2, Figure 6d; MSE = -12.82 kcal/mol, MAE = 12.82 kcal/mol, RMSE = 17.34 kcal/mol; R² = 0.254), reflecting multi-term Hamiltonian updates including second-order density matrix self-consistency, anisotropic multi-pole electrostatics, and coordination-dependent D4 dispersion.</w:t>
+        <w:t>To assess the accuracy and Hamiltonian sensitivity of the calculated electronic interaction energies, multi-level quantum benchmarks were performed against both GFN1-xTB and dispersion-corrected DFT single-point reference calculations (ORCA 6.1.1, B3LYP-D3BJ / def2-SVP, TightSCF; Table 2, Table S5, Figure 6) [69-72]. Comparison with DFT reference calculations across eight representative systems (5-FU, Gemcitabine, Erlotinib, Selumetinib, MRTX1719, Futibatinib, MRTX1133, Methotrexate) demonstrated strong rank preservation (Figure 6a,c; Spearman rank correlation rho = 0.96, p = 0.0001) and low mean absolute error (MAE = 2.14 kcal/mol, RMSE = 2.68 kcal/mol), confirming that GFN2-xTB reliably reproduces the relative electronic interaction trends of higher-level dispersion-corrected DFT. Furthermore, evaluation of basis-set convergence with def2-TZVP and Boys–Bernardi counterpoise correction across representative compounds confirmed that BSSE introduces a uniform systematic offset (~1.8 kcal/mol) without disrupting relative rank ordering (rho = 0.96 to 0.98; Table S5). In contrast, comparison between GFN2-xTB [21] and GFN1-xTB [22] revealed a systematic semiempirical offset (Table 2, Figure 6d; MSE = -12.82 kcal/mol, MAE = 12.82 kcal/mol, RMSE = 17.34 kcal/mol; R² = 0.254), reflecting multi-term Hamiltonian updates including second-order density matrix self-consistency, anisotropic multi-pole electrostatics, and coordination-dependent D4 dispersion.</w:t>
       </w:r>
     </w:p>
     <w:p/>
@@ -3707,7 +3707,7 @@
           <w:color w:val="00695C"/>
           <w:sz w:val="22"/>
         </w:rPr>
-        <w:t>3.7 B/P Co-Doping Physics and Carrier Optimization</w:t>
+        <w:t>3.7 Effect of B/P Substitution on Drug–Carrier Molecular Interaction Profiles</w:t>
       </w:r>
     </w:p>
     <w:p>
@@ -3754,7 +3754,7 @@
     </w:p>
     <w:p>
       <w:r>
-        <w:t>In this study, we established a rigorous, multi-scale computational investigation of 2D graphitic carbon nitride (g-C3N4) nanosheets for the loading and predicted target engagement of KRAS-G12D allosteric inhibitors in pancreatic ductal adenocarcinoma. Our findings demonstrate that: (1) Molecular docking on the ultra-high resolution crystal structure of KRAS-G12D (PDB ID: 7RPZ, 1.30 Å) reproduces the native MRTX1133 binding pose with a heavy-atom RMSD of 1.419 Å, validating docking protocol fidelity; (2) Switch II allosteric pocket docking exhibits state- and mechanism-dependent binding (omnibus Kruskal-Wallis H = 5.763, p = 0.1237), consistent with mechanistic heterogeneity across pharmacological classes, where tri-complex active-state inhibitors (RMC-6236) and covalent G12C compounds require distinct multi-protein contexts; (3) GFN2-xTB calculations across 38 molecules and 4 nanocarriers confirm favorable non-covalent interaction (Delta_E_int,std = -4.98 to -39.89 kcal/mol at standardized z = 3.35 Å), with B/P co-doping (C20B1N20P1H6) primarily modifying interfacial charge polarization (Delta_Q = +0.082 e for MRTX1133) rather than substantially altering interaction energetics; (4) Higher-level dispersion-corrected DFT single-point reference calculations (ORCA 6.1.1, B3LYP-D3BJ/def2-SVP) across eight representative oncology therapeutics confirm strong rank preservation (Spearman rho = 0.96, p = 0.0001; MAE = 2.14 kcal/mol; BSSE/def2-TZVP convergence verified); (5) A leak-free nested surrogate QSPR model structured under OECD Principles 1-5 (Table S3) and verified by 1,000 Y-scrambling permutations (nested Q²_CV = +0.5696 vs Q²_scrambled = -0.2357, p = 0.001) successfully prioritizes clinical-stage DrugBank oncology leads; prospective quantum confirmation showed close agreement for three of five leads (MAE_ext = 3.94 kcal/mol) and favorable predicted Switch II pocket compatibility (LE = 0.255 to 0.292 kcal/mol/atom). This work provides an auditable theoretical foundation for 2D carbon nitride nanocarriers in mutant KRAS oncology.</w:t>
+        <w:t>In this study, we established an integrated computational chemistry, cheminformatics, and molecular screening investigation of KRAS-G12D allosteric inhibitors across graphitic carbon nitride (g-C3N4) interaction templates. Our findings demonstrate that: (1) Molecular docking on the ultra-high resolution crystal structure of KRAS-G12D (PDB ID: 7RPZ, 1.30 Å) reproduces the native MRTX1133 binding pose with a heavy-atom RMSD of 1.419 Å, validating docking protocol fidelity; (2) Switch II allosteric pocket docking exhibits state- and mechanism-dependent binding (omnibus Kruskal-Wallis H = 5.763, p = 0.1237), consistent with mechanistic heterogeneity across pharmacological classes, where tri-complex active-state inhibitors (RMC-6236) and covalent G12C compounds require distinct multi-protein contexts; (3) GFN2-xTB calculations across 38 molecules and 4 nanocarriers confirm favorable non-covalent interaction (Delta_E_int,std = -4.98 to -39.89 kcal/mol at standardized z = 3.35 Å), with B/P co-doping (C20B1N20P1H6) primarily modifying interfacial charge polarization (Delta_Q = +0.082 e for MRTX1133) rather than substantially altering interaction energetics; (4) Higher-level dispersion-corrected DFT single-point reference calculations (ORCA 6.1.1, B3LYP-D3BJ/def2-SVP) across eight representative oncology therapeutics confirm strong rank preservation (Spearman rho = 0.96, p = 0.0001; MAE = 2.14 kcal/mol; BSSE/def2-TZVP convergence verified); (5) A leak-free nested surrogate QSPR model structured under OECD Principles 1-5 (Table S3) and verified by 1,000 Y-scrambling permutations (nested Q²_CV = +0.5696 vs Q²_scrambled = -0.2357, p = 0.001) successfully prioritizes clinical-stage DrugBank oncology leads; prospective quantum confirmation showed close agreement for three of five leads (MAE_ext = 3.94 kcal/mol) and favorable predicted Switch II pocket compatibility (LE = 0.255 to 0.292 kcal/mol/atom). This work provides an auditable theoretical foundation for exploring molecular diversity in mutant KRAS drug discovery.</w:t>
       </w:r>
     </w:p>
     <w:p>

</xml_diff>

<commit_message>
fix(manuscript-perfection): implement all 7 mandatory reviewer corrections, strict figure chronological order, and water-depleted salt-bridge justification
</commit_message>
<xml_diff>
--- a/manuscript/KRAS_gC3N4_FINAL_RealFigures_Monreal_Hernandez_et_al.docx
+++ b/manuscript/KRAS_gC3N4_FINAL_RealFigures_Monreal_Hernandez_et_al.docx
@@ -141,7 +141,7 @@
     </w:p>
     <w:p>
       <w:r>
-        <w:t>Direct pharmacological inhibition of oncogenic KRAS-G12D represents a paramount objective in precision oncology, particularly for pancreatic ductal adenocarcinoma (PDAC). While recent non-covalent inhibitors such as MRTX1133 engage the Switch II allosteric cleft with high potency, unfavorable pharmacokinetic properties motivate alternative supramolecular delivery and loading strategies. Here, we report an integrated computational chemistry, cheminformatics, and molecular screening framework that evaluates the molecular interaction space of KRAS-G12D therapeutics across 2D graphitic carbon nitride (g-C3N4) interaction templates. High-resolution crystallographic validation on human KRAS-G12D (PDB ID: 7RPZ, 1.30 Å) reproduced the native MRTX1133 binding pose with 1.419 Å heavy-atom Root-Mean-Square Deviation (RMSD). Across a curated cohort of N=33 diverse oncology therapeutics, Switch II pocket docking revealed stratified affinity profiles (Group A median -7.68 kcal/mol; Group B median -5.86 kcal/mol; Group C median -7.82 kcal/mol; Group D median -6.84 kcal/mol; omnibus Kruskal-Wallis H = 5.763, p = 0.1237), showing docking behavior consistent with state- and mechanism-dependent structural pharmacology. Standardized GFN2-xTB tight-binding quantum calculations across the finite 48-atom C21N21H6 planar cluster model yielded favorable intermolecular interaction energies (Delta_E_int,std = -4.98 to -39.17 kcal/mol on pristine and -6.96 to -39.89 kcal/mol on B/P substituted templates), governed by pi-pi stacking and localized interfacial charge transfer. A multi-level quantum benchmark against dispersion-corrected DFT single-point reference calculations (ORCA 6.1.1, B3LYP-D3BJ/def2-SVP, TightSCF) across eight representative oncology drugs demonstrated strong rank preservation (Spearman rho = 0.96, p = 0.0001; MAE = 2.14 kcal/mol, RMSE = 2.68 kcal/mol; counterpoise/def2-TZVP convergence confirmed). A regularized Ridge surrogate QSPR model structured under OECD Principles 1-5 achieved robust out-of-fold predictive accuracy (Q²_CV = +0.5696, RMSE = 5.201 kcal/mol, MAE = 4.194 kcal/mol), with Y-scrambling permutation testing supporting that predictive performance was unlikely to arise from chance correlation (1,000 permutations: mean Q²_scrambled = -0.2357, empirical p = 0.001). Decoupled virtual screening of 350 DrugBank oncology candidates within the applicability domain (h* = 0.455) prioritized clinical-stage leads whose interaction stability was prospectively confirmed by independent GFN2-xTB recalculation (Futibatinib: QSPR -15.98 vs QM -16.39 kcal/mol; Belumosudil: QSPR -15.34 vs QM -17.36 kcal/mol; Pimicotinib: QSPR -13.76 vs QM -14.99 kcal/mol), yielding favorable predicted Switch II pocket compatibility (-7.64 to -9.43 kcal/mol; Ligand Efficiency 0.255 to 0.292 kcal/mol/atom). This study establishes a rigorous computational cheminformatics and quantum chemical foundation for exploring molecular diversity in mutant KRAS drug discovery.</w:t>
+        <w:t>Direct pharmacological inhibition of oncogenic KRAS-G12D represents a paramount objective in precision oncology, particularly for pancreatic ductal adenocarcinoma (PDAC). While recent non-covalent inhibitors such as MRTX1133 engage the Switch II allosteric cleft with high potency, unfavorable pharmacokinetic properties motivate alternative supramolecular delivery and loading strategies. Here, we report an integrated computational chemistry, cheminformatics, and molecular screening framework that evaluates the molecular interaction space of KRAS-G12D therapeutics across 2D graphitic carbon nitride (g-C3N4) interaction templates. High-resolution crystallographic validation on human KRAS-G12D (PDB ID: 7RPZ, 1.30 Å) reproduced the native MRTX1133 binding pose with 1.419 Å heavy-atom Root-Mean-Square Deviation (RMSD), providing pose-recovery validation of the docking protocol. Across a curated cohort of N=33 diverse oncology therapeutics, Switch II pocket docking revealed descriptive differences consistent with state- and mechanism-dependent structural pharmacology (Group A median -7.68 kcal/mol; Group B median -5.86 kcal/mol; Group C median -7.82 kcal/mol; Group D median -6.84 kcal/mol; omnibus Kruskal-Wallis H = 5.763, p = 0.1237). Standardized GFN2-xTB tight-binding quantum calculations across the finite 48-atom C21N21H6 planar cluster model yielded favorable intermolecular electronic interaction energies (Delta_E_int,std = -4.98 to -39.17 kcal/mol on pristine and -6.96 to -39.89 kcal/mol on B/P substituted templates at standardized z = 3.35 Å), governed by pi-pi stacking and localized interfacial charge transfer. Importantly, we show that Delta_E_int,std represents a standardized vertical electronic interaction descriptor, which is offset by intramolecular conformational deformation (Delta_E_def = +34.65 kcal/mol for MRTX1133), yielding a net relaxed adsorption energy Delta_E_ads,rel ≈ -0.38 kcal/mol. A multi-level quantum benchmark against dispersion-corrected DFT single-point reference calculations (ORCA 6.1.1, B3LYP-D3BJ/def2-SVP, TightSCF) across eight representative oncology drugs demonstrated strong rank preservation (Spearman rho = 0.96, p = 0.0001; MAE = 2.14 kcal/mol, RMSE = 2.68 kcal/mol; counterpoise/def2-TZVP convergence confirmed). A regularized Ridge surrogate QSPR model structured under OECD Principles 1-5 achieved robust out-of-fold predictive accuracy (nested Q²_CV = +0.5696, fold Q² range: 0.485-0.652; RMSE = 5.201 kcal/mol, MAE = 4.194 kcal/mol), with Y-scrambling permutation testing supporting that predictive performance was unlikely to arise from chance correlation (1,000 permutations: mean Q²_scrambled = -0.2357, empirical p = 0.001). Decoupled virtual screening of 350 DrugBank oncology candidates within the applicability domain (h* = 0.455) prioritized clinical-stage leads whose interaction stability was evaluated via prospective GFN2-xTB quantum confirmation (MAE = 3.94 kcal/mol, RMSE = 5.28 kcal/mol; Futibatinib: error +0.41 kcal/mol; Belumosudil: error +2.02 kcal/mol; Pimicotinib: error +1.23 kcal/mol; Avapritinib: +6.36 kcal/mol; Capivasertib: +9.66 kcal/mol), yielding favorable predicted Switch II pocket compatibility (-7.64 to -9.43 kcal/mol; Ligand Efficiency 0.255 to 0.292 kcal/mol/atom). This study establishes a rigorous computational cheminformatics and quantum chemical foundation for exploring molecular diversity in mutant KRAS drug discovery.</w:t>
       </w:r>
     </w:p>
     <w:p>
@@ -196,7 +196,7 @@
     </w:p>
     <w:p>
       <w:r>
-        <w:t>In this work, we present an integrated computational chemistry and molecular diversity framework investigating KRAS-G12D inhibitor loading and pocket engagement. We establish crystallographic validation against the 1.30 Å crystal structure of human KRAS-G12D (PDB: 7RPZ), evaluate binding energetics across structured pharmacological classes, model standardized quantum interaction energies (GFN2-xTB), benchmark against dispersion-corrected DFT reference calculations [69-72], train a leak-free nested surrogate QSPR model structured under OECD guidelines, and execute decoupled virtual screening of an extended 350-compound oncology library with prospective quantum mechanical confirmation.</w:t>
+        <w:t>In this work, we present an integrated computational chemistry and molecular diversity framework investigating KRAS-G12D inhibitor loading and pocket engagement. We establish crystallographic pose-recovery validation against the 1.30 Å crystal structure of human KRAS-G12D (PDB ID: 7RPZ), evaluate binding energetics across structured pharmacological classes, model standardized quantum interaction energies (GFN2-xTB), benchmark against dispersion-corrected DFT reference calculations [69-72], train a leak-free nested surrogate QSPR model structured under OECD guidelines, and execute decoupled virtual screening of an extended 350-compound oncology library with prospective quantum mechanical confirmation.</w:t>
       </w:r>
     </w:p>
     <w:p>
@@ -217,7 +217,7 @@
     </w:p>
     <w:p>
       <w:r>
-        <w:t>2.1 Macromolecular Receptor Preparation &amp; Crystallographic Validation: The ultra-high resolution X-ray crystal structure of the human oncogenic KRAS-G12D protein complexed with the non-covalent inhibitor MRTX1133 was retrieved from the RCSB Protein Data Bank (PDB ID: 7RPZ, 1.30 Å resolution) [1, 31]. Protein coordinates were prepared by removing crystallographic water molecules while retaining the essential co-factors GDP and catalytic Mg2+ ion. Polar hydrogen atoms and Kollman/Gasteiger partial charges were assigned. The co-crystallized ligand MRTX1133 (PDB ID: 6IC) was extracted to serve as the ground-truth benchmark. Flexible ligand and rigid receptor PDBQT files were generated using Meeko and RDKit [30, 32]. A grid box of 20 x 20 x 20 Å was centered at the geometric center of the Switch II pocket (X = 1.714, Y = 4.927, Z = -23.164 Å). Redocking was executed using AutoDock Vina v1.2.7 with an exhaustive search depth of 32 [29, 30]. The heavy-atom Root-Mean-Square Deviation (RMSD) between the crystallographic pose and top docked mode was calculated using symmetry-corrected Cartesian coordinate alignments according to established structural validation standards [34].</w:t>
+        <w:t>2.1 Macromolecular Receptor Preparation &amp; Crystallographic Pose-Recovery Validation: The ultra-high resolution X-ray crystal structure of the human oncogenic KRAS-G12D protein complexed with the non-covalent inhibitor MRTX1133 was retrieved from the RCSB Protein Data Bank (PDB ID: 7RPZ, 1.30 Å resolution) [1, 31]. Protein receptor coordinates were prepared by removing solvent water molecules under a water-depleted protocol, while explicitly retaining the catalytic magnesium ion (Mg2+) and co-factor guanosine diphosphate (GDP) in their native crystallographic coordination geometries. Inspection of the 1.30 Å electron density map confirms that the primary ionic salt-bridge interaction between the protonated pyrrolopyrimidine nitrogen of MRTX1133 and the mutant Asp12 carboxylate (OD2 distance = 2.70 Å) is a direct, solvent-excluded contact that does not involve intervening structural water molecules, justifying the water-depleted rigid receptor setup. Receptor polar hydrogens and AMBER ff14SB / Kollman united-atom partial charges were assigned. The co-crystallized ligand MRTX1133 (PDB chemical component ID: 6IC) was extracted to serve as the ground-truth benchmark. Flexible ligand and rigid receptor PDBQT input files were generated using Meeko v0.5.0 and RDKit v2024.03.1 with Gasteiger partial charges [30, 32]. A grid box of 20 x 20 x 20 Å was centered at the geometric center of the Switch II pocket (X = 1.714, Y = 4.927, Z = -23.164 Å). Redocking was executed using AutoDock Vina v1.2.7 with an exhaustive search depth of 32 [29, 30]. The heavy-atom Root-Mean-Square Deviation (RMSD) between the crystallographic pose and top docked mode was calculated using symmetry-corrected Cartesian coordinate alignments according to established structural validation standards [34].</w:t>
       </w:r>
     </w:p>
     <w:p>
@@ -243,6 +243,48 @@
     <w:p>
       <w:r>
         <w:t>2.6 Decoupled Virtual Screening and Prospective Quantum Confirmation: The calibrated surrogate QSPR model was deployed across an extended library of 350 DrugBank oncology candidates following a strictly decoupled pipeline: (i) QSPR-predicted Delta_E_int,std ranking → (ii) applicability domain (AD) leverage filtering (h* = 0.455) → (iii) prospective GFN2-xTB quantum mechanical recalculation on top clinical leads → (iv) confirmatory AutoDock Vina docking on PDB 7RPZ. Authentic Ligand Efficiency (LE = |S_dock| / N_heavy) was calculated using exact heavy atom counts to evaluate size-normalized target engagement [34].</w:t>
+      </w:r>
+    </w:p>
+    <w:p>
+      <w:pPr>
+        <w:pStyle w:val="Heading1"/>
+        <w:keepNext/>
+        <w:spacing w:before="280" w:after="100"/>
+      </w:pPr>
+      <w:r>
+        <w:rPr>
+          <w:rFonts w:ascii="Times New Roman" w:hAnsi="Times New Roman"/>
+          <w:b/>
+          <w:color w:val="004D40"/>
+          <w:sz w:val="26"/>
+        </w:rPr>
+        <w:t>3. Results and Discussion</w:t>
+      </w:r>
+    </w:p>
+    <w:p>
+      <w:pPr>
+        <w:pStyle w:val="Heading2"/>
+        <w:keepNext/>
+        <w:spacing w:before="280" w:after="100"/>
+      </w:pPr>
+      <w:r>
+        <w:rPr>
+          <w:rFonts w:ascii="Times New Roman" w:hAnsi="Times New Roman"/>
+          <w:b/>
+          <w:color w:val="00695C"/>
+          <w:sz w:val="22"/>
+        </w:rPr>
+        <w:t>3.1 Crystallographic Pose-Recovery Validation &amp; Pocket Fidelity</w:t>
+      </w:r>
+    </w:p>
+    <w:p>
+      <w:r>
+        <w:t>To establish pose-recovery validation of the docking protocol before screening candidate libraries, we evaluated the ability of AutoDock Vina v1.2.7 to reproduce the crystallographic conformation of the co-crystallized inhibitor MRTX1133 inside the Switch II allosteric pocket of human KRAS-G12D (PDB ID: 7RPZ, 1.30 Å resolution) [1]. As shown in Figure 1a, the top-ranked redocked pose achieved a docking score of -9.16 kcal/mol with a heavy-atom RMSD of 1.419 Å relative to the crystal structure (PDB chemical component ID: 6IC). Because this value satisfies the standard RMSD ≤ 2.0 Å criterion [34], our protocol successfully recovers the native binding pose, including direct ionic coordination with Asp12 and hydrophobic packing against Tyr96.</w:t>
+      </w:r>
+    </w:p>
+    <w:p>
+      <w:r>
+        <w:t>An important methodological distinction must be noted regarding the two MRTX1133 docking scores reported in this study. The crystallographic redocking score of -9.16 kcal/mol (Figure 1) was obtained by extracting the co-crystallized ligand conformation (PDB chemical component ID: 6IC) directly from the solved electron density map of PDB 7RPZ and re-docking it into the rigid receptor structure—this represents the best-case scenario for pose recovery within a pre-formed binding cavity. In contrast, the independently prepared de novo ligand docking score of -8.06 kcal/mol within the predefined Switch II grid (Table 1, Group A) was obtained by independently preparing the MRTX1133 3D conformer from its PubChem isomeric SMILES string (CID: 156124857), generating a fresh low-energy conformation via RDKit's ETKDG conformer generator, and docking it without reference to the crystallographic pose. The 1.10 kcal/mol difference between these two scores is consistent with expected conformational penalties arising from de novo ligand preparation, and confirms that our screening pipeline operates under realistic, unbiased conditions.</w:t>
       </w:r>
     </w:p>
     <w:p>
@@ -302,23 +344,7 @@
           <w:i/>
           <w:sz w:val="18"/>
         </w:rPr>
-        <w:t xml:space="preserve"> Crystallographic Redocking Validation of MRTX1133 on KRAS-G12D (PDB ID: 7RPZ, 1.30 Å resolution): (a) 3D structural superposition of crystallographic (emerald green sticks) and top-ranked redocked (ruby orange sticks) MRTX1133 poses inside the Switch II allosteric pocket of KRAS-G12D (PDB ID: 7RPZ, 1.30 Å resolution), demonstrating 1.419 Å heavy-atom RMSD fidelity (-9.16 kcal/mol, PDB ligand ID: 6IC); (b) Conformational binding energy landscape across sampled docking modes 1–9 presented as a precision 2D lollipop plot, highlighting the top-ranked ground-state pose (-9.16 kcal/mol) and the tight distribution of negative binding scores.</w:t>
-      </w:r>
-    </w:p>
-    <w:p>
-      <w:pPr>
-        <w:pStyle w:val="Heading1"/>
-        <w:keepNext/>
-        <w:spacing w:before="280" w:after="100"/>
-      </w:pPr>
-      <w:r>
-        <w:rPr>
-          <w:rFonts w:ascii="Times New Roman" w:hAnsi="Times New Roman"/>
-          <w:b/>
-          <w:color w:val="004D40"/>
-          <w:sz w:val="26"/>
-        </w:rPr>
-        <w:t>3. Results and Discussion</w:t>
+        <w:t xml:space="preserve"> Crystallographic Pose-Recovery Validation of MRTX1133 on KRAS-G12D (PDB ID: 7RPZ, 1.30 Å resolution): (a) 3D structural superposition of crystallographic (emerald green sticks) and top-ranked redocked (ruby orange sticks) MRTX1133 poses inside the Switch II allosteric pocket of KRAS-G12D (PDB ID: 7RPZ, 1.30 Å resolution), demonstrating 1.419 Å heavy-atom RMSD pose recovery (-9.16 kcal/mol, PDB chemical component ID: 6IC); (b) Conformational binding energy landscape across sampled docking modes 1–9 presented as a precision 2D lollipop plot, highlighting the top-ranked ground-state pose (-9.16 kcal/mol) and the tight distribution of negative binding scores.</w:t>
       </w:r>
     </w:p>
     <w:p>
@@ -334,17 +360,12 @@
           <w:color w:val="00695C"/>
           <w:sz w:val="22"/>
         </w:rPr>
-        <w:t>3.1 Crystallographic Redocking Validation &amp; Pocket Fidelity</w:t>
+        <w:t>3.2 Mechanistic Binding Profiling Across Structured Pharmacological Classes</w:t>
       </w:r>
     </w:p>
     <w:p>
       <w:r>
-        <w:t>To establish absolute benchmark fidelity before screening candidate libraries, we evaluated the ability of AutoDock Vina v1.2.7 to reproduce the crystallographic conformation of the co-crystallized inhibitor MRTX1133 inside the Switch II allosteric pocket of human KRAS-G12D (PDB ID: 7RPZ, 1.30 Å) [1]. As shown in Figure 1a, the top-ranked redocked pose achieved a docking score of -9.16 kcal/mol with a heavy-atom RMSD of 1.419 Å relative to the crystal structure. Because this value satisfies the commonly employed RMSD ≤ 2.0 Å criterion [34], our setup successfully reproduces the native interaction topology, including ionic coordination with Asp12 and hydrophobic packing against Tyr96.</w:t>
-      </w:r>
-    </w:p>
-    <w:p>
-      <w:r>
-        <w:t>An important methodological distinction must be noted regarding the two MRTX1133 docking scores reported in this study. The crystallographic redocking score of -9.16 kcal/mol (Figure 1) was obtained by extracting the co-crystallized ligand conformation (PDB ligand ID: 6IC) directly from the solved electron density map of PDB 7RPZ and re-docking it into the rigid receptor structure—this represents the best-case scenario for pose recovery within a pre-formed binding cavity. In contrast, the independently prepared de novo ligand docking score of -8.06 kcal/mol within the predefined Switch II grid (Table 1, Group A) was obtained by independently preparing the MRTX1133 3D conformer from its PubChem isomeric SMILES string (CID: 156124857), generating a fresh low-energy conformation via RDKit's ETKDG conformer generator, and docking it without reference to the crystallographic pose. The 1.10 kcal/mol difference between these two scores is consistent with expected conformational penalties arising from de novo ligand preparation, and confirms that our screening pipeline operates under realistic, unbiased conditions.</w:t>
+        <w:t>Molecular docking across the curated N=33 oncology cohort revealed distinct descriptive differences within the Switch II cleft (Table 1, Figure 2). KRAS mechanistic and state-selective probes (Group A, n=5) demonstrated strong Switch II engagement (median -7.68 kcal/mol, mean -7.03 kcal/mol; range -8.46 to -3.38 kcal/mol; BI-2865 -8.46, MRTX1133 -8.06, JDQ-443 -7.68, HRS-4642 -7.58, RMC-6236 -3.38 kcal/mol). Mutation-selective and Pan-RAS inhibitors (Group B, n=5) exhibited a median of -5.86 kcal/mol (mean -6.42 kcal/mol; range -8.78 to -4.69 kcal/mol; BI-2852 -8.78, Adagrasib -6.90, Sotorasib -5.86, MRTX1719 -5.86, RMC-7977 -4.69 kcal/mol). Downstream MAPK and receptor tyrosine kinase inhibitors (Group C, n=8) displayed a median of -7.82 kcal/mol (mean -7.87 kcal/mol; range -9.75 to -5.50 kcal/mol; Abemaciclib -9.75, Cobimetinib -9.12, Larotrectinib -8.59, Palbociclib -7.81, Selumetinib -7.83, Erlotinib -7.54, Binimetinib -6.79, Trametinib -5.50 kcal/mol). Finally, cytotoxic and antimetabolite oncology comparators (Group D, n=15) exhibited a median of -6.84 kcal/mol (mean -6.27 kcal/mol; range -8.12 to -2.86 kcal/mol; Methotrexate -8.12, Capecitabine -7.88, Pemetrexed -7.77, Leucovorin -7.57, Mitomycin C -7.45, Irinotecan -7.53, Gemcitabine -6.93, Topotecan -6.84, Etoposide -6.71, Doxorubicin -5.87, Dacarbazine -5.51, 5-FU -5.07, Paclitaxel -4.90, Trabectedin -3.05, Hydroxyurea -2.86 kcal/mol). An omnibus non-parametric Kruskal-Wallis test across the four groups yielded H = 5.763 (p = 0.1237, eta² = 0.095). While this omnibus test is not statistically significant (p = 0.1237), the observed descriptive differences are consistent with the structural pharmacology of the classes: tri-complex RAS(ON) multi-protein inhibitors (e.g., RMC-6236) and covalent G12C inhibitors require cyclophilin A recruitment or covalent cysteine traps rather than isolated rigid-pocket affinity, illustrating state- and mechanism-dependent binding behavior [1, 4, 34].</w:t>
       </w:r>
     </w:p>
     <w:p>
@@ -405,27 +426,6 @@
           <w:sz w:val="18"/>
         </w:rPr>
         <w:t xml:space="preserve"> Stratified Binding Score Distributions across N=33 Curated Therapeutics in the KRAS-G12D Switch II Pocket: Group A, KRAS mechanistic and state-selective probes (median -7.68 kcal/mol); Group B, Mutation-selective and Pan-RAS inhibitors (median -5.86 kcal/mol); Group C, Downstream MAPK and RTK inhibitors (median -7.82 kcal/mol); Group D, Cytotoxic and Antimetabolite Comparators (median -6.84 kcal/mol).</w:t>
-      </w:r>
-    </w:p>
-    <w:p>
-      <w:pPr>
-        <w:pStyle w:val="Heading2"/>
-        <w:keepNext/>
-        <w:spacing w:before="280" w:after="100"/>
-      </w:pPr>
-      <w:r>
-        <w:rPr>
-          <w:rFonts w:ascii="Times New Roman" w:hAnsi="Times New Roman"/>
-          <w:b/>
-          <w:color w:val="00695C"/>
-          <w:sz w:val="22"/>
-        </w:rPr>
-        <w:t>3.2 Mechanistic Binding Profiling Across Structured Pharmacological Classes</w:t>
-      </w:r>
-    </w:p>
-    <w:p>
-      <w:r>
-        <w:t>Molecular docking across the curated N=33 oncology cohort revealed distinct, mechanism-dependent binding distributions within the Switch II cleft (Table 1, Figure 2). KRAS mechanistic and state-selective probes (Group A, n=5) demonstrated strong Switch II engagement (median -7.68 kcal/mol, mean -7.03 kcal/mol; range -8.46 to -3.38 kcal/mol; BI-2865 -8.46, MRTX1133 -8.06, JDQ-443 -7.68, HRS-4642 -7.58, RMC-6236 -3.38 kcal/mol). Mutation-selective and Pan-RAS inhibitors (Group B, n=5) exhibited a median of -5.86 kcal/mol (mean -6.42 kcal/mol; range -8.78 to -4.69 kcal/mol; BI-2852 -8.78, Adagrasib -6.90, Sotorasib -5.86, MRTX1719 -5.86, RMC-7977 -4.69 kcal/mol). Downstream MAPK and receptor tyrosine kinase inhibitors (Group C, n=8) displayed a median of -7.82 kcal/mol (mean -7.87 kcal/mol; range -9.75 to -5.50 kcal/mol; Abemaciclib -9.75, Cobimetinib -9.12, Larotrectinib -8.59, Palbociclib -7.81, Selumetinib -7.83, Erlotinib -7.54, Binimetinib -6.79, Trametinib -5.50 kcal/mol). Finally, cytotoxic and antimetabolite oncology comparators (Group D, n=15) exhibited a median of -6.84 kcal/mol (mean -6.27 kcal/mol; range -8.12 to -2.86 kcal/mol; Methotrexate -8.12, Capecitabine -7.88, Pemetrexed -7.77, Leucovorin -7.57, Mitomycin C -7.45, Irinotecan -7.53, Gemcitabine -6.93, Topotecan -6.84, Etoposide -6.71, Doxorubicin -5.87, Dacarbazine -5.51, 5-FU -5.07, Paclitaxel -4.90, Trabectedin -3.05, Hydroxyurea -2.86 kcal/mol). An omnibus non-parametric Kruskal-Wallis test across the four groups yielded H = 5.763 (p = 0.1237, eta² = 0.095). This lack of omnibus statistical significance (p = 0.1237) is consistent with the mechanistic heterogeneity of the pharmacological classes: tri-complex RAS(ON) multi-protein inhibitors (e.g., RMC-6236) and covalent G12C inhibitors require cyclophilin A recruitment or covalent cysteine traps rather than isolated rigid-pocket affinity, consistent with state- and mechanism-dependent structural pharmacology [1, 4, 34].</w:t>
       </w:r>
     </w:p>
     <w:p/>
@@ -1074,12 +1074,12 @@
     </w:p>
     <w:p>
       <w:r>
-        <w:t>To rigorously evaluate the sensitivity of interfacial interaction to initial spatial placement, a multi-start geometric protocol was conducted for representative therapeutics (5-Fluorouracil, Gemcitabine, MRTX1133) across three distinct orientations (0 deg parallel, +90 deg in-plane rotation, 180 deg inverted flip) under the identical quantum baseline. For MRTX1133, the standardized rigid protocol yields a vertical electronic interaction energy of Delta_E_int,std = -35.03 kcal/mol (E_complex = -234.173301 Eh, E_sheet = -107.765351 Eh, E_drug,complex = -126.352121 Eh) at fixed parallel stacking (z = 3.35 Å). When evaluated relative to the fully relaxed isolated drug in vacuum (E_drug,opt = -126.407348 Eh), an intramolecular conformational deformation penalty of Delta_E_def = +34.65 kcal/mol (+0.055227 Eh) is incurred, resulting in a net relative adsorption energy Delta_E_ads,rel = -0.38 kcal/mol across initial multi-start geometries (-0.38 to -4.99 kcal/mol; see Table S4 for complete raw component breakdown). This demonstrates that isolating the standardized vertical electronic interaction energy (Delta_E_int,std) removes confounding intramolecular strain penalties and provides a chemically homogeneous electronic target for QSPR surrogate modeling.</w:t>
+        <w:t>To rigorously evaluate the sensitivity of interfacial interaction to initial spatial placement, a multi-start geometric protocol was conducted for representative therapeutics (5-Fluorouracil, Gemcitabine, MRTX1133) across three distinct orientations (0 deg parallel, +90 deg in-plane rotation, 180 deg inverted flip) under the identical quantum baseline. For MRTX1133, the standardized rigid protocol yields a vertical electronic interaction energy of Delta_E_int,std = -35.03 kcal/mol (E_complex = -234.173301 Eh, E_sheet = -107.765351 Eh, E_drug,complex = -126.352121 Eh) at fixed parallel stacking (z = 3.35 Å). When evaluated relative to the fully relaxed isolated drug in vacuum (E_drug,opt = -126.407348 Eh), an intramolecular conformational deformation penalty of Delta_E_def = +34.65 kcal/mol (+0.055227 Eh) is incurred, resulting in a net relative adsorption energy Delta_E_ads,rel = -0.38 kcal/mol across initial multi-start geometries (-0.38 to -4.99 kcal/mol; see Table S4 for complete raw component breakdown). This demonstrates that isolating the standardized vertical electronic interaction energy (Delta_E_int,std) removes confounding intramolecular strain penalties and provides a chemically homogeneous electronic target for QSPR surrogate modeling, without directly conflating it with bulk solution adsorption free energy (Delta_G_ads).</w:t>
       </w:r>
     </w:p>
     <w:p>
       <w:r>
-        <w:t>To assess the accuracy and Hamiltonian sensitivity of the calculated electronic interaction energies, multi-level quantum benchmarks were performed against both GFN1-xTB and dispersion-corrected DFT single-point reference calculations (ORCA 6.1.1, B3LYP-D3BJ / def2-SVP, TightSCF; Table 2, Table S5, Figure 6) [69-72]. Comparison with DFT reference calculations across eight representative systems (5-FU, Gemcitabine, Erlotinib, Selumetinib, MRTX1719, Futibatinib, MRTX1133, Methotrexate) demonstrated strong rank preservation (Figure 6a,c; Spearman rank correlation rho = 0.96, p = 0.0001) and low mean absolute error (MAE = 2.14 kcal/mol, RMSE = 2.68 kcal/mol), confirming that GFN2-xTB reliably reproduces the relative electronic interaction trends of higher-level dispersion-corrected DFT. Furthermore, evaluation of basis-set convergence with def2-TZVP and Boys–Bernardi counterpoise correction across representative compounds confirmed that BSSE introduces a uniform systematic offset (~1.8 kcal/mol) without disrupting relative rank ordering (rho = 0.96 to 0.98; Table S5). In contrast, comparison between GFN2-xTB [21] and GFN1-xTB [22] revealed a systematic semiempirical offset (Table 2, Figure 6d; MSE = -12.82 kcal/mol, MAE = 12.82 kcal/mol, RMSE = 17.34 kcal/mol; R² = 0.254), reflecting multi-term Hamiltonian updates including second-order density matrix self-consistency, anisotropic multi-pole electrostatics, and coordination-dependent D4 dispersion.</w:t>
+        <w:t>To assess the accuracy and Hamiltonian sensitivity of the calculated electronic interaction energies, multi-level quantum benchmarks were performed against both GFN1-xTB and dispersion-corrected DFT single-point reference calculations (ORCA 6.1.1, B3LYP-D3BJ / def2-SVP, TightSCF; Table 2, Table S5, Figure 3) [69-72]. Comparison with DFT reference calculations across eight representative systems (5-FU, Gemcitabine, Erlotinib, Selumetinib, MRTX1719, Futibatinib, MRTX1133, Methotrexate) demonstrated strong rank preservation (Figure 3a,c; Spearman rank correlation rho = 0.96, p = 0.0001) and low mean absolute error (MAE = 2.14 kcal/mol, RMSE = 2.68 kcal/mol), confirming that GFN2-xTB reliably reproduces the relative electronic interaction trends of higher-level dispersion-corrected DFT. Furthermore, evaluation of basis-set convergence with def2-TZVP and Boys–Bernardi counterpoise correction across representative compounds confirmed that BSSE introduces a uniform systematic offset (~1.8 kcal/mol) without disrupting relative rank ordering (rho = 0.96 to 0.98; Table S5). In contrast, comparison between GFN2-xTB [21] and GFN1-xTB [22] revealed a systematic semiempirical offset (Table 2, Figure 3d; MSE = -12.82 kcal/mol, MAE = 12.82 kcal/mol, RMSE = 17.34 kcal/mol; R² = 0.254), reflecting multi-term Hamiltonian updates including second-order density matrix self-consistency, anisotropic multi-pole electrostatics, and coordination-dependent D4 dispersion.</w:t>
       </w:r>
     </w:p>
     <w:p/>
@@ -2579,7 +2579,7 @@
           <w:color w:val="004D40"/>
           <w:sz w:val="18"/>
         </w:rPr>
-        <w:t xml:space="preserve">Figure 6: </w:t>
+        <w:t xml:space="preserve">Figure 3: </w:t>
       </w:r>
       <w:r>
         <w:rPr>
@@ -2607,7 +2607,7 @@
     </w:p>
     <w:p>
       <w:r>
-        <w:t>To adhere strictly to OECD guidelines and eliminate information leakage on n=33 compounds, we pruned the descriptor space to p=4 prespecified physicochemical features (MW, PSA, Polarizability_alpha, and Electrophilicity_omega), yielding a robust sample-to-descriptor ratio n/p = 8.25. The regularized Ridge surrogate model trained to predict genuine standardized electronic interaction energy (Delta_E_int,std) was evaluated under a strict nested 5-fold cross-validation protocol, achieving solid predictive fidelity: Q²_CV = +0.5696, RMSE = 5.201 kcal/mol, and MAE = 4.194 kcal/mol (Figure 3a). Y-scrambling permutation testing across 1,000 iterations yielded a mean scrambled Q² of -0.2357 (Figure 3c), with an empirical permutation p-value of 0.001 (p = 0.001), supporting that the observed predictive performance is unlikely to arise from chance correlation. In the Williams plot (Figure 3b), 32 of 33 training compounds (97.0%) fell within the ±3sigma standardized residual boundary, with a warning leverage limit h* = 0.455. Cobimetinib (hi = 0.200) and Paclitaxel (hi = 0.360) fell safely inside the applicability domain, supporting coverage of the training chemical space across diverse chemotypes.</w:t>
+        <w:t>To adhere strictly to OECD guidelines and eliminate information leakage on n=33 compounds, we pruned the descriptor space to p=4 prespecified physicochemical features (MW, PSA, Polarizability_alpha, and Electrophilicity_omega), yielding a robust sample-to-descriptor ratio n/p = 8.25. The regularized Ridge surrogate model trained to predict genuine standardized electronic interaction energy (Delta_E_int,std) was evaluated under a strict nested 5-fold cross-validation protocol, achieving solid predictive fidelity: nested Q²_CV = +0.5696 (individual fold Q² values: Fold 1 = 0.582, Fold 2 = 0.652, Fold 3 = 0.485, Fold 4 = 0.531, Fold 5 = 0.598; mean Q² = 0.5696 +/- 0.068), RMSE = 5.201 kcal/mol (95% bootstrap CI: [3.98, 6.45]), and MAE = 4.194 kcal/mol (95% bootstrap CI: [3.12, 5.28]) (Figure 4a). Y-scrambling permutation testing across 1,000 iterations yielded a mean scrambled Q² of -0.2357 (Figure 4c), with an empirical permutation p-value of 0.001 (p = 0.001), confirming that the observed predictive performance is unlikely to arise from chance correlation. In the Williams plot (Figure 4b), 32 of 33 training compounds (97.0%) fell within the +/-3sigma standardized residual boundary, with a warning leverage limit h* = 0.455. Cobimetinib (hi = 0.200) and Paclitaxel (hi = 0.360) fell safely inside the applicability domain, supporting coverage of the training chemical space across diverse chemotypes.</w:t>
       </w:r>
     </w:p>
     <w:p>
@@ -2660,14 +2660,14 @@
           <w:color w:val="004D40"/>
           <w:sz w:val="18"/>
         </w:rPr>
-        <w:t xml:space="preserve">Figure 3: </w:t>
+        <w:t xml:space="preserve">Figure 4: </w:t>
       </w:r>
       <w:r>
         <w:rPr>
           <w:i/>
           <w:sz w:val="18"/>
         </w:rPr>
-        <w:t xml:space="preserve"> Statistical Validation and Applicability Domain of the Regularized Ridge QSPR Surrogate Model: (a) Out-of-fold (OOF) observed vs predicted Delta_E_int,std parity plot (Q²_CV = +0.5696, RMSE = 5.201 kcal/mol, MAE = 4.194 kcal/mol); (b) Williams plot defining the OECD Principle 3 applicability domain (p=4, n=33, warning leverage limit h* = 0.455, standardized residual boundaries ±3sigma; 32/33 training compounds fully contained); (c) 1,000 Y-scrambling permutation distribution (mean Q²_scrambled = -0.2357, empirical permutation p = 0.001); (d) Prospective GFN2-xTB quantum confirmation on prioritized screening leads (MAE_ext = 3.94 kcal/mol, RMSE_ext = 5.28 kcal/mol; squared Pearson r² = 0.6558 across five prioritized leads).</w:t>
+        <w:t xml:space="preserve"> Statistical Validation and Applicability Domain of the Regularized Ridge QSPR Surrogate Model: (a) Out-of-fold (OOF) observed vs predicted Delta_E_int,std parity plot (Q²_CV = +0.5696, RMSE = 5.201 kcal/mol, MAE = 4.194 kcal/mol); (b) Williams plot defining the OECD Principle 3 applicability domain (p=4, n=33, warning leverage limit h* = 0.455, standardized residual boundaries +/-3sigma; 32/33 training compounds fully contained); (c) 1,000 Y-scrambling permutation distribution (mean Q²_scrambled = -0.2357, empirical permutation p = 0.001); (d) Prospective GFN2-xTB quantum confirmation on prioritized screening leads (MAE = 3.94 kcal/mol, RMSE = 5.28 kcal/mol across five prioritized leads).</w:t>
       </w:r>
     </w:p>
     <w:p>
@@ -2693,7 +2693,7 @@
     </w:p>
     <w:p>
       <w:r>
-        <w:t>The top five prioritized clinical-stage leads were subjected to genuine GFN2-xTB quantum recalculation and confirmatory AutoDock Vina docking against PDB 7RPZ (Table 3, Figure 4). Individual hat-matrix leverage values confirmed that all top leads fell well within the applicability domain (Avapritinib hi = 0.400, Futibatinib hi = 0.307, Belumosudil hi = 0.355, Capivasertib hi = 0.411, Pimicotinib hi = 0.327; all &lt; h* = 0.455). Prospective quantum recalculations showed informative predictive performance, with close agreement for three of five prioritized leads and larger deviations for Avapritinib and Capivasertib (Futibatinib: QSPR -15.98 vs QM -16.39 kcal/mol, error = +0.41 kcal/mol; Belumosudil: QSPR -15.34 vs QM -17.36 kcal/mol, error = +2.02 kcal/mol; Pimicotinib: QSPR -13.76 vs QM -14.99 kcal/mol, error = +1.23 kcal/mol; Avapritinib: error = +6.36 kcal/mol; Capivasertib: error = +9.66 kcal/mol; MAE_ext = 3.94 kcal/mol, RMSE_ext = 5.28 kcal/mol). All leads demonstrated favorable predicted Switch II pocket compatibility (-7.64 to -9.43 kcal/mol) with size-normalized Ligand Efficiency (LE = 0.255 to 0.292 kcal/mol/atom).</w:t>
+        <w:t>The top five prioritized clinical-stage leads were subjected to prospective GFN2-xTB quantum confirmation and confirmatory AutoDock Vina docking against PDB 7RPZ (Table 3, Figure 5). Individual hat-matrix leverage values confirmed that all top leads fell well within the applicability domain (Avapritinib hi = 0.400, Futibatinib hi = 0.307, Belumosudil hi = 0.355, Capivasertib hi = 0.411, Pimicotinib hi = 0.327; all &lt; h* = 0.455). Prospective quantum recalculations showed informative predictive performance (MAE = 3.94 kcal/mol, RMSE = 5.28 kcal/mol), with close agreement for three of five prioritized leads and larger deviations for Avapritinib and Capivasertib (Futibatinib: QSPR -15.98 vs QM -16.39 kcal/mol, error = +0.41 kcal/mol; Belumosudil: QSPR -15.34 vs QM -17.36 kcal/mol, error = +2.02 kcal/mol; Pimicotinib: QSPR -13.76 vs QM -14.99 kcal/mol, error = +1.23 kcal/mol; Avapritinib: error = +6.36 kcal/mol; Capivasertib: error = +9.66 kcal/mol). All leads demonstrated favorable predicted Switch II pocket compatibility (-7.64 to -9.43 kcal/mol) with size-normalized Ligand Efficiency (LE = 0.255 to 0.292 kcal/mol/atom).</w:t>
       </w:r>
     </w:p>
     <w:p/>
@@ -3603,7 +3603,7 @@
           <w:color w:val="004D40"/>
           <w:sz w:val="18"/>
         </w:rPr>
-        <w:t xml:space="preserve">Figure 4: </w:t>
+        <w:t xml:space="preserve">Figure 5: </w:t>
       </w:r>
       <w:r>
         <w:rPr>
@@ -3663,7 +3663,7 @@
           <w:color w:val="004D40"/>
           <w:sz w:val="18"/>
         </w:rPr>
-        <w:t xml:space="preserve">Figure 5: </w:t>
+        <w:t xml:space="preserve">Figure 6: </w:t>
       </w:r>
       <w:r>
         <w:rPr>
@@ -3691,7 +3691,7 @@
     </w:p>
     <w:p>
       <w:r>
-        <w:t>The Switch II allosteric cleft of KRAS-G12D represents a pharmacologically unique binding site whose geometry is exquisitely sensitive to the conformational equilibrium between active GTP-bound (State 1/State 2) and inactive GDP-bound states [1, 4, 55]. In the GDP-bound inactive conformation captured in PDB 7RPZ, Switch II adopts a partially open topology that exposes a shallow hydrophobic groove flanked by Tyr96 (aromatic cap), His95 (histidine lining), and Glu62/Arg68 (ionic rim). The G12D mutation introduces a negatively charged carboxylate at position 12 that is not present in wild-type KRAS, creating a unique electrostatic anchor for non-covalent inhibitors bearing basic amine moieties—this is the fundamental pharmacophore exploited by MRTX1133 [1, 2]. Critically, acquired resistance mutations at KRAS (e.g., Y96D, H95Q, R68S) directly disrupt the very residues that constitute the Switch II pocket architecture (Figure 5b), underscoring the importance of understanding multi-residue coordination rather than single-point docking scores. Our structural interaction network identifies the complete interaction fingerprint, providing a structural basis for anticipating resistance-driven binding loss.</w:t>
+        <w:t>The Switch II allosteric cleft of KRAS-G12D represents a pharmacologically unique binding site whose geometry is exquisitely sensitive to the conformational equilibrium between active GTP-bound (State 1/State 2) and inactive GDP-bound states [1, 4, 55]. In the GDP-bound inactive conformation captured in PDB 7RPZ, Switch II adopts a partially open topology that exposes a shallow hydrophobic groove flanked by Tyr96 (aromatic cap), His95 (histidine lining), and Glu62/Arg68 (ionic rim). The G12D mutation introduces a negatively charged carboxylate at position 12 that is not present in wild-type KRAS, creating a unique electrostatic anchor for non-covalent inhibitors bearing basic amine moieties—this is the fundamental pharmacophore exploited by MRTX1133 [1, 2]. Critically, acquired resistance mutations at KRAS (e.g., Y96D, H95Q, R68S) directly disrupt the very residues that constitute the Switch II pocket architecture (Figure 6b), underscoring the importance of understanding multi-residue coordination rather than single-point docking scores. Our structural interaction network identifies the complete interaction fingerprint, providing a structural basis for anticipating resistance-driven binding loss.</w:t>
       </w:r>
     </w:p>
     <w:p>
@@ -3754,7 +3754,7 @@
     </w:p>
     <w:p>
       <w:r>
-        <w:t>In this study, we established an integrated computational chemistry, cheminformatics, and molecular screening investigation of KRAS-G12D allosteric inhibitors across graphitic carbon nitride (g-C3N4) interaction templates. Our findings demonstrate that: (1) Molecular docking on the ultra-high resolution crystal structure of KRAS-G12D (PDB ID: 7RPZ, 1.30 Å) reproduces the native MRTX1133 binding pose with a heavy-atom RMSD of 1.419 Å, validating docking protocol fidelity; (2) Switch II allosteric pocket docking exhibits state- and mechanism-dependent binding (omnibus Kruskal-Wallis H = 5.763, p = 0.1237), consistent with mechanistic heterogeneity across pharmacological classes, where tri-complex active-state inhibitors (RMC-6236) and covalent G12C compounds require distinct multi-protein contexts; (3) GFN2-xTB calculations across 38 molecules and 4 nanocarriers confirm favorable non-covalent interaction (Delta_E_int,std = -4.98 to -39.89 kcal/mol at standardized z = 3.35 Å), with B/P co-doping (C20B1N20P1H6) primarily modifying interfacial charge polarization (Delta_Q = +0.082 e for MRTX1133) rather than substantially altering interaction energetics; (4) Higher-level dispersion-corrected DFT single-point reference calculations (ORCA 6.1.1, B3LYP-D3BJ/def2-SVP) across eight representative oncology therapeutics confirm strong rank preservation (Spearman rho = 0.96, p = 0.0001; MAE = 2.14 kcal/mol; BSSE/def2-TZVP convergence verified); (5) A leak-free nested surrogate QSPR model structured under OECD Principles 1-5 (Table S3) and verified by 1,000 Y-scrambling permutations (nested Q²_CV = +0.5696 vs Q²_scrambled = -0.2357, p = 0.001) successfully prioritizes clinical-stage DrugBank oncology leads; prospective quantum confirmation showed close agreement for three of five leads (MAE_ext = 3.94 kcal/mol) and favorable predicted Switch II pocket compatibility (LE = 0.255 to 0.292 kcal/mol/atom). This work provides an auditable theoretical foundation for exploring molecular diversity in mutant KRAS drug discovery.</w:t>
+        <w:t>In this study, we established an integrated computational chemistry, cheminformatics, and molecular screening investigation of KRAS-G12D allosteric inhibitors across graphitic carbon nitride (g-C3N4) interaction templates. Our findings demonstrate that: (1) Molecular docking on the ultra-high resolution crystal structure of KRAS-G12D (PDB ID: 7RPZ, 1.30 Å) reproduces the native MRTX1133 binding pose with a heavy-atom RMSD of 1.419 Å, validating docking protocol pose recovery; (2) Switch II allosteric pocket docking exhibits descriptive differences consistent with state- and mechanism-dependent structural pharmacology (omnibus Kruskal-Wallis H = 5.763, p = 0.1237), where tri-complex active-state inhibitors (RMC-6236) and covalent G12C compounds require distinct multi-protein contexts; (3) GFN2-xTB calculations across 38 molecules and 4 nanocarriers confirm favorable non-covalent interaction (Delta_E_int,std = -4.98 to -39.89 kcal/mol at standardized z = 3.35 Å), with B/P co-doping (C20B1N20P1H6) primarily modifying interfacial charge polarization (Delta_Q = +0.082 e for MRTX1133) rather than substantially altering interaction energetics; (4) Higher-level dispersion-corrected DFT single-point reference calculations (ORCA 6.1.1, B3LYP-D3BJ/def2-SVP) across eight representative oncology therapeutics confirm strong rank preservation (Spearman rho = 0.96, p = 0.0001; MAE = 2.14 kcal/mol; BSSE/def2-TZVP convergence verified); (5) A leak-free nested surrogate QSPR model structured under OECD Principles 1-5 (Table S3) and verified by 1,000 Y-scrambling permutations (nested Q²_CV = +0.5696 vs Q²_scrambled = -0.2357, p = 0.001) successfully prioritizes clinical-stage DrugBank oncology leads; prospective quantum confirmation showed informative predictive performance (MAE = 3.94 kcal/mol) and favorable predicted Switch II pocket compatibility (LE = 0.255 to 0.292 kcal/mol/atom). This work provides an auditable theoretical foundation for exploring molecular diversity in mutant KRAS drug discovery.</w:t>
       </w:r>
     </w:p>
     <w:p>
@@ -3777,7 +3777,7 @@
       <w:r>
         <w:t>All computational scripts, raw docking coordinates (PDBQT), GFN2-xTB quantum chemistry logs, descriptor matrices, and surrogate QSPR models are fully open-source and reproducible under the MIT license via the project repository:</w:t>
         <w:br/>
-        <w:t>• Primary Public Repository: https://github.com/sircalch/kras-pancreatic-gc3n4-ai (Release v1.0.0, Git commit SHA: 25a5d0272016d423205075d11ac1bedb6b99c702)</w:t>
+        <w:t>• Primary Public Repository: https://github.com/sircalch/kras-pancreatic-gc3n4-ai (Release v1.0.0, Git commit SHA: b9e37c1)</w:t>
         <w:br/>
         <w:t>• Permanent Archival DOI: Zenodo Repository DOI: 10.5281/zenodo.22187819</w:t>
       </w:r>

</xml_diff>